<commit_message>
Keep Microsoft as the base and show value on AWS and Google Cloud
- Headlines keep Microsoft first; leads, criteria, Nosotros, contact and
  bands add AWS, Google Cloud and other platforms
- Each product sheet gets 'También en otras plataformas'; each area tech
  line gets 'También en'; renewal routes get a 'También en' column
- New FAQ '¿Trabajan solo con Microsoft?', updated metadata and schema
- Multicloud keyword group; SEO manual v2 and keyword list v4

Co-Authored-By: Claude Opus 5.5 <noreply@anthropic.com>
Claude-Session: https://claude.ai/code/session_01H6AF8PmtHtRfTJNyr7b15s
</commit_message>
<xml_diff>
--- a/consein-cisco/Manual_SEO_Consein_Cisco.docx
+++ b/consein-cisco/Manual_SEO_Consein_Cisco.docx
@@ -56,7 +56,7 @@
         <w:rPr>
           <w:color w:val="5D6278"/>
         </w:rPr>
-        <w:t xml:space="preserve">Documento editable para el equipo de marketing y contenidos · Versión 1 · Octubre 2026</w:t>
+        <w:t xml:space="preserve">Documento editable para el equipo de marketing y contenidos · Versión 2 · Octubre 2026</w:t>
       </w:r>
     </w:p>
     <w:p>
@@ -64,7 +64,7 @@
         <w:spacing w:after="120"/>
       </w:pPr>
       <w:r>
-        <w:t xml:space="preserve">Este manual reúne la estrategia de posicionamiento del sitio Soluciones Cisco, los ajustes que ya aplicamos, las 65 palabras clave objetivo y el plan de trabajo para llegar a las cinco primeras posiciones de Google en nuestro ámbito.</w:t>
+        <w:t xml:space="preserve">Este manual reúne la estrategia de posicionamiento del sitio Soluciones Cisco, los ajustes que ya aplicamos, las 70 palabras clave objetivo y el plan de trabajo para llegar a las cinco primeras posiciones de Google en nuestro ámbito.</w:t>
       </w:r>
     </w:p>
     <w:p>
@@ -849,7 +849,7 @@
         <w:spacing w:after="120"/>
       </w:pPr>
       <w:r>
-        <w:t xml:space="preserve">Auditamos las tres páginas con la lista de palabras clave. Antes de los ajustes, la mayoría de las frases objetivo no aparecía de forma literal: de 52 frases revisadas, solo 5 estaban en el texto. Hoy las 64 frases publicables aparecen en la página que les corresponde (la frase “partner Cisco Venezuela” queda pendiente hasta confirmar el nivel de partnership).</w:t>
+        <w:t xml:space="preserve">Auditamos las tres páginas con la lista de palabras clave. Antes de los ajustes, la mayoría de las frases objetivo no aparecía de forma literal: de 52 frases revisadas, solo 5 estaban en el texto. Hoy las 69 frases publicables aparecen en la página que les corresponde (la frase “partner Cisco Venezuela” queda pendiente hasta confirmar el nivel de partnership).</w:t>
       </w:r>
     </w:p>
     <w:tbl>
@@ -1276,7 +1276,7 @@
                 <w:sz w:val="19"/>
                 <w:szCs w:val="19"/>
               </w:rPr>
-              <w:t xml:space="preserve">Dos preguntas nuevas: equipos Cisco en fin de soporte y países donde atendemos. Están marcadas como FAQPage para resultados enriquecidos.</w:t>
+              <w:t xml:space="preserve">Tres preguntas nuevas: trabajo con otras nubes, equipos Cisco en fin de soporte y países donde atendemos. Están marcadas como FAQPage para resultados enriquecidos.</w:t>
             </w:r>
           </w:p>
         </w:tc>
@@ -1566,7 +1566,65 @@
                 <w:sz w:val="19"/>
                 <w:szCs w:val="19"/>
               </w:rPr>
-              <w:t xml:space="preserve">Organization con descripción y temas de especialidad (knowsAbout), WebPage, BreadcrumbList, ItemList de Service (11 + 8) con categoría y FAQPage (8 preguntas).</w:t>
+              <w:t xml:space="preserve">Organization con descripción y temas de especialidad (knowsAbout), WebPage, BreadcrumbList, ItemList de Service (11 + 8) con categoría y FAQPage (9 preguntas).</w:t>
+            </w:r>
+          </w:p>
+        </w:tc>
+      </w:tr>
+      <w:tr>
+        <w:tc>
+          <w:tcPr>
+            <w:tcW w:type="dxa" w:w="2400"/>
+            <w:tcBorders>
+              <w:top w:val="single" w:color="D9DCE6" w:sz="4"/>
+              <w:left w:val="single" w:color="D9DCE6" w:sz="4"/>
+              <w:bottom w:val="single" w:color="D9DCE6" w:sz="4"/>
+              <w:right w:val="single" w:color="D9DCE6" w:sz="4"/>
+            </w:tcBorders>
+            <w:tcMar>
+              <w:top w:type="dxa" w:w="70"/>
+              <w:left w:type="dxa" w:w="110"/>
+              <w:bottom w:type="dxa" w:w="70"/>
+              <w:right w:type="dxa" w:w="110"/>
+            </w:tcMar>
+          </w:tcPr>
+          <w:p>
+            <w:r>
+              <w:rPr>
+                <w:b/>
+                <w:bCs/>
+                <w:sz w:val="19"/>
+                <w:szCs w:val="19"/>
+              </w:rPr>
+              <w:t xml:space="preserve">Mensaje multinube</w:t>
+            </w:r>
+          </w:p>
+        </w:tc>
+        <w:tc>
+          <w:tcPr>
+            <w:tcW w:type="dxa" w:w="6960"/>
+            <w:tcBorders>
+              <w:top w:val="single" w:color="D9DCE6" w:sz="4"/>
+              <w:left w:val="single" w:color="D9DCE6" w:sz="4"/>
+              <w:bottom w:val="single" w:color="D9DCE6" w:sz="4"/>
+              <w:right w:val="single" w:color="D9DCE6" w:sz="4"/>
+            </w:tcBorders>
+            <w:tcMar>
+              <w:top w:type="dxa" w:w="70"/>
+              <w:left w:type="dxa" w:w="110"/>
+              <w:bottom w:type="dxa" w:w="70"/>
+              <w:right w:type="dxa" w:w="110"/>
+            </w:tcMar>
+          </w:tcPr>
+          <w:p>
+            <w:r>
+              <w:rPr>
+                <w:b w:val="false"/>
+                <w:bCs w:val="false"/>
+                <w:sz w:val="19"/>
+                <w:szCs w:val="19"/>
+              </w:rPr>
+              <w:t xml:space="preserve">Microsoft sigue como BASE en todos los titulares. Cada ficha suma la fila “También en otras plataformas” (AWS, Google Cloud, Google Workspace, Webex, otras MDM y SIEM), cada área muestra “También en:” y hay una pregunta frecuente nueva: “¿Trabajan solo con Microsoft?”.</w:t>
             </w:r>
           </w:p>
         </w:tc>
@@ -2344,7 +2402,7 @@
                 <w:sz w:val="19"/>
                 <w:szCs w:val="19"/>
               </w:rPr>
-              <w:t xml:space="preserve">Soluciones Cisco y Microsoft para empresas: SD-WAN, SASE, SECaaS, Cisco ISE y Teams Rooms. Venezuela, Panamá, República Dominicana y EE. UU.</w:t>
+              <w:t xml:space="preserve">Soluciones Cisco y Microsoft para empresas, también en AWS y Google Cloud: SD-WAN, SASE, SECaaS y Teams Rooms. Venezuela, Panamá, R. Dominicana y EE. UU.</w:t>
             </w:r>
           </w:p>
         </w:tc>
@@ -2372,7 +2430,7 @@
                 <w:sz w:val="19"/>
                 <w:szCs w:val="19"/>
               </w:rPr>
-              <w:t xml:space="preserve">140</w:t>
+              <w:t xml:space="preserve">153</w:t>
             </w:r>
           </w:p>
         </w:tc>
@@ -2430,7 +2488,7 @@
                 <w:sz w:val="19"/>
                 <w:szCs w:val="19"/>
               </w:rPr>
-              <w:t xml:space="preserve">SD-WAN para empresas, arquitectura SASE, seguridad como servicio (SECaaS), Cisco ISE, Secure Firewall y Teams Rooms, integrados con Microsoft.</w:t>
+              <w:t xml:space="preserve">SD-WAN, SASE, seguridad como servicio (SECaaS), Cisco ISE y Teams Rooms, integrados con Microsoft y extendidos a AWS y Google Cloud.</w:t>
             </w:r>
           </w:p>
         </w:tc>
@@ -2458,7 +2516,7 @@
                 <w:sz w:val="19"/>
                 <w:szCs w:val="19"/>
               </w:rPr>
-              <w:t xml:space="preserve">142</w:t>
+              <w:t xml:space="preserve">132</w:t>
             </w:r>
           </w:p>
         </w:tc>
@@ -3120,7 +3178,7 @@
         <w:spacing w:after="120"/>
       </w:pPr>
       <w:r>
-        <w:t xml:space="preserve">65 palabras clave en 7 grupos; 36 son de prioridad A. La lista maestra está en _fuente/palabras_clave.json: edite ese archivo y vuelva a generar este manual para mantener todo alineado.</w:t>
+        <w:t xml:space="preserve">70 palabras clave en 8 grupos; 36 son de prioridad A. La lista maestra está en _fuente/palabras_clave.json: edite ese archivo y vuelva a generar este manual para mantener todo alineado.</w:t>
       </w:r>
     </w:p>
     <w:p>
@@ -4937,6 +4995,929 @@
         <w:pStyle w:val="Heading2"/>
       </w:pPr>
       <w:r>
+        <w:t xml:space="preserve">Multinube: AWS y Google Cloud</w:t>
+      </w:r>
+    </w:p>
+    <w:p>
+      <w:pPr>
+        <w:spacing w:after="120"/>
+      </w:pPr>
+      <w:r>
+        <w:rPr>
+          <w:b/>
+          <w:bCs/>
+        </w:rPr>
+        <w:t xml:space="preserve">Página: </w:t>
+      </w:r>
+      <w:r>
+        <w:t xml:space="preserve">soluciones.html#criterio</w:t>
+      </w:r>
+      <w:r>
+        <w:rPr>
+          <w:b/>
+          <w:bCs/>
+        </w:rPr>
+        <w:t xml:space="preserve">   ·   Objetivo: </w:t>
+      </w:r>
+      <w:r>
+        <w:t xml:space="preserve">Captar a las empresas que, además de Microsoft, operan en AWS o Google Cloud.</w:t>
+      </w:r>
+    </w:p>
+    <w:tbl>
+      <w:tblPr>
+        <w:tblW w:type="dxa" w:w="9360"/>
+        <w:tblBorders>
+          <w:top w:val="single" w:color="auto" w:sz="4"/>
+          <w:left w:val="single" w:color="auto" w:sz="4"/>
+          <w:bottom w:val="single" w:color="auto" w:sz="4"/>
+          <w:right w:val="single" w:color="auto" w:sz="4"/>
+          <w:insideH w:val="single" w:color="auto" w:sz="4"/>
+          <w:insideV w:val="single" w:color="auto" w:sz="4"/>
+        </w:tblBorders>
+      </w:tblPr>
+      <w:tblGrid>
+        <w:gridCol w:w="2900"/>
+        <w:gridCol w:w="1250"/>
+        <w:gridCol w:w="1300"/>
+        <w:gridCol w:w="900"/>
+        <w:gridCol w:w="3010"/>
+      </w:tblGrid>
+      <w:tr>
+        <w:trPr>
+          <w:tblHeader/>
+        </w:trPr>
+        <w:tc>
+          <w:tcPr>
+            <w:tcW w:type="dxa" w:w="2900"/>
+            <w:tcBorders>
+              <w:top w:val="single" w:color="D9DCE6" w:sz="4"/>
+              <w:left w:val="single" w:color="D9DCE6" w:sz="4"/>
+              <w:bottom w:val="single" w:color="D9DCE6" w:sz="4"/>
+              <w:right w:val="single" w:color="D9DCE6" w:sz="4"/>
+            </w:tcBorders>
+            <w:shd w:fill="000F76" w:color="auto" w:val="clear"/>
+            <w:tcMar>
+              <w:top w:type="dxa" w:w="70"/>
+              <w:left w:type="dxa" w:w="110"/>
+              <w:bottom w:type="dxa" w:w="70"/>
+              <w:right w:type="dxa" w:w="110"/>
+            </w:tcMar>
+          </w:tcPr>
+          <w:p>
+            <w:r>
+              <w:rPr>
+                <w:b/>
+                <w:bCs/>
+                <w:color w:val="FFFFFF"/>
+                <w:sz w:val="19"/>
+                <w:szCs w:val="19"/>
+              </w:rPr>
+              <w:t xml:space="preserve">Palabra clave</w:t>
+            </w:r>
+          </w:p>
+        </w:tc>
+        <w:tc>
+          <w:tcPr>
+            <w:tcW w:type="dxa" w:w="1250"/>
+            <w:tcBorders>
+              <w:top w:val="single" w:color="D9DCE6" w:sz="4"/>
+              <w:left w:val="single" w:color="D9DCE6" w:sz="4"/>
+              <w:bottom w:val="single" w:color="D9DCE6" w:sz="4"/>
+              <w:right w:val="single" w:color="D9DCE6" w:sz="4"/>
+            </w:tcBorders>
+            <w:shd w:fill="000F76" w:color="auto" w:val="clear"/>
+            <w:tcMar>
+              <w:top w:type="dxa" w:w="70"/>
+              <w:left w:type="dxa" w:w="110"/>
+              <w:bottom w:type="dxa" w:w="70"/>
+              <w:right w:type="dxa" w:w="110"/>
+            </w:tcMar>
+          </w:tcPr>
+          <w:p>
+            <w:r>
+              <w:rPr>
+                <w:b/>
+                <w:bCs/>
+                <w:color w:val="FFFFFF"/>
+                <w:sz w:val="19"/>
+                <w:szCs w:val="19"/>
+              </w:rPr>
+              <w:t xml:space="preserve">Tipo</w:t>
+            </w:r>
+          </w:p>
+        </w:tc>
+        <w:tc>
+          <w:tcPr>
+            <w:tcW w:type="dxa" w:w="1300"/>
+            <w:tcBorders>
+              <w:top w:val="single" w:color="D9DCE6" w:sz="4"/>
+              <w:left w:val="single" w:color="D9DCE6" w:sz="4"/>
+              <w:bottom w:val="single" w:color="D9DCE6" w:sz="4"/>
+              <w:right w:val="single" w:color="D9DCE6" w:sz="4"/>
+            </w:tcBorders>
+            <w:shd w:fill="000F76" w:color="auto" w:val="clear"/>
+            <w:tcMar>
+              <w:top w:type="dxa" w:w="70"/>
+              <w:left w:type="dxa" w:w="110"/>
+              <w:bottom w:type="dxa" w:w="70"/>
+              <w:right w:type="dxa" w:w="110"/>
+            </w:tcMar>
+          </w:tcPr>
+          <w:p>
+            <w:r>
+              <w:rPr>
+                <w:b/>
+                <w:bCs/>
+                <w:color w:val="FFFFFF"/>
+                <w:sz w:val="19"/>
+                <w:szCs w:val="19"/>
+              </w:rPr>
+              <w:t xml:space="preserve">Intención</w:t>
+            </w:r>
+          </w:p>
+        </w:tc>
+        <w:tc>
+          <w:tcPr>
+            <w:tcW w:type="dxa" w:w="900"/>
+            <w:tcBorders>
+              <w:top w:val="single" w:color="D9DCE6" w:sz="4"/>
+              <w:left w:val="single" w:color="D9DCE6" w:sz="4"/>
+              <w:bottom w:val="single" w:color="D9DCE6" w:sz="4"/>
+              <w:right w:val="single" w:color="D9DCE6" w:sz="4"/>
+            </w:tcBorders>
+            <w:shd w:fill="000F76" w:color="auto" w:val="clear"/>
+            <w:tcMar>
+              <w:top w:type="dxa" w:w="70"/>
+              <w:left w:type="dxa" w:w="110"/>
+              <w:bottom w:type="dxa" w:w="70"/>
+              <w:right w:type="dxa" w:w="110"/>
+            </w:tcMar>
+          </w:tcPr>
+          <w:p>
+            <w:r>
+              <w:rPr>
+                <w:b/>
+                <w:bCs/>
+                <w:color w:val="FFFFFF"/>
+                <w:sz w:val="19"/>
+                <w:szCs w:val="19"/>
+              </w:rPr>
+              <w:t xml:space="preserve">Prioridad</w:t>
+            </w:r>
+          </w:p>
+        </w:tc>
+        <w:tc>
+          <w:tcPr>
+            <w:tcW w:type="dxa" w:w="3010"/>
+            <w:tcBorders>
+              <w:top w:val="single" w:color="D9DCE6" w:sz="4"/>
+              <w:left w:val="single" w:color="D9DCE6" w:sz="4"/>
+              <w:bottom w:val="single" w:color="D9DCE6" w:sz="4"/>
+              <w:right w:val="single" w:color="D9DCE6" w:sz="4"/>
+            </w:tcBorders>
+            <w:shd w:fill="000F76" w:color="auto" w:val="clear"/>
+            <w:tcMar>
+              <w:top w:type="dxa" w:w="70"/>
+              <w:left w:type="dxa" w:w="110"/>
+              <w:bottom w:type="dxa" w:w="70"/>
+              <w:right w:type="dxa" w:w="110"/>
+            </w:tcMar>
+          </w:tcPr>
+          <w:p>
+            <w:r>
+              <w:rPr>
+                <w:b/>
+                <w:bCs/>
+                <w:color w:val="FFFFFF"/>
+                <w:sz w:val="19"/>
+                <w:szCs w:val="19"/>
+              </w:rPr>
+              <w:t xml:space="preserve">Dónde está en el sitio</w:t>
+            </w:r>
+          </w:p>
+        </w:tc>
+      </w:tr>
+      <w:tr>
+        <w:tc>
+          <w:tcPr>
+            <w:tcW w:type="dxa" w:w="2900"/>
+            <w:tcBorders>
+              <w:top w:val="single" w:color="D9DCE6" w:sz="4"/>
+              <w:left w:val="single" w:color="D9DCE6" w:sz="4"/>
+              <w:bottom w:val="single" w:color="D9DCE6" w:sz="4"/>
+              <w:right w:val="single" w:color="D9DCE6" w:sz="4"/>
+            </w:tcBorders>
+            <w:tcMar>
+              <w:top w:type="dxa" w:w="70"/>
+              <w:left w:type="dxa" w:w="110"/>
+              <w:bottom w:type="dxa" w:w="70"/>
+              <w:right w:type="dxa" w:w="110"/>
+            </w:tcMar>
+          </w:tcPr>
+          <w:p>
+            <w:r>
+              <w:rPr>
+                <w:b/>
+                <w:bCs/>
+                <w:sz w:val="19"/>
+                <w:szCs w:val="19"/>
+              </w:rPr>
+              <w:t xml:space="preserve">SD-WAN multinube</w:t>
+            </w:r>
+          </w:p>
+        </w:tc>
+        <w:tc>
+          <w:tcPr>
+            <w:tcW w:type="dxa" w:w="1250"/>
+            <w:tcBorders>
+              <w:top w:val="single" w:color="D9DCE6" w:sz="4"/>
+              <w:left w:val="single" w:color="D9DCE6" w:sz="4"/>
+              <w:bottom w:val="single" w:color="D9DCE6" w:sz="4"/>
+              <w:right w:val="single" w:color="D9DCE6" w:sz="4"/>
+            </w:tcBorders>
+            <w:tcMar>
+              <w:top w:type="dxa" w:w="70"/>
+              <w:left w:type="dxa" w:w="110"/>
+              <w:bottom w:type="dxa" w:w="70"/>
+              <w:right w:type="dxa" w:w="110"/>
+            </w:tcMar>
+          </w:tcPr>
+          <w:p>
+            <w:r>
+              <w:rPr>
+                <w:b w:val="false"/>
+                <w:bCs w:val="false"/>
+                <w:sz w:val="19"/>
+                <w:szCs w:val="19"/>
+              </w:rPr>
+              <w:t xml:space="preserve">Secundaria</w:t>
+            </w:r>
+          </w:p>
+        </w:tc>
+        <w:tc>
+          <w:tcPr>
+            <w:tcW w:type="dxa" w:w="1300"/>
+            <w:tcBorders>
+              <w:top w:val="single" w:color="D9DCE6" w:sz="4"/>
+              <w:left w:val="single" w:color="D9DCE6" w:sz="4"/>
+              <w:bottom w:val="single" w:color="D9DCE6" w:sz="4"/>
+              <w:right w:val="single" w:color="D9DCE6" w:sz="4"/>
+            </w:tcBorders>
+            <w:tcMar>
+              <w:top w:type="dxa" w:w="70"/>
+              <w:left w:type="dxa" w:w="110"/>
+              <w:bottom w:type="dxa" w:w="70"/>
+              <w:right w:type="dxa" w:w="110"/>
+            </w:tcMar>
+          </w:tcPr>
+          <w:p>
+            <w:r>
+              <w:rPr>
+                <w:b w:val="false"/>
+                <w:bCs w:val="false"/>
+                <w:sz w:val="19"/>
+                <w:szCs w:val="19"/>
+              </w:rPr>
+              <w:t xml:space="preserve">Comercial</w:t>
+            </w:r>
+          </w:p>
+        </w:tc>
+        <w:tc>
+          <w:tcPr>
+            <w:tcW w:type="dxa" w:w="900"/>
+            <w:tcBorders>
+              <w:top w:val="single" w:color="D9DCE6" w:sz="4"/>
+              <w:left w:val="single" w:color="D9DCE6" w:sz="4"/>
+              <w:bottom w:val="single" w:color="D9DCE6" w:sz="4"/>
+              <w:right w:val="single" w:color="D9DCE6" w:sz="4"/>
+            </w:tcBorders>
+            <w:tcMar>
+              <w:top w:type="dxa" w:w="70"/>
+              <w:left w:type="dxa" w:w="110"/>
+              <w:bottom w:type="dxa" w:w="70"/>
+              <w:right w:type="dxa" w:w="110"/>
+            </w:tcMar>
+          </w:tcPr>
+          <w:p>
+            <w:r>
+              <w:rPr>
+                <w:b w:val="false"/>
+                <w:bCs w:val="false"/>
+                <w:sz w:val="19"/>
+                <w:szCs w:val="19"/>
+              </w:rPr>
+              <w:t xml:space="preserve">B</w:t>
+            </w:r>
+          </w:p>
+        </w:tc>
+        <w:tc>
+          <w:tcPr>
+            <w:tcW w:type="dxa" w:w="3010"/>
+            <w:tcBorders>
+              <w:top w:val="single" w:color="D9DCE6" w:sz="4"/>
+              <w:left w:val="single" w:color="D9DCE6" w:sz="4"/>
+              <w:bottom w:val="single" w:color="D9DCE6" w:sz="4"/>
+              <w:right w:val="single" w:color="D9DCE6" w:sz="4"/>
+            </w:tcBorders>
+            <w:tcMar>
+              <w:top w:type="dxa" w:w="70"/>
+              <w:left w:type="dxa" w:w="110"/>
+              <w:bottom w:type="dxa" w:w="70"/>
+              <w:right w:type="dxa" w:w="110"/>
+            </w:tcMar>
+          </w:tcPr>
+          <w:p>
+            <w:r>
+              <w:rPr>
+                <w:b w:val="false"/>
+                <w:bCs w:val="false"/>
+                <w:sz w:val="19"/>
+                <w:szCs w:val="19"/>
+              </w:rPr>
+              <w:t xml:space="preserve">Criterio y FAQ</w:t>
+            </w:r>
+          </w:p>
+        </w:tc>
+      </w:tr>
+      <w:tr>
+        <w:tc>
+          <w:tcPr>
+            <w:tcW w:type="dxa" w:w="2900"/>
+            <w:tcBorders>
+              <w:top w:val="single" w:color="D9DCE6" w:sz="4"/>
+              <w:left w:val="single" w:color="D9DCE6" w:sz="4"/>
+              <w:bottom w:val="single" w:color="D9DCE6" w:sz="4"/>
+              <w:right w:val="single" w:color="D9DCE6" w:sz="4"/>
+            </w:tcBorders>
+            <w:tcMar>
+              <w:top w:type="dxa" w:w="70"/>
+              <w:left w:type="dxa" w:w="110"/>
+              <w:bottom w:type="dxa" w:w="70"/>
+              <w:right w:type="dxa" w:w="110"/>
+            </w:tcMar>
+          </w:tcPr>
+          <w:p>
+            <w:r>
+              <w:rPr>
+                <w:b/>
+                <w:bCs/>
+                <w:sz w:val="19"/>
+                <w:szCs w:val="19"/>
+              </w:rPr>
+              <w:t xml:space="preserve">seguridad multinube</w:t>
+            </w:r>
+          </w:p>
+        </w:tc>
+        <w:tc>
+          <w:tcPr>
+            <w:tcW w:type="dxa" w:w="1250"/>
+            <w:tcBorders>
+              <w:top w:val="single" w:color="D9DCE6" w:sz="4"/>
+              <w:left w:val="single" w:color="D9DCE6" w:sz="4"/>
+              <w:bottom w:val="single" w:color="D9DCE6" w:sz="4"/>
+              <w:right w:val="single" w:color="D9DCE6" w:sz="4"/>
+            </w:tcBorders>
+            <w:tcMar>
+              <w:top w:type="dxa" w:w="70"/>
+              <w:left w:type="dxa" w:w="110"/>
+              <w:bottom w:type="dxa" w:w="70"/>
+              <w:right w:type="dxa" w:w="110"/>
+            </w:tcMar>
+          </w:tcPr>
+          <w:p>
+            <w:r>
+              <w:rPr>
+                <w:b w:val="false"/>
+                <w:bCs w:val="false"/>
+                <w:sz w:val="19"/>
+                <w:szCs w:val="19"/>
+              </w:rPr>
+              <w:t xml:space="preserve">Secundaria</w:t>
+            </w:r>
+          </w:p>
+        </w:tc>
+        <w:tc>
+          <w:tcPr>
+            <w:tcW w:type="dxa" w:w="1300"/>
+            <w:tcBorders>
+              <w:top w:val="single" w:color="D9DCE6" w:sz="4"/>
+              <w:left w:val="single" w:color="D9DCE6" w:sz="4"/>
+              <w:bottom w:val="single" w:color="D9DCE6" w:sz="4"/>
+              <w:right w:val="single" w:color="D9DCE6" w:sz="4"/>
+            </w:tcBorders>
+            <w:tcMar>
+              <w:top w:type="dxa" w:w="70"/>
+              <w:left w:type="dxa" w:w="110"/>
+              <w:bottom w:type="dxa" w:w="70"/>
+              <w:right w:type="dxa" w:w="110"/>
+            </w:tcMar>
+          </w:tcPr>
+          <w:p>
+            <w:r>
+              <w:rPr>
+                <w:b w:val="false"/>
+                <w:bCs w:val="false"/>
+                <w:sz w:val="19"/>
+                <w:szCs w:val="19"/>
+              </w:rPr>
+              <w:t xml:space="preserve">Comercial</w:t>
+            </w:r>
+          </w:p>
+        </w:tc>
+        <w:tc>
+          <w:tcPr>
+            <w:tcW w:type="dxa" w:w="900"/>
+            <w:tcBorders>
+              <w:top w:val="single" w:color="D9DCE6" w:sz="4"/>
+              <w:left w:val="single" w:color="D9DCE6" w:sz="4"/>
+              <w:bottom w:val="single" w:color="D9DCE6" w:sz="4"/>
+              <w:right w:val="single" w:color="D9DCE6" w:sz="4"/>
+            </w:tcBorders>
+            <w:tcMar>
+              <w:top w:type="dxa" w:w="70"/>
+              <w:left w:type="dxa" w:w="110"/>
+              <w:bottom w:type="dxa" w:w="70"/>
+              <w:right w:type="dxa" w:w="110"/>
+            </w:tcMar>
+          </w:tcPr>
+          <w:p>
+            <w:r>
+              <w:rPr>
+                <w:b w:val="false"/>
+                <w:bCs w:val="false"/>
+                <w:sz w:val="19"/>
+                <w:szCs w:val="19"/>
+              </w:rPr>
+              <w:t xml:space="preserve">B</w:t>
+            </w:r>
+          </w:p>
+        </w:tc>
+        <w:tc>
+          <w:tcPr>
+            <w:tcW w:type="dxa" w:w="3010"/>
+            <w:tcBorders>
+              <w:top w:val="single" w:color="D9DCE6" w:sz="4"/>
+              <w:left w:val="single" w:color="D9DCE6" w:sz="4"/>
+              <w:bottom w:val="single" w:color="D9DCE6" w:sz="4"/>
+              <w:right w:val="single" w:color="D9DCE6" w:sz="4"/>
+            </w:tcBorders>
+            <w:tcMar>
+              <w:top w:type="dxa" w:w="70"/>
+              <w:left w:type="dxa" w:w="110"/>
+              <w:bottom w:type="dxa" w:w="70"/>
+              <w:right w:type="dxa" w:w="110"/>
+            </w:tcMar>
+          </w:tcPr>
+          <w:p>
+            <w:r>
+              <w:rPr>
+                <w:b w:val="false"/>
+                <w:bCs w:val="false"/>
+                <w:sz w:val="19"/>
+                <w:szCs w:val="19"/>
+              </w:rPr>
+              <w:t xml:space="preserve">Criterio</w:t>
+            </w:r>
+          </w:p>
+        </w:tc>
+      </w:tr>
+      <w:tr>
+        <w:tc>
+          <w:tcPr>
+            <w:tcW w:type="dxa" w:w="2900"/>
+            <w:tcBorders>
+              <w:top w:val="single" w:color="D9DCE6" w:sz="4"/>
+              <w:left w:val="single" w:color="D9DCE6" w:sz="4"/>
+              <w:bottom w:val="single" w:color="D9DCE6" w:sz="4"/>
+              <w:right w:val="single" w:color="D9DCE6" w:sz="4"/>
+            </w:tcBorders>
+            <w:tcMar>
+              <w:top w:type="dxa" w:w="70"/>
+              <w:left w:type="dxa" w:w="110"/>
+              <w:bottom w:type="dxa" w:w="70"/>
+              <w:right w:type="dxa" w:w="110"/>
+            </w:tcMar>
+          </w:tcPr>
+          <w:p>
+            <w:r>
+              <w:rPr>
+                <w:b/>
+                <w:bCs/>
+                <w:sz w:val="19"/>
+                <w:szCs w:val="19"/>
+              </w:rPr>
+              <w:t xml:space="preserve">conectividad a AWS y Google Cloud</w:t>
+            </w:r>
+          </w:p>
+        </w:tc>
+        <w:tc>
+          <w:tcPr>
+            <w:tcW w:type="dxa" w:w="1250"/>
+            <w:tcBorders>
+              <w:top w:val="single" w:color="D9DCE6" w:sz="4"/>
+              <w:left w:val="single" w:color="D9DCE6" w:sz="4"/>
+              <w:bottom w:val="single" w:color="D9DCE6" w:sz="4"/>
+              <w:right w:val="single" w:color="D9DCE6" w:sz="4"/>
+            </w:tcBorders>
+            <w:tcMar>
+              <w:top w:type="dxa" w:w="70"/>
+              <w:left w:type="dxa" w:w="110"/>
+              <w:bottom w:type="dxa" w:w="70"/>
+              <w:right w:type="dxa" w:w="110"/>
+            </w:tcMar>
+          </w:tcPr>
+          <w:p>
+            <w:r>
+              <w:rPr>
+                <w:b w:val="false"/>
+                <w:bCs w:val="false"/>
+                <w:sz w:val="19"/>
+                <w:szCs w:val="19"/>
+              </w:rPr>
+              <w:t xml:space="preserve">Long tail</w:t>
+            </w:r>
+          </w:p>
+        </w:tc>
+        <w:tc>
+          <w:tcPr>
+            <w:tcW w:type="dxa" w:w="1300"/>
+            <w:tcBorders>
+              <w:top w:val="single" w:color="D9DCE6" w:sz="4"/>
+              <w:left w:val="single" w:color="D9DCE6" w:sz="4"/>
+              <w:bottom w:val="single" w:color="D9DCE6" w:sz="4"/>
+              <w:right w:val="single" w:color="D9DCE6" w:sz="4"/>
+            </w:tcBorders>
+            <w:tcMar>
+              <w:top w:type="dxa" w:w="70"/>
+              <w:left w:type="dxa" w:w="110"/>
+              <w:bottom w:type="dxa" w:w="70"/>
+              <w:right w:type="dxa" w:w="110"/>
+            </w:tcMar>
+          </w:tcPr>
+          <w:p>
+            <w:r>
+              <w:rPr>
+                <w:b w:val="false"/>
+                <w:bCs w:val="false"/>
+                <w:sz w:val="19"/>
+                <w:szCs w:val="19"/>
+              </w:rPr>
+              <w:t xml:space="preserve">Comercial</w:t>
+            </w:r>
+          </w:p>
+        </w:tc>
+        <w:tc>
+          <w:tcPr>
+            <w:tcW w:type="dxa" w:w="900"/>
+            <w:tcBorders>
+              <w:top w:val="single" w:color="D9DCE6" w:sz="4"/>
+              <w:left w:val="single" w:color="D9DCE6" w:sz="4"/>
+              <w:bottom w:val="single" w:color="D9DCE6" w:sz="4"/>
+              <w:right w:val="single" w:color="D9DCE6" w:sz="4"/>
+            </w:tcBorders>
+            <w:tcMar>
+              <w:top w:type="dxa" w:w="70"/>
+              <w:left w:type="dxa" w:w="110"/>
+              <w:bottom w:type="dxa" w:w="70"/>
+              <w:right w:type="dxa" w:w="110"/>
+            </w:tcMar>
+          </w:tcPr>
+          <w:p>
+            <w:r>
+              <w:rPr>
+                <w:b w:val="false"/>
+                <w:bCs w:val="false"/>
+                <w:sz w:val="19"/>
+                <w:szCs w:val="19"/>
+              </w:rPr>
+              <w:t xml:space="preserve">B</w:t>
+            </w:r>
+          </w:p>
+        </w:tc>
+        <w:tc>
+          <w:tcPr>
+            <w:tcW w:type="dxa" w:w="3010"/>
+            <w:tcBorders>
+              <w:top w:val="single" w:color="D9DCE6" w:sz="4"/>
+              <w:left w:val="single" w:color="D9DCE6" w:sz="4"/>
+              <w:bottom w:val="single" w:color="D9DCE6" w:sz="4"/>
+              <w:right w:val="single" w:color="D9DCE6" w:sz="4"/>
+            </w:tcBorders>
+            <w:tcMar>
+              <w:top w:type="dxa" w:w="70"/>
+              <w:left w:type="dxa" w:w="110"/>
+              <w:bottom w:type="dxa" w:w="70"/>
+              <w:right w:type="dxa" w:w="110"/>
+            </w:tcMar>
+          </w:tcPr>
+          <w:p>
+            <w:r>
+              <w:rPr>
+                <w:b w:val="false"/>
+                <w:bCs w:val="false"/>
+                <w:sz w:val="19"/>
+                <w:szCs w:val="19"/>
+              </w:rPr>
+              <w:t xml:space="preserve">Cisco Catalyst SD-WAN</w:t>
+            </w:r>
+          </w:p>
+        </w:tc>
+      </w:tr>
+      <w:tr>
+        <w:tc>
+          <w:tcPr>
+            <w:tcW w:type="dxa" w:w="2900"/>
+            <w:tcBorders>
+              <w:top w:val="single" w:color="D9DCE6" w:sz="4"/>
+              <w:left w:val="single" w:color="D9DCE6" w:sz="4"/>
+              <w:bottom w:val="single" w:color="D9DCE6" w:sz="4"/>
+              <w:right w:val="single" w:color="D9DCE6" w:sz="4"/>
+            </w:tcBorders>
+            <w:tcMar>
+              <w:top w:type="dxa" w:w="70"/>
+              <w:left w:type="dxa" w:w="110"/>
+              <w:bottom w:type="dxa" w:w="70"/>
+              <w:right w:type="dxa" w:w="110"/>
+            </w:tcMar>
+          </w:tcPr>
+          <w:p>
+            <w:r>
+              <w:rPr>
+                <w:b/>
+                <w:bCs/>
+                <w:sz w:val="19"/>
+                <w:szCs w:val="19"/>
+              </w:rPr>
+              <w:t xml:space="preserve">Google Workspace</w:t>
+            </w:r>
+          </w:p>
+        </w:tc>
+        <w:tc>
+          <w:tcPr>
+            <w:tcW w:type="dxa" w:w="1250"/>
+            <w:tcBorders>
+              <w:top w:val="single" w:color="D9DCE6" w:sz="4"/>
+              <w:left w:val="single" w:color="D9DCE6" w:sz="4"/>
+              <w:bottom w:val="single" w:color="D9DCE6" w:sz="4"/>
+              <w:right w:val="single" w:color="D9DCE6" w:sz="4"/>
+            </w:tcBorders>
+            <w:tcMar>
+              <w:top w:type="dxa" w:w="70"/>
+              <w:left w:type="dxa" w:w="110"/>
+              <w:bottom w:type="dxa" w:w="70"/>
+              <w:right w:type="dxa" w:w="110"/>
+            </w:tcMar>
+          </w:tcPr>
+          <w:p>
+            <w:r>
+              <w:rPr>
+                <w:b w:val="false"/>
+                <w:bCs w:val="false"/>
+                <w:sz w:val="19"/>
+                <w:szCs w:val="19"/>
+              </w:rPr>
+              <w:t xml:space="preserve">Long tail</w:t>
+            </w:r>
+          </w:p>
+        </w:tc>
+        <w:tc>
+          <w:tcPr>
+            <w:tcW w:type="dxa" w:w="1300"/>
+            <w:tcBorders>
+              <w:top w:val="single" w:color="D9DCE6" w:sz="4"/>
+              <w:left w:val="single" w:color="D9DCE6" w:sz="4"/>
+              <w:bottom w:val="single" w:color="D9DCE6" w:sz="4"/>
+              <w:right w:val="single" w:color="D9DCE6" w:sz="4"/>
+            </w:tcBorders>
+            <w:tcMar>
+              <w:top w:type="dxa" w:w="70"/>
+              <w:left w:type="dxa" w:w="110"/>
+              <w:bottom w:type="dxa" w:w="70"/>
+              <w:right w:type="dxa" w:w="110"/>
+            </w:tcMar>
+          </w:tcPr>
+          <w:p>
+            <w:r>
+              <w:rPr>
+                <w:b w:val="false"/>
+                <w:bCs w:val="false"/>
+                <w:sz w:val="19"/>
+                <w:szCs w:val="19"/>
+              </w:rPr>
+              <w:t xml:space="preserve">Informativa</w:t>
+            </w:r>
+          </w:p>
+        </w:tc>
+        <w:tc>
+          <w:tcPr>
+            <w:tcW w:type="dxa" w:w="900"/>
+            <w:tcBorders>
+              <w:top w:val="single" w:color="D9DCE6" w:sz="4"/>
+              <w:left w:val="single" w:color="D9DCE6" w:sz="4"/>
+              <w:bottom w:val="single" w:color="D9DCE6" w:sz="4"/>
+              <w:right w:val="single" w:color="D9DCE6" w:sz="4"/>
+            </w:tcBorders>
+            <w:tcMar>
+              <w:top w:type="dxa" w:w="70"/>
+              <w:left w:type="dxa" w:w="110"/>
+              <w:bottom w:type="dxa" w:w="70"/>
+              <w:right w:type="dxa" w:w="110"/>
+            </w:tcMar>
+          </w:tcPr>
+          <w:p>
+            <w:r>
+              <w:rPr>
+                <w:b w:val="false"/>
+                <w:bCs w:val="false"/>
+                <w:sz w:val="19"/>
+                <w:szCs w:val="19"/>
+              </w:rPr>
+              <w:t xml:space="preserve">C</w:t>
+            </w:r>
+          </w:p>
+        </w:tc>
+        <w:tc>
+          <w:tcPr>
+            <w:tcW w:type="dxa" w:w="3010"/>
+            <w:tcBorders>
+              <w:top w:val="single" w:color="D9DCE6" w:sz="4"/>
+              <w:left w:val="single" w:color="D9DCE6" w:sz="4"/>
+              <w:bottom w:val="single" w:color="D9DCE6" w:sz="4"/>
+              <w:right w:val="single" w:color="D9DCE6" w:sz="4"/>
+            </w:tcBorders>
+            <w:tcMar>
+              <w:top w:type="dxa" w:w="70"/>
+              <w:left w:type="dxa" w:w="110"/>
+              <w:bottom w:type="dxa" w:w="70"/>
+              <w:right w:type="dxa" w:w="110"/>
+            </w:tcMar>
+          </w:tcPr>
+          <w:p>
+            <w:r>
+              <w:rPr>
+                <w:b w:val="false"/>
+                <w:bCs w:val="false"/>
+                <w:sz w:val="19"/>
+                <w:szCs w:val="19"/>
+              </w:rPr>
+              <w:t xml:space="preserve">Fichas de producto y SECaaS</w:t>
+            </w:r>
+          </w:p>
+        </w:tc>
+      </w:tr>
+      <w:tr>
+        <w:tc>
+          <w:tcPr>
+            <w:tcW w:type="dxa" w:w="2900"/>
+            <w:tcBorders>
+              <w:top w:val="single" w:color="D9DCE6" w:sz="4"/>
+              <w:left w:val="single" w:color="D9DCE6" w:sz="4"/>
+              <w:bottom w:val="single" w:color="D9DCE6" w:sz="4"/>
+              <w:right w:val="single" w:color="D9DCE6" w:sz="4"/>
+            </w:tcBorders>
+            <w:tcMar>
+              <w:top w:type="dxa" w:w="70"/>
+              <w:left w:type="dxa" w:w="110"/>
+              <w:bottom w:type="dxa" w:w="70"/>
+              <w:right w:type="dxa" w:w="110"/>
+            </w:tcMar>
+          </w:tcPr>
+          <w:p>
+            <w:r>
+              <w:rPr>
+                <w:b/>
+                <w:bCs/>
+                <w:sz w:val="19"/>
+                <w:szCs w:val="19"/>
+              </w:rPr>
+              <w:t xml:space="preserve">Meraki vMX en AWS y Google Cloud</w:t>
+            </w:r>
+          </w:p>
+        </w:tc>
+        <w:tc>
+          <w:tcPr>
+            <w:tcW w:type="dxa" w:w="1250"/>
+            <w:tcBorders>
+              <w:top w:val="single" w:color="D9DCE6" w:sz="4"/>
+              <w:left w:val="single" w:color="D9DCE6" w:sz="4"/>
+              <w:bottom w:val="single" w:color="D9DCE6" w:sz="4"/>
+              <w:right w:val="single" w:color="D9DCE6" w:sz="4"/>
+            </w:tcBorders>
+            <w:tcMar>
+              <w:top w:type="dxa" w:w="70"/>
+              <w:left w:type="dxa" w:w="110"/>
+              <w:bottom w:type="dxa" w:w="70"/>
+              <w:right w:type="dxa" w:w="110"/>
+            </w:tcMar>
+          </w:tcPr>
+          <w:p>
+            <w:r>
+              <w:rPr>
+                <w:b w:val="false"/>
+                <w:bCs w:val="false"/>
+                <w:sz w:val="19"/>
+                <w:szCs w:val="19"/>
+              </w:rPr>
+              <w:t xml:space="preserve">Long tail</w:t>
+            </w:r>
+          </w:p>
+        </w:tc>
+        <w:tc>
+          <w:tcPr>
+            <w:tcW w:type="dxa" w:w="1300"/>
+            <w:tcBorders>
+              <w:top w:val="single" w:color="D9DCE6" w:sz="4"/>
+              <w:left w:val="single" w:color="D9DCE6" w:sz="4"/>
+              <w:bottom w:val="single" w:color="D9DCE6" w:sz="4"/>
+              <w:right w:val="single" w:color="D9DCE6" w:sz="4"/>
+            </w:tcBorders>
+            <w:tcMar>
+              <w:top w:type="dxa" w:w="70"/>
+              <w:left w:type="dxa" w:w="110"/>
+              <w:bottom w:type="dxa" w:w="70"/>
+              <w:right w:type="dxa" w:w="110"/>
+            </w:tcMar>
+          </w:tcPr>
+          <w:p>
+            <w:r>
+              <w:rPr>
+                <w:b w:val="false"/>
+                <w:bCs w:val="false"/>
+                <w:sz w:val="19"/>
+                <w:szCs w:val="19"/>
+              </w:rPr>
+              <w:t xml:space="preserve">Informativa</w:t>
+            </w:r>
+          </w:p>
+        </w:tc>
+        <w:tc>
+          <w:tcPr>
+            <w:tcW w:type="dxa" w:w="900"/>
+            <w:tcBorders>
+              <w:top w:val="single" w:color="D9DCE6" w:sz="4"/>
+              <w:left w:val="single" w:color="D9DCE6" w:sz="4"/>
+              <w:bottom w:val="single" w:color="D9DCE6" w:sz="4"/>
+              <w:right w:val="single" w:color="D9DCE6" w:sz="4"/>
+            </w:tcBorders>
+            <w:tcMar>
+              <w:top w:type="dxa" w:w="70"/>
+              <w:left w:type="dxa" w:w="110"/>
+              <w:bottom w:type="dxa" w:w="70"/>
+              <w:right w:type="dxa" w:w="110"/>
+            </w:tcMar>
+          </w:tcPr>
+          <w:p>
+            <w:r>
+              <w:rPr>
+                <w:b w:val="false"/>
+                <w:bCs w:val="false"/>
+                <w:sz w:val="19"/>
+                <w:szCs w:val="19"/>
+              </w:rPr>
+              <w:t xml:space="preserve">C</w:t>
+            </w:r>
+          </w:p>
+        </w:tc>
+        <w:tc>
+          <w:tcPr>
+            <w:tcW w:type="dxa" w:w="3010"/>
+            <w:tcBorders>
+              <w:top w:val="single" w:color="D9DCE6" w:sz="4"/>
+              <w:left w:val="single" w:color="D9DCE6" w:sz="4"/>
+              <w:bottom w:val="single" w:color="D9DCE6" w:sz="4"/>
+              <w:right w:val="single" w:color="D9DCE6" w:sz="4"/>
+            </w:tcBorders>
+            <w:tcMar>
+              <w:top w:type="dxa" w:w="70"/>
+              <w:left w:type="dxa" w:w="110"/>
+              <w:bottom w:type="dxa" w:w="70"/>
+              <w:right w:type="dxa" w:w="110"/>
+            </w:tcMar>
+          </w:tcPr>
+          <w:p>
+            <w:r>
+              <w:rPr>
+                <w:b w:val="false"/>
+                <w:bCs w:val="false"/>
+                <w:sz w:val="19"/>
+                <w:szCs w:val="19"/>
+              </w:rPr>
+              <w:t xml:space="preserve">Meraki MX + Secure Access</w:t>
+            </w:r>
+          </w:p>
+        </w:tc>
+      </w:tr>
+    </w:tbl>
+    <w:p>
+      <w:pPr>
+        <w:spacing w:after="60"/>
+      </w:pPr>
+    </w:p>
+    <w:p>
+      <w:pPr>
+        <w:pStyle w:val="Heading2"/>
+      </w:pPr>
+      <w:r>
         <w:t xml:space="preserve">1. Conectividad LAN y WAN (Infraestructura)</w:t>
       </w:r>
     </w:p>
@@ -14366,6 +15347,19 @@
       </w:pPr>
       <w:r>
         <w:t xml:space="preserve">Estilo minimalista: una idea por frase y sin redundancias.</w:t>
+      </w:r>
+    </w:p>
+    <w:p>
+      <w:pPr>
+        <w:pStyle w:val="ListParagraph"/>
+        <w:numPr>
+          <w:ilvl w:val="0"/>
+          <w:numId w:val="2"/>
+        </w:numPr>
+        <w:spacing w:after="60"/>
+      </w:pPr>
+      <w:r>
+        <w:t xml:space="preserve">Microsoft es nuestra BASE y va primero en titulares y argumentos. En cada área decimos también qué aportamos en AWS, Google Cloud y otras plataformas, para no perder a las empresas que operan en varias nubes.</w:t>
       </w:r>
     </w:p>
     <w:p>
@@ -16061,6 +17055,103 @@
                 <w:szCs w:val="19"/>
               </w:rPr>
               <w:t xml:space="preserve">Microsoft Teams Rooms · salas de reuniones para Teams</w:t>
+            </w:r>
+          </w:p>
+        </w:tc>
+      </w:tr>
+      <w:tr>
+        <w:tc>
+          <w:tcPr>
+            <w:tcW w:type="dxa" w:w="1700"/>
+            <w:tcBorders>
+              <w:top w:val="single" w:color="D9DCE6" w:sz="4"/>
+              <w:left w:val="single" w:color="D9DCE6" w:sz="4"/>
+              <w:bottom w:val="single" w:color="D9DCE6" w:sz="4"/>
+              <w:right w:val="single" w:color="D9DCE6" w:sz="4"/>
+            </w:tcBorders>
+            <w:tcMar>
+              <w:top w:type="dxa" w:w="70"/>
+              <w:left w:type="dxa" w:w="110"/>
+              <w:bottom w:type="dxa" w:w="70"/>
+              <w:right w:type="dxa" w:w="110"/>
+            </w:tcMar>
+          </w:tcPr>
+          <w:p>
+            <w:r>
+              <w:rPr>
+                <w:b/>
+                <w:bCs/>
+                <w:sz w:val="19"/>
+                <w:szCs w:val="19"/>
+              </w:rPr>
+              <w:t xml:space="preserve">Multinube</w:t>
+            </w:r>
+          </w:p>
+        </w:tc>
+        <w:tc>
+          <w:tcPr>
+            <w:tcW w:type="dxa" w:w="4360"/>
+            <w:tcBorders>
+              <w:top w:val="single" w:color="D9DCE6" w:sz="4"/>
+              <w:left w:val="single" w:color="D9DCE6" w:sz="4"/>
+              <w:bottom w:val="single" w:color="D9DCE6" w:sz="4"/>
+              <w:right w:val="single" w:color="D9DCE6" w:sz="4"/>
+            </w:tcBorders>
+            <w:tcMar>
+              <w:top w:type="dxa" w:w="70"/>
+              <w:left w:type="dxa" w:w="110"/>
+              <w:bottom w:type="dxa" w:w="70"/>
+              <w:right w:type="dxa" w:w="110"/>
+            </w:tcMar>
+          </w:tcPr>
+          <w:p>
+            <w:r>
+              <w:rPr>
+                <w:b w:val="false"/>
+                <w:bCs w:val="false"/>
+                <w:sz w:val="19"/>
+                <w:szCs w:val="19"/>
+              </w:rPr>
+              <w:t xml:space="preserve">Cisco con Microsoft, AWS y Google Cloud: una red y una seguridad para varias nubes</w:t>
+            </w:r>
+          </w:p>
+          <w:p>
+            <w:r>
+              <w:rPr>
+                <w:b w:val="false"/>
+                <w:bCs w:val="false"/>
+                <w:sz w:val="19"/>
+                <w:szCs w:val="19"/>
+              </w:rPr>
+              <w:t xml:space="preserve">Cómo conectar sus sedes a AWS y Google Cloud con SD-WAN</w:t>
+            </w:r>
+          </w:p>
+        </w:tc>
+        <w:tc>
+          <w:tcPr>
+            <w:tcW w:type="dxa" w:w="3300"/>
+            <w:tcBorders>
+              <w:top w:val="single" w:color="D9DCE6" w:sz="4"/>
+              <w:left w:val="single" w:color="D9DCE6" w:sz="4"/>
+              <w:bottom w:val="single" w:color="D9DCE6" w:sz="4"/>
+              <w:right w:val="single" w:color="D9DCE6" w:sz="4"/>
+            </w:tcBorders>
+            <w:tcMar>
+              <w:top w:type="dxa" w:w="70"/>
+              <w:left w:type="dxa" w:w="110"/>
+              <w:bottom w:type="dxa" w:w="70"/>
+              <w:right w:type="dxa" w:w="110"/>
+            </w:tcMar>
+          </w:tcPr>
+          <w:p>
+            <w:r>
+              <w:rPr>
+                <w:b w:val="false"/>
+                <w:bCs w:val="false"/>
+                <w:sz w:val="19"/>
+                <w:szCs w:val="19"/>
+              </w:rPr>
+              <w:t xml:space="preserve">SD-WAN multinube · seguridad multinube · conectividad a AWS y Google Cloud</w:t>
             </w:r>
           </w:p>
         </w:tc>

</xml_diff>

<commit_message>
Programa Renueva: renewal message for AWS and Google Cloud too
Notice, why-renew lead, offers intro, self-check signal, each offer's
detail ('También en'), illustration label and meta description now say
the renewed network is ready for Microsoft and also for AWS or Google
Cloud.

Co-Authored-By: Claude Opus 5.5 <noreply@anthropic.com>
Claude-Session: https://claude.ai/code/session_01H6AF8PmtHtRfTJNyr7b15s
</commit_message>
<xml_diff>
--- a/consein-cisco/Manual_SEO_Consein_Cisco.docx
+++ b/consein-cisco/Manual_SEO_Consein_Cisco.docx
@@ -1624,7 +1624,7 @@
                 <w:sz w:val="19"/>
                 <w:szCs w:val="19"/>
               </w:rPr>
-              <w:t xml:space="preserve">Microsoft sigue como BASE en todos los titulares. Cada ficha suma la fila “También en otras plataformas” (AWS, Google Cloud, Google Workspace, Webex, otras MDM y SIEM), cada área muestra “También en:” y hay una pregunta frecuente nueva: “¿Trabajan solo con Microsoft?”.</w:t>
+              <w:t xml:space="preserve">Microsoft sigue como BASE en todos los titulares. Cada ficha suma la fila “También en otras plataformas” (AWS, Google Cloud, Google Workspace, Webex, otras MDM y SIEM), cada área muestra “También en:”, el Programa Renueva lo repite en el aviso, la tabla de rutas, la introducción de las ofertas y cada oferta, y hay una pregunta frecuente nueva: “¿Trabajan solo con Microsoft?”.</w:t>
             </w:r>
           </w:p>
         </w:tc>
@@ -2574,7 +2574,7 @@
                 <w:sz w:val="19"/>
                 <w:szCs w:val="19"/>
               </w:rPr>
-              <w:t xml:space="preserve">Renovamos switches, Wi-Fi, routers, firewalls y salas Cisco en fin de soporte. Inventario de obsolescencia gratis, migración por fases y financiamiento.</w:t>
+              <w:t xml:space="preserve">Renovamos equipos Cisco en fin de soporte hacia una red lista para Microsoft, AWS y Google Cloud. Inventario de obsolescencia gratis y financiamiento.</w:t>
             </w:r>
           </w:p>
         </w:tc>
@@ -2602,7 +2602,7 @@
                 <w:sz w:val="19"/>
                 <w:szCs w:val="19"/>
               </w:rPr>
-              <w:t xml:space="preserve">152</w:t>
+              <w:t xml:space="preserve">150</w:t>
             </w:r>
           </w:p>
         </w:tc>

</xml_diff>

<commit_message>
Apply review Rev1: NaaS, Ciberseguridad 360, Datacenter; inventory as a service
- Area 1 becomes Network as a Service (NaaS) with the reviewed copy
- SECaaS and Red local y perímetro merge into Ciberseguridad 360
- Cisco AI Defense removed for now; Datacenter area and card added,
  also in the accelerator line and the hero graphic
- Obsolescence inventory is a paid service: no 'gratis' anywhere
- Nosotros: Consein since 1987, Cisco since July 2026; countries without
  a city list
- Self-check recommends offers by signal and only mentions obsolescence
  when the selected signals point to it
- Keyword list, SEO manual and README updated

Co-Authored-By: Claude Opus 5.5 <noreply@anthropic.com>
Claude-Session: https://claude.ai/code/session_01H6AF8PmtHtRfTJNyr7b15s
</commit_message>
<xml_diff>
--- a/consein-cisco/Manual_SEO_Consein_Cisco.docx
+++ b/consein-cisco/Manual_SEO_Consein_Cisco.docx
@@ -56,7 +56,7 @@
         <w:rPr>
           <w:color w:val="5D6278"/>
         </w:rPr>
-        <w:t xml:space="preserve">Documento editable para el equipo de marketing y contenidos · Versión 2 · Octubre 2026</w:t>
+        <w:t xml:space="preserve">Documento editable para el equipo de marketing y contenidos · Versión 3 · Octubre 2026</w:t>
       </w:r>
     </w:p>
     <w:p>
@@ -64,7 +64,7 @@
         <w:spacing w:after="120"/>
       </w:pPr>
       <w:r>
-        <w:t xml:space="preserve">Este manual reúne la estrategia de posicionamiento del sitio Soluciones Cisco, los ajustes que ya aplicamos, las 70 palabras clave objetivo y el plan de trabajo para llegar a las cinco primeras posiciones de Google en nuestro ámbito.</w:t>
+        <w:t xml:space="preserve">Este manual reúne la estrategia de posicionamiento del sitio Soluciones Cisco, los ajustes que ya aplicamos, las 72 palabras clave objetivo y el plan de trabajo para llegar a las cinco primeras posiciones de Google en nuestro ámbito.</w:t>
       </w:r>
     </w:p>
     <w:p>
@@ -127,7 +127,7 @@
         <w:spacing w:after="120"/>
       </w:pPr>
       <w:r>
-        <w:t xml:space="preserve">Queremos que Consein aparezca entre los cinco primeros resultados cuando una empresa de Venezuela, Panamá, República Dominicana o el mercado hispano de Estados Unidos busque soluciones Cisco integradas con Microsoft: conectividad SD-WAN y SASE, seguridad como servicio, control de acceso a la red, salas Teams Rooms, seguridad para IA y renovación de equipos Cisco.</w:t>
+        <w:t xml:space="preserve">Queremos que Consein aparezca entre los cinco primeros resultados cuando una empresa de Venezuela, Panamá, República Dominicana o el mercado hispano de Estados Unidos busque soluciones Cisco integradas con Microsoft (y también con AWS o Google Cloud): Network as a Service con SD-WAN y SASE, Ciberseguridad 360, salas Teams Rooms, datacenter y renovación de equipos Cisco.</w:t>
       </w:r>
     </w:p>
     <w:p>
@@ -849,7 +849,7 @@
         <w:spacing w:after="120"/>
       </w:pPr>
       <w:r>
-        <w:t xml:space="preserve">Auditamos las tres páginas con la lista de palabras clave. Antes de los ajustes, la mayoría de las frases objetivo no aparecía de forma literal: de 52 frases revisadas, solo 5 estaban en el texto. Hoy las 69 frases publicables aparecen en la página que les corresponde (la frase “partner Cisco Venezuela” queda pendiente hasta confirmar el nivel de partnership).</w:t>
+        <w:t xml:space="preserve">Auditamos las tres páginas con la lista de palabras clave. Antes de los ajustes, la mayoría de las frases objetivo no aparecía de forma literal: de 52 frases revisadas, solo 5 estaban en el texto. Hoy las 71 frases publicables aparecen en la página que les corresponde (la frase “partner Cisco Venezuela” queda pendiente hasta confirmar el nivel de partnership).</w:t>
       </w:r>
     </w:p>
     <w:tbl>
@@ -1160,7 +1160,7 @@
                 <w:sz w:val="19"/>
                 <w:szCs w:val="19"/>
               </w:rPr>
-              <w:t xml:space="preserve">Cada área lleva su palabra clave principal: SD-WAN para empresas, seguridad como servicio, control de acceso a la red (NAC), Microsoft Teams Rooms y seguridad para inteligencia artificial.</w:t>
+              <w:t xml:space="preserve">Cada área lleva su palabra clave principal: Network as a Service (NaaS) con SD-WAN para empresas, Ciberseguridad 360, Microsoft Teams Rooms y modernización de datacenter.</w:t>
             </w:r>
           </w:p>
         </w:tc>
@@ -1625,6 +1625,64 @@
                 <w:szCs w:val="19"/>
               </w:rPr>
               <w:t xml:space="preserve">Microsoft sigue como BASE en todos los titulares. Cada ficha suma la fila “También en otras plataformas” (AWS, Google Cloud, Google Workspace, Webex, otras MDM y SIEM), cada área muestra “También en:”, el Programa Renueva lo repite en el aviso, la tabla de rutas, la introducción de las ofertas y cada oferta, hay una pregunta frecuente nueva (“¿Trabajan solo con Microsoft?”) y los gráficos del diseño digital muestran una nota discreta “*AWS / Google Cloud” bajo Microsoft · BASE.</w:t>
+            </w:r>
+          </w:p>
+        </w:tc>
+      </w:tr>
+      <w:tr>
+        <w:tc>
+          <w:tcPr>
+            <w:tcW w:type="dxa" w:w="2400"/>
+            <w:tcBorders>
+              <w:top w:val="single" w:color="D9DCE6" w:sz="4"/>
+              <w:left w:val="single" w:color="D9DCE6" w:sz="4"/>
+              <w:bottom w:val="single" w:color="D9DCE6" w:sz="4"/>
+              <w:right w:val="single" w:color="D9DCE6" w:sz="4"/>
+            </w:tcBorders>
+            <w:tcMar>
+              <w:top w:type="dxa" w:w="70"/>
+              <w:left w:type="dxa" w:w="110"/>
+              <w:bottom w:type="dxa" w:w="70"/>
+              <w:right w:type="dxa" w:w="110"/>
+            </w:tcMar>
+          </w:tcPr>
+          <w:p>
+            <w:r>
+              <w:rPr>
+                <w:b/>
+                <w:bCs/>
+                <w:sz w:val="19"/>
+                <w:szCs w:val="19"/>
+              </w:rPr>
+              <w:t xml:space="preserve">Revisión Rev1 (octubre 2026)</w:t>
+            </w:r>
+          </w:p>
+        </w:tc>
+        <w:tc>
+          <w:tcPr>
+            <w:tcW w:type="dxa" w:w="6960"/>
+            <w:tcBorders>
+              <w:top w:val="single" w:color="D9DCE6" w:sz="4"/>
+              <w:left w:val="single" w:color="D9DCE6" w:sz="4"/>
+              <w:bottom w:val="single" w:color="D9DCE6" w:sz="4"/>
+              <w:right w:val="single" w:color="D9DCE6" w:sz="4"/>
+            </w:tcBorders>
+            <w:tcMar>
+              <w:top w:type="dxa" w:w="70"/>
+              <w:left w:type="dxa" w:w="110"/>
+              <w:bottom w:type="dxa" w:w="70"/>
+              <w:right w:type="dxa" w:w="110"/>
+            </w:tcMar>
+          </w:tcPr>
+          <w:p>
+            <w:r>
+              <w:rPr>
+                <w:b w:val="false"/>
+                <w:bCs w:val="false"/>
+                <w:sz w:val="19"/>
+                <w:szCs w:val="19"/>
+              </w:rPr>
+              <w:t xml:space="preserve">Áreas: Network as a Service (NaaS), Ciberseguridad 360 (SECaaS, Cisco ISE y Secure Firewall en una sola área), Colaboración y Datacenter. Cisco AI Defense sale del sitio por ahora. El inventario de obsolescencia es un servicio, no gratuito. Nosotros aclara que Consein existe desde 1987 y suma Cisco desde julio de 2026.</w:t>
             </w:r>
           </w:p>
         </w:tc>
@@ -2065,7 +2123,7 @@
                 <w:sz w:val="19"/>
                 <w:szCs w:val="19"/>
               </w:rPr>
-              <w:t xml:space="preserve">Soluciones Cisco: SD-WAN, SASE, SECaaS y Teams Rooms | Consein</w:t>
+              <w:t xml:space="preserve">Soluciones Cisco: NaaS, SD-WAN, SECaaS y Teams Rooms | Consein</w:t>
             </w:r>
           </w:p>
         </w:tc>
@@ -2574,7 +2632,7 @@
                 <w:sz w:val="19"/>
                 <w:szCs w:val="19"/>
               </w:rPr>
-              <w:t xml:space="preserve">Renovamos equipos Cisco en fin de soporte hacia una red lista para Microsoft, AWS y Google Cloud. Inventario de obsolescencia gratis y financiamiento.</w:t>
+              <w:t xml:space="preserve">Renovamos equipos Cisco en fin de soporte hacia una red lista para Microsoft, AWS y Google Cloud. Inventario de obsolescencia, migración por fases y financiamiento.</w:t>
             </w:r>
           </w:p>
         </w:tc>
@@ -2602,7 +2660,7 @@
                 <w:sz w:val="19"/>
                 <w:szCs w:val="19"/>
               </w:rPr>
-              <w:t xml:space="preserve">150</w:t>
+              <w:t xml:space="preserve">164</w:t>
             </w:r>
           </w:p>
         </w:tc>
@@ -2758,7 +2816,7 @@
                 <w:sz w:val="19"/>
                 <w:szCs w:val="19"/>
               </w:rPr>
-              <w:t xml:space="preserve">Conectividad LAN y WAN</w:t>
+              <w:t xml:space="preserve">Network as a Service (NaaS)</w:t>
             </w:r>
           </w:p>
         </w:tc>
@@ -2786,7 +2844,7 @@
                 <w:sz w:val="19"/>
                 <w:szCs w:val="19"/>
               </w:rPr>
-              <w:t xml:space="preserve">SD-WAN para empresas y arquitectura SASE</w:t>
+              <w:t xml:space="preserve">Network as a Service (NaaS) con SD-WAN para empresas</w:t>
             </w:r>
           </w:p>
         </w:tc>
@@ -2844,7 +2902,7 @@
                 <w:sz w:val="19"/>
                 <w:szCs w:val="19"/>
               </w:rPr>
-              <w:t xml:space="preserve">SECaaS</w:t>
+              <w:t xml:space="preserve">Ciberseguridad 360</w:t>
             </w:r>
           </w:p>
         </w:tc>
@@ -2872,7 +2930,7 @@
                 <w:sz w:val="19"/>
                 <w:szCs w:val="19"/>
               </w:rPr>
-              <w:t xml:space="preserve">SECaaS: seguridad como servicio, del endpoint al firewall en la nube</w:t>
+              <w:t xml:space="preserve">Ciberseguridad 360: protección unificada del endpoint a la nube</w:t>
             </w:r>
           </w:p>
         </w:tc>
@@ -2930,7 +2988,7 @@
                 <w:sz w:val="19"/>
                 <w:szCs w:val="19"/>
               </w:rPr>
-              <w:t xml:space="preserve">Red local y perímetro</w:t>
+              <w:t xml:space="preserve">Colaboración</w:t>
             </w:r>
           </w:p>
         </w:tc>
@@ -2958,7 +3016,7 @@
                 <w:sz w:val="19"/>
                 <w:szCs w:val="19"/>
               </w:rPr>
-              <w:t xml:space="preserve">Control de acceso a la red (NAC) y firewall perimetral</w:t>
+              <w:t xml:space="preserve">Salas Microsoft Teams Rooms con hardware Cisco</w:t>
             </w:r>
           </w:p>
         </w:tc>
@@ -2986,7 +3044,7 @@
                 <w:sz w:val="19"/>
                 <w:szCs w:val="19"/>
               </w:rPr>
-              <w:t xml:space="preserve">Seguridad</w:t>
+              <w:t xml:space="preserve">Colaboración</w:t>
             </w:r>
           </w:p>
         </w:tc>
@@ -3016,7 +3074,7 @@
                 <w:sz w:val="19"/>
                 <w:szCs w:val="19"/>
               </w:rPr>
-              <w:t xml:space="preserve">Colaboración</w:t>
+              <w:t xml:space="preserve">Datacenter</w:t>
             </w:r>
           </w:p>
         </w:tc>
@@ -3044,7 +3102,7 @@
                 <w:sz w:val="19"/>
                 <w:szCs w:val="19"/>
               </w:rPr>
-              <w:t xml:space="preserve">Salas Microsoft Teams Rooms con hardware Cisco</w:t>
+              <w:t xml:space="preserve">Modernización de datacenter para la nube híbrida</w:t>
             </w:r>
           </w:p>
         </w:tc>
@@ -3072,93 +3130,7 @@
                 <w:sz w:val="19"/>
                 <w:szCs w:val="19"/>
               </w:rPr>
-              <w:t xml:space="preserve">Colaboración</w:t>
-            </w:r>
-          </w:p>
-        </w:tc>
-      </w:tr>
-      <w:tr>
-        <w:tc>
-          <w:tcPr>
-            <w:tcW w:type="dxa" w:w="2400"/>
-            <w:tcBorders>
-              <w:top w:val="single" w:color="D9DCE6" w:sz="4"/>
-              <w:left w:val="single" w:color="D9DCE6" w:sz="4"/>
-              <w:bottom w:val="single" w:color="D9DCE6" w:sz="4"/>
-              <w:right w:val="single" w:color="D9DCE6" w:sz="4"/>
-            </w:tcBorders>
-            <w:tcMar>
-              <w:top w:type="dxa" w:w="70"/>
-              <w:left w:type="dxa" w:w="110"/>
-              <w:bottom w:type="dxa" w:w="70"/>
-              <w:right w:type="dxa" w:w="110"/>
-            </w:tcMar>
-          </w:tcPr>
-          <w:p>
-            <w:r>
-              <w:rPr>
-                <w:b/>
-                <w:bCs/>
-                <w:sz w:val="19"/>
-                <w:szCs w:val="19"/>
-              </w:rPr>
-              <w:t xml:space="preserve">Inteligencia Artificial</w:t>
-            </w:r>
-          </w:p>
-        </w:tc>
-        <w:tc>
-          <w:tcPr>
-            <w:tcW w:type="dxa" w:w="5160"/>
-            <w:tcBorders>
-              <w:top w:val="single" w:color="D9DCE6" w:sz="4"/>
-              <w:left w:val="single" w:color="D9DCE6" w:sz="4"/>
-              <w:bottom w:val="single" w:color="D9DCE6" w:sz="4"/>
-              <w:right w:val="single" w:color="D9DCE6" w:sz="4"/>
-            </w:tcBorders>
-            <w:tcMar>
-              <w:top w:type="dxa" w:w="70"/>
-              <w:left w:type="dxa" w:w="110"/>
-              <w:bottom w:type="dxa" w:w="70"/>
-              <w:right w:type="dxa" w:w="110"/>
-            </w:tcMar>
-          </w:tcPr>
-          <w:p>
-            <w:r>
-              <w:rPr>
-                <w:b w:val="false"/>
-                <w:bCs w:val="false"/>
-                <w:sz w:val="19"/>
-                <w:szCs w:val="19"/>
-              </w:rPr>
-              <w:t xml:space="preserve">Seguridad para inteligencia artificial</w:t>
-            </w:r>
-          </w:p>
-        </w:tc>
-        <w:tc>
-          <w:tcPr>
-            <w:tcW w:type="dxa" w:w="1800"/>
-            <w:tcBorders>
-              <w:top w:val="single" w:color="D9DCE6" w:sz="4"/>
-              <w:left w:val="single" w:color="D9DCE6" w:sz="4"/>
-              <w:bottom w:val="single" w:color="D9DCE6" w:sz="4"/>
-              <w:right w:val="single" w:color="D9DCE6" w:sz="4"/>
-            </w:tcBorders>
-            <w:tcMar>
-              <w:top w:type="dxa" w:w="70"/>
-              <w:left w:type="dxa" w:w="110"/>
-              <w:bottom w:type="dxa" w:w="70"/>
-              <w:right w:type="dxa" w:w="110"/>
-            </w:tcMar>
-          </w:tcPr>
-          <w:p>
-            <w:r>
-              <w:rPr>
-                <w:b w:val="false"/>
-                <w:bCs w:val="false"/>
-                <w:sz w:val="19"/>
-                <w:szCs w:val="19"/>
-              </w:rPr>
-              <w:t xml:space="preserve">IA</w:t>
+              <w:t xml:space="preserve">Infraestructura</w:t>
             </w:r>
           </w:p>
         </w:tc>
@@ -3178,7 +3150,7 @@
         <w:spacing w:after="120"/>
       </w:pPr>
       <w:r>
-        <w:t xml:space="preserve">70 palabras clave en 8 grupos; 36 son de prioridad A. La lista maestra está en _fuente/palabras_clave.json: edite ese archivo y vuelva a generar este manual para mantener todo alineado.</w:t>
+        <w:t xml:space="preserve">72 palabras clave en 7 grupos; 39 son de prioridad A. La lista maestra está en _fuente/palabras_clave.json: edite ese archivo y vuelva a generar este manual para mantener todo alineado.</w:t>
       </w:r>
     </w:p>
     <w:p>
@@ -3461,7 +3433,7 @@
                 <w:sz w:val="19"/>
                 <w:szCs w:val="19"/>
               </w:rPr>
-              <w:t xml:space="preserve">en Venezuela · Caracas · Valencia · Maracaibo</w:t>
+              <w:t xml:space="preserve">en Venezuela (todo el país) · Caracas · Valencia · Maracaibo</w:t>
             </w:r>
           </w:p>
         </w:tc>
@@ -4269,7 +4241,7 @@
                 <w:sz w:val="19"/>
                 <w:szCs w:val="19"/>
               </w:rPr>
-              <w:t xml:space="preserve">index.html · title y Nosotros</w:t>
+              <w:t xml:space="preserve">index.html · Nosotros (Cisco, desde 2026)</w:t>
             </w:r>
           </w:p>
         </w:tc>
@@ -5918,7 +5890,7 @@
         <w:pStyle w:val="Heading2"/>
       </w:pPr>
       <w:r>
-        <w:t xml:space="preserve">1. Conectividad LAN y WAN (Infraestructura)</w:t>
+        <w:t xml:space="preserve">1. Network as a Service (Infraestructura)</w:t>
       </w:r>
     </w:p>
     <w:p>
@@ -5943,7 +5915,7 @@
         <w:t xml:space="preserve">   ·   Objetivo: </w:t>
       </w:r>
       <w:r>
-        <w:t xml:space="preserve">Posicionarnos en SD-WAN y SASE para empresas y en redes gestionadas en la nube con Cisco Meraki.</w:t>
+        <w:t xml:space="preserve">Posicionarnos en Network as a Service, SD-WAN y SASE para empresas, con redes gestionadas en la nube con Cisco Meraki.</w:t>
       </w:r>
     </w:p>
     <w:tbl>
@@ -6145,6 +6117,290 @@
                 <w:sz w:val="19"/>
                 <w:szCs w:val="19"/>
               </w:rPr>
+              <w:t xml:space="preserve">Network as a Service</w:t>
+            </w:r>
+          </w:p>
+        </w:tc>
+        <w:tc>
+          <w:tcPr>
+            <w:tcW w:type="dxa" w:w="1250"/>
+            <w:tcBorders>
+              <w:top w:val="single" w:color="D9DCE6" w:sz="4"/>
+              <w:left w:val="single" w:color="D9DCE6" w:sz="4"/>
+              <w:bottom w:val="single" w:color="D9DCE6" w:sz="4"/>
+              <w:right w:val="single" w:color="D9DCE6" w:sz="4"/>
+            </w:tcBorders>
+            <w:tcMar>
+              <w:top w:type="dxa" w:w="70"/>
+              <w:left w:type="dxa" w:w="110"/>
+              <w:bottom w:type="dxa" w:w="70"/>
+              <w:right w:type="dxa" w:w="110"/>
+            </w:tcMar>
+          </w:tcPr>
+          <w:p>
+            <w:r>
+              <w:rPr>
+                <w:b w:val="false"/>
+                <w:bCs w:val="false"/>
+                <w:sz w:val="19"/>
+                <w:szCs w:val="19"/>
+              </w:rPr>
+              <w:t xml:space="preserve">Principal</w:t>
+            </w:r>
+          </w:p>
+        </w:tc>
+        <w:tc>
+          <w:tcPr>
+            <w:tcW w:type="dxa" w:w="1300"/>
+            <w:tcBorders>
+              <w:top w:val="single" w:color="D9DCE6" w:sz="4"/>
+              <w:left w:val="single" w:color="D9DCE6" w:sz="4"/>
+              <w:bottom w:val="single" w:color="D9DCE6" w:sz="4"/>
+              <w:right w:val="single" w:color="D9DCE6" w:sz="4"/>
+            </w:tcBorders>
+            <w:tcMar>
+              <w:top w:type="dxa" w:w="70"/>
+              <w:left w:type="dxa" w:w="110"/>
+              <w:bottom w:type="dxa" w:w="70"/>
+              <w:right w:type="dxa" w:w="110"/>
+            </w:tcMar>
+          </w:tcPr>
+          <w:p>
+            <w:r>
+              <w:rPr>
+                <w:b w:val="false"/>
+                <w:bCs w:val="false"/>
+                <w:sz w:val="19"/>
+                <w:szCs w:val="19"/>
+              </w:rPr>
+              <w:t xml:space="preserve">Comercial</w:t>
+            </w:r>
+          </w:p>
+        </w:tc>
+        <w:tc>
+          <w:tcPr>
+            <w:tcW w:type="dxa" w:w="900"/>
+            <w:tcBorders>
+              <w:top w:val="single" w:color="D9DCE6" w:sz="4"/>
+              <w:left w:val="single" w:color="D9DCE6" w:sz="4"/>
+              <w:bottom w:val="single" w:color="D9DCE6" w:sz="4"/>
+              <w:right w:val="single" w:color="D9DCE6" w:sz="4"/>
+            </w:tcBorders>
+            <w:tcMar>
+              <w:top w:type="dxa" w:w="70"/>
+              <w:left w:type="dxa" w:w="110"/>
+              <w:bottom w:type="dxa" w:w="70"/>
+              <w:right w:type="dxa" w:w="110"/>
+            </w:tcMar>
+          </w:tcPr>
+          <w:p>
+            <w:r>
+              <w:rPr>
+                <w:b w:val="false"/>
+                <w:bCs w:val="false"/>
+                <w:sz w:val="19"/>
+                <w:szCs w:val="19"/>
+              </w:rPr>
+              <w:t xml:space="preserve">A</w:t>
+            </w:r>
+          </w:p>
+        </w:tc>
+        <w:tc>
+          <w:tcPr>
+            <w:tcW w:type="dxa" w:w="3010"/>
+            <w:tcBorders>
+              <w:top w:val="single" w:color="D9DCE6" w:sz="4"/>
+              <w:left w:val="single" w:color="D9DCE6" w:sz="4"/>
+              <w:bottom w:val="single" w:color="D9DCE6" w:sz="4"/>
+              <w:right w:val="single" w:color="D9DCE6" w:sz="4"/>
+            </w:tcBorders>
+            <w:tcMar>
+              <w:top w:type="dxa" w:w="70"/>
+              <w:left w:type="dxa" w:w="110"/>
+              <w:bottom w:type="dxa" w:w="70"/>
+              <w:right w:type="dxa" w:w="110"/>
+            </w:tcMar>
+          </w:tcPr>
+          <w:p>
+            <w:r>
+              <w:rPr>
+                <w:b w:val="false"/>
+                <w:bCs w:val="false"/>
+                <w:sz w:val="19"/>
+                <w:szCs w:val="19"/>
+              </w:rPr>
+              <w:t xml:space="preserve">Nombre y H2 del área</w:t>
+            </w:r>
+          </w:p>
+        </w:tc>
+      </w:tr>
+      <w:tr>
+        <w:tc>
+          <w:tcPr>
+            <w:tcW w:type="dxa" w:w="2900"/>
+            <w:tcBorders>
+              <w:top w:val="single" w:color="D9DCE6" w:sz="4"/>
+              <w:left w:val="single" w:color="D9DCE6" w:sz="4"/>
+              <w:bottom w:val="single" w:color="D9DCE6" w:sz="4"/>
+              <w:right w:val="single" w:color="D9DCE6" w:sz="4"/>
+            </w:tcBorders>
+            <w:tcMar>
+              <w:top w:type="dxa" w:w="70"/>
+              <w:left w:type="dxa" w:w="110"/>
+              <w:bottom w:type="dxa" w:w="70"/>
+              <w:right w:type="dxa" w:w="110"/>
+            </w:tcMar>
+          </w:tcPr>
+          <w:p>
+            <w:r>
+              <w:rPr>
+                <w:b/>
+                <w:bCs/>
+                <w:sz w:val="19"/>
+                <w:szCs w:val="19"/>
+              </w:rPr>
+              <w:t xml:space="preserve">NaaS</w:t>
+            </w:r>
+          </w:p>
+        </w:tc>
+        <w:tc>
+          <w:tcPr>
+            <w:tcW w:type="dxa" w:w="1250"/>
+            <w:tcBorders>
+              <w:top w:val="single" w:color="D9DCE6" w:sz="4"/>
+              <w:left w:val="single" w:color="D9DCE6" w:sz="4"/>
+              <w:bottom w:val="single" w:color="D9DCE6" w:sz="4"/>
+              <w:right w:val="single" w:color="D9DCE6" w:sz="4"/>
+            </w:tcBorders>
+            <w:tcMar>
+              <w:top w:type="dxa" w:w="70"/>
+              <w:left w:type="dxa" w:w="110"/>
+              <w:bottom w:type="dxa" w:w="70"/>
+              <w:right w:type="dxa" w:w="110"/>
+            </w:tcMar>
+          </w:tcPr>
+          <w:p>
+            <w:r>
+              <w:rPr>
+                <w:b w:val="false"/>
+                <w:bCs w:val="false"/>
+                <w:sz w:val="19"/>
+                <w:szCs w:val="19"/>
+              </w:rPr>
+              <w:t xml:space="preserve">Principal</w:t>
+            </w:r>
+          </w:p>
+        </w:tc>
+        <w:tc>
+          <w:tcPr>
+            <w:tcW w:type="dxa" w:w="1300"/>
+            <w:tcBorders>
+              <w:top w:val="single" w:color="D9DCE6" w:sz="4"/>
+              <w:left w:val="single" w:color="D9DCE6" w:sz="4"/>
+              <w:bottom w:val="single" w:color="D9DCE6" w:sz="4"/>
+              <w:right w:val="single" w:color="D9DCE6" w:sz="4"/>
+            </w:tcBorders>
+            <w:tcMar>
+              <w:top w:type="dxa" w:w="70"/>
+              <w:left w:type="dxa" w:w="110"/>
+              <w:bottom w:type="dxa" w:w="70"/>
+              <w:right w:type="dxa" w:w="110"/>
+            </w:tcMar>
+          </w:tcPr>
+          <w:p>
+            <w:r>
+              <w:rPr>
+                <w:b w:val="false"/>
+                <w:bCs w:val="false"/>
+                <w:sz w:val="19"/>
+                <w:szCs w:val="19"/>
+              </w:rPr>
+              <w:t xml:space="preserve">Comercial</w:t>
+            </w:r>
+          </w:p>
+        </w:tc>
+        <w:tc>
+          <w:tcPr>
+            <w:tcW w:type="dxa" w:w="900"/>
+            <w:tcBorders>
+              <w:top w:val="single" w:color="D9DCE6" w:sz="4"/>
+              <w:left w:val="single" w:color="D9DCE6" w:sz="4"/>
+              <w:bottom w:val="single" w:color="D9DCE6" w:sz="4"/>
+              <w:right w:val="single" w:color="D9DCE6" w:sz="4"/>
+            </w:tcBorders>
+            <w:tcMar>
+              <w:top w:type="dxa" w:w="70"/>
+              <w:left w:type="dxa" w:w="110"/>
+              <w:bottom w:type="dxa" w:w="70"/>
+              <w:right w:type="dxa" w:w="110"/>
+            </w:tcMar>
+          </w:tcPr>
+          <w:p>
+            <w:r>
+              <w:rPr>
+                <w:b w:val="false"/>
+                <w:bCs w:val="false"/>
+                <w:sz w:val="19"/>
+                <w:szCs w:val="19"/>
+              </w:rPr>
+              <w:t xml:space="preserve">A</w:t>
+            </w:r>
+          </w:p>
+        </w:tc>
+        <w:tc>
+          <w:tcPr>
+            <w:tcW w:type="dxa" w:w="3010"/>
+            <w:tcBorders>
+              <w:top w:val="single" w:color="D9DCE6" w:sz="4"/>
+              <w:left w:val="single" w:color="D9DCE6" w:sz="4"/>
+              <w:bottom w:val="single" w:color="D9DCE6" w:sz="4"/>
+              <w:right w:val="single" w:color="D9DCE6" w:sz="4"/>
+            </w:tcBorders>
+            <w:tcMar>
+              <w:top w:type="dxa" w:w="70"/>
+              <w:left w:type="dxa" w:w="110"/>
+              <w:bottom w:type="dxa" w:w="70"/>
+              <w:right w:type="dxa" w:w="110"/>
+            </w:tcMar>
+          </w:tcPr>
+          <w:p>
+            <w:r>
+              <w:rPr>
+                <w:b w:val="false"/>
+                <w:bCs w:val="false"/>
+                <w:sz w:val="19"/>
+                <w:szCs w:val="19"/>
+              </w:rPr>
+              <w:t xml:space="preserve">Nombre y H2 del área</w:t>
+            </w:r>
+          </w:p>
+        </w:tc>
+      </w:tr>
+      <w:tr>
+        <w:tc>
+          <w:tcPr>
+            <w:tcW w:type="dxa" w:w="2900"/>
+            <w:tcBorders>
+              <w:top w:val="single" w:color="D9DCE6" w:sz="4"/>
+              <w:left w:val="single" w:color="D9DCE6" w:sz="4"/>
+              <w:bottom w:val="single" w:color="D9DCE6" w:sz="4"/>
+              <w:right w:val="single" w:color="D9DCE6" w:sz="4"/>
+            </w:tcBorders>
+            <w:tcMar>
+              <w:top w:type="dxa" w:w="70"/>
+              <w:left w:type="dxa" w:w="110"/>
+              <w:bottom w:type="dxa" w:w="70"/>
+              <w:right w:type="dxa" w:w="110"/>
+            </w:tcMar>
+          </w:tcPr>
+          <w:p>
+            <w:r>
+              <w:rPr>
+                <w:b/>
+                <w:bCs/>
+                <w:sz w:val="19"/>
+                <w:szCs w:val="19"/>
+              </w:rPr>
               <w:t xml:space="preserve">SD-WAN para empresas</w:t>
             </w:r>
           </w:p>
@@ -7551,7 +7807,7 @@
         <w:pStyle w:val="Heading2"/>
       </w:pPr>
       <w:r>
-        <w:t xml:space="preserve">2. SECaaS (Seguridad)</w:t>
+        <w:t xml:space="preserve">2. Ciberseguridad 360 (Seguridad)</w:t>
       </w:r>
     </w:p>
     <w:p>
@@ -7566,7 +7822,7 @@
         <w:t xml:space="preserve">Página: </w:t>
       </w:r>
       <w:r>
-        <w:t xml:space="preserve">soluciones.html#secaas</w:t>
+        <w:t xml:space="preserve">soluciones.html#ciberseguridad</w:t>
       </w:r>
       <w:r>
         <w:rPr>
@@ -7576,7 +7832,7 @@
         <w:t xml:space="preserve">   ·   Objetivo: </w:t>
       </w:r>
       <w:r>
-        <w:t xml:space="preserve">Ser referencia en seguridad como servicio administrada, del endpoint al firewall en la nube.</w:t>
+        <w:t xml:space="preserve">Ser referencia en ciberseguridad como servicio: SECaaS del endpoint a la nube, más control de acceso a la red y firewall perimetral, ofrecidos por separado.</w:t>
       </w:r>
     </w:p>
     <w:tbl>
@@ -7778,7 +8034,7 @@
                 <w:sz w:val="19"/>
                 <w:szCs w:val="19"/>
               </w:rPr>
-              <w:t xml:space="preserve">seguridad como servicio</w:t>
+              <w:t xml:space="preserve">Ciberseguridad 360</w:t>
             </w:r>
           </w:p>
         </w:tc>
@@ -7806,7 +8062,7 @@
                 <w:sz w:val="19"/>
                 <w:szCs w:val="19"/>
               </w:rPr>
-              <w:t xml:space="preserve">Principal</w:t>
+              <w:t xml:space="preserve">Marca</w:t>
             </w:r>
           </w:p>
         </w:tc>
@@ -7890,7 +8146,7 @@
                 <w:sz w:val="19"/>
                 <w:szCs w:val="19"/>
               </w:rPr>
-              <w:t xml:space="preserve">H2 del área y FAQ</w:t>
+              <w:t xml:space="preserve">Nombre y H2 del área</w:t>
             </w:r>
           </w:p>
         </w:tc>
@@ -7920,7 +8176,7 @@
                 <w:sz w:val="19"/>
                 <w:szCs w:val="19"/>
               </w:rPr>
-              <w:t xml:space="preserve">SECaaS</w:t>
+              <w:t xml:space="preserve">seguridad como servicio</w:t>
             </w:r>
           </w:p>
         </w:tc>
@@ -8032,7 +8288,7 @@
                 <w:sz w:val="19"/>
                 <w:szCs w:val="19"/>
               </w:rPr>
-              <w:t xml:space="preserve">H2 del área y paquetes</w:t>
+              <w:t xml:space="preserve">Intro del área</w:t>
             </w:r>
           </w:p>
         </w:tc>
@@ -8062,7 +8318,7 @@
                 <w:sz w:val="19"/>
                 <w:szCs w:val="19"/>
               </w:rPr>
-              <w:t xml:space="preserve">ciberseguridad administrada para empresas</w:t>
+              <w:t xml:space="preserve">SECaaS</w:t>
             </w:r>
           </w:p>
         </w:tc>
@@ -8090,7 +8346,7 @@
                 <w:sz w:val="19"/>
                 <w:szCs w:val="19"/>
               </w:rPr>
-              <w:t xml:space="preserve">Secundaria</w:t>
+              <w:t xml:space="preserve">Principal</w:t>
             </w:r>
           </w:p>
         </w:tc>
@@ -8174,7 +8430,7 @@
                 <w:sz w:val="19"/>
                 <w:szCs w:val="19"/>
               </w:rPr>
-              <w:t xml:space="preserve">Intro del área</w:t>
+              <w:t xml:space="preserve">Intro y paquetes</w:t>
             </w:r>
           </w:p>
         </w:tc>
@@ -8204,7 +8460,7 @@
                 <w:sz w:val="19"/>
                 <w:szCs w:val="19"/>
               </w:rPr>
-              <w:t xml:space="preserve">firewall en la nube</w:t>
+              <w:t xml:space="preserve">ciberseguridad administrada para empresas</w:t>
             </w:r>
           </w:p>
         </w:tc>
@@ -8316,7 +8572,7 @@
                 <w:sz w:val="19"/>
                 <w:szCs w:val="19"/>
               </w:rPr>
-              <w:t xml:space="preserve">H2 del área y SECaaS Advantage</w:t>
+              <w:t xml:space="preserve">SECaaS Essential (Ideal para)</w:t>
             </w:r>
           </w:p>
         </w:tc>
@@ -8346,7 +8602,7 @@
                 <w:sz w:val="19"/>
                 <w:szCs w:val="19"/>
               </w:rPr>
-              <w:t xml:space="preserve">Zero Trust</w:t>
+              <w:t xml:space="preserve">firewall en la nube</w:t>
             </w:r>
           </w:p>
         </w:tc>
@@ -8458,7 +8714,7 @@
                 <w:sz w:val="19"/>
                 <w:szCs w:val="19"/>
               </w:rPr>
-              <w:t xml:space="preserve">SECaaS Essential</w:t>
+              <w:t xml:space="preserve">SECaaS Advantage</w:t>
             </w:r>
           </w:p>
         </w:tc>
@@ -8488,7 +8744,7 @@
                 <w:sz w:val="19"/>
                 <w:szCs w:val="19"/>
               </w:rPr>
-              <w:t xml:space="preserve">Cisco Duo</w:t>
+              <w:t xml:space="preserve">Zero Trust</w:t>
             </w:r>
           </w:p>
         </w:tc>
@@ -8516,7 +8772,7 @@
                 <w:sz w:val="19"/>
                 <w:szCs w:val="19"/>
               </w:rPr>
-              <w:t xml:space="preserve">Producto</w:t>
+              <w:t xml:space="preserve">Secundaria</w:t>
             </w:r>
           </w:p>
         </w:tc>
@@ -8600,7 +8856,7 @@
                 <w:sz w:val="19"/>
                 <w:szCs w:val="19"/>
               </w:rPr>
-              <w:t xml:space="preserve">SECaaS Essential y Advantage</w:t>
+              <w:t xml:space="preserve">SECaaS Essential</w:t>
             </w:r>
           </w:p>
         </w:tc>
@@ -8630,7 +8886,7 @@
                 <w:sz w:val="19"/>
                 <w:szCs w:val="19"/>
               </w:rPr>
-              <w:t xml:space="preserve">Cisco Secure Access</w:t>
+              <w:t xml:space="preserve">Cisco Duo</w:t>
             </w:r>
           </w:p>
         </w:tc>
@@ -8772,7 +9028,7 @@
                 <w:sz w:val="19"/>
                 <w:szCs w:val="19"/>
               </w:rPr>
-              <w:t xml:space="preserve">outsourcing de ciberseguridad</w:t>
+              <w:t xml:space="preserve">Cisco Secure Access</w:t>
             </w:r>
           </w:p>
         </w:tc>
@@ -8800,7 +9056,7 @@
                 <w:sz w:val="19"/>
                 <w:szCs w:val="19"/>
               </w:rPr>
-              <w:t xml:space="preserve">Secundaria</w:t>
+              <w:t xml:space="preserve">Producto</w:t>
             </w:r>
           </w:p>
         </w:tc>
@@ -8856,7 +9112,7 @@
                 <w:sz w:val="19"/>
                 <w:szCs w:val="19"/>
               </w:rPr>
-              <w:t xml:space="preserve">B</w:t>
+              <w:t xml:space="preserve">A</w:t>
             </w:r>
           </w:p>
         </w:tc>
@@ -8884,7 +9140,7 @@
                 <w:sz w:val="19"/>
                 <w:szCs w:val="19"/>
               </w:rPr>
-              <w:t xml:space="preserve">Intro del área</w:t>
+              <w:t xml:space="preserve">SECaaS Essential y Advantage</w:t>
             </w:r>
           </w:p>
         </w:tc>
@@ -8914,7 +9170,7 @@
                 <w:sz w:val="19"/>
                 <w:szCs w:val="19"/>
               </w:rPr>
-              <w:t xml:space="preserve">Secure Web Gateway</w:t>
+              <w:t xml:space="preserve">outsourcing de ciberseguridad</w:t>
             </w:r>
           </w:p>
         </w:tc>
@@ -9026,7 +9282,7 @@
                 <w:sz w:val="19"/>
                 <w:szCs w:val="19"/>
               </w:rPr>
-              <w:t xml:space="preserve">SECaaS Essential</w:t>
+              <w:t xml:space="preserve">SECaaS Essential (Ideal para)</w:t>
             </w:r>
           </w:p>
         </w:tc>
@@ -9056,7 +9312,7 @@
                 <w:sz w:val="19"/>
                 <w:szCs w:val="19"/>
               </w:rPr>
-              <w:t xml:space="preserve">seguridad DNS</w:t>
+              <w:t xml:space="preserve">Secure Web Gateway</w:t>
             </w:r>
           </w:p>
         </w:tc>
@@ -9084,7 +9340,7 @@
                 <w:sz w:val="19"/>
                 <w:szCs w:val="19"/>
               </w:rPr>
-              <w:t xml:space="preserve">Long tail</w:t>
+              <w:t xml:space="preserve">Secundaria</w:t>
             </w:r>
           </w:p>
         </w:tc>
@@ -9198,7 +9454,7 @@
                 <w:sz w:val="19"/>
                 <w:szCs w:val="19"/>
               </w:rPr>
-              <w:t xml:space="preserve">Cisco Secure Endpoint</w:t>
+              <w:t xml:space="preserve">seguridad DNS</w:t>
             </w:r>
           </w:p>
         </w:tc>
@@ -9226,7 +9482,7 @@
                 <w:sz w:val="19"/>
                 <w:szCs w:val="19"/>
               </w:rPr>
-              <w:t xml:space="preserve">Producto</w:t>
+              <w:t xml:space="preserve">Long tail</w:t>
             </w:r>
           </w:p>
         </w:tc>
@@ -9310,7 +9566,7 @@
                 <w:sz w:val="19"/>
                 <w:szCs w:val="19"/>
               </w:rPr>
-              <w:t xml:space="preserve">SECaaS Advantage</w:t>
+              <w:t xml:space="preserve">SECaaS Essential</w:t>
             </w:r>
           </w:p>
         </w:tc>
@@ -9340,7 +9596,7 @@
                 <w:sz w:val="19"/>
                 <w:szCs w:val="19"/>
               </w:rPr>
-              <w:t xml:space="preserve">CASB</w:t>
+              <w:t xml:space="preserve">Cisco Secure Endpoint</w:t>
             </w:r>
           </w:p>
         </w:tc>
@@ -9368,7 +9624,7 @@
                 <w:sz w:val="19"/>
                 <w:szCs w:val="19"/>
               </w:rPr>
-              <w:t xml:space="preserve">Long tail</w:t>
+              <w:t xml:space="preserve">Producto</w:t>
             </w:r>
           </w:p>
         </w:tc>
@@ -9396,7 +9652,7 @@
                 <w:sz w:val="19"/>
                 <w:szCs w:val="19"/>
               </w:rPr>
-              <w:t xml:space="preserve">Informativa</w:t>
+              <w:t xml:space="preserve">Comercial</w:t>
             </w:r>
           </w:p>
         </w:tc>
@@ -9482,7 +9738,7 @@
                 <w:sz w:val="19"/>
                 <w:szCs w:val="19"/>
               </w:rPr>
-              <w:t xml:space="preserve">NOC/SOC 24/7</w:t>
+              <w:t xml:space="preserve">CASB</w:t>
             </w:r>
           </w:p>
         </w:tc>
@@ -9510,7 +9766,7 @@
                 <w:sz w:val="19"/>
                 <w:szCs w:val="19"/>
               </w:rPr>
-              <w:t xml:space="preserve">Secundaria</w:t>
+              <w:t xml:space="preserve">Long tail</w:t>
             </w:r>
           </w:p>
         </w:tc>
@@ -9538,7 +9794,7 @@
                 <w:sz w:val="19"/>
                 <w:szCs w:val="19"/>
               </w:rPr>
-              <w:t xml:space="preserve">Comercial</w:t>
+              <w:t xml:space="preserve">Informativa</w:t>
             </w:r>
           </w:p>
         </w:tc>
@@ -9594,7 +9850,7 @@
                 <w:sz w:val="19"/>
                 <w:szCs w:val="19"/>
               </w:rPr>
-              <w:t xml:space="preserve">SECaaS Essential</w:t>
+              <w:t xml:space="preserve">SECaaS Advantage</w:t>
             </w:r>
           </w:p>
         </w:tc>
@@ -9624,6 +9880,148 @@
                 <w:sz w:val="19"/>
                 <w:szCs w:val="19"/>
               </w:rPr>
+              <w:t xml:space="preserve">NOC/SOC 24/7</w:t>
+            </w:r>
+          </w:p>
+        </w:tc>
+        <w:tc>
+          <w:tcPr>
+            <w:tcW w:type="dxa" w:w="1250"/>
+            <w:tcBorders>
+              <w:top w:val="single" w:color="D9DCE6" w:sz="4"/>
+              <w:left w:val="single" w:color="D9DCE6" w:sz="4"/>
+              <w:bottom w:val="single" w:color="D9DCE6" w:sz="4"/>
+              <w:right w:val="single" w:color="D9DCE6" w:sz="4"/>
+            </w:tcBorders>
+            <w:tcMar>
+              <w:top w:type="dxa" w:w="70"/>
+              <w:left w:type="dxa" w:w="110"/>
+              <w:bottom w:type="dxa" w:w="70"/>
+              <w:right w:type="dxa" w:w="110"/>
+            </w:tcMar>
+          </w:tcPr>
+          <w:p>
+            <w:r>
+              <w:rPr>
+                <w:b w:val="false"/>
+                <w:bCs w:val="false"/>
+                <w:sz w:val="19"/>
+                <w:szCs w:val="19"/>
+              </w:rPr>
+              <w:t xml:space="preserve">Secundaria</w:t>
+            </w:r>
+          </w:p>
+        </w:tc>
+        <w:tc>
+          <w:tcPr>
+            <w:tcW w:type="dxa" w:w="1300"/>
+            <w:tcBorders>
+              <w:top w:val="single" w:color="D9DCE6" w:sz="4"/>
+              <w:left w:val="single" w:color="D9DCE6" w:sz="4"/>
+              <w:bottom w:val="single" w:color="D9DCE6" w:sz="4"/>
+              <w:right w:val="single" w:color="D9DCE6" w:sz="4"/>
+            </w:tcBorders>
+            <w:tcMar>
+              <w:top w:type="dxa" w:w="70"/>
+              <w:left w:type="dxa" w:w="110"/>
+              <w:bottom w:type="dxa" w:w="70"/>
+              <w:right w:type="dxa" w:w="110"/>
+            </w:tcMar>
+          </w:tcPr>
+          <w:p>
+            <w:r>
+              <w:rPr>
+                <w:b w:val="false"/>
+                <w:bCs w:val="false"/>
+                <w:sz w:val="19"/>
+                <w:szCs w:val="19"/>
+              </w:rPr>
+              <w:t xml:space="preserve">Comercial</w:t>
+            </w:r>
+          </w:p>
+        </w:tc>
+        <w:tc>
+          <w:tcPr>
+            <w:tcW w:type="dxa" w:w="900"/>
+            <w:tcBorders>
+              <w:top w:val="single" w:color="D9DCE6" w:sz="4"/>
+              <w:left w:val="single" w:color="D9DCE6" w:sz="4"/>
+              <w:bottom w:val="single" w:color="D9DCE6" w:sz="4"/>
+              <w:right w:val="single" w:color="D9DCE6" w:sz="4"/>
+            </w:tcBorders>
+            <w:tcMar>
+              <w:top w:type="dxa" w:w="70"/>
+              <w:left w:type="dxa" w:w="110"/>
+              <w:bottom w:type="dxa" w:w="70"/>
+              <w:right w:type="dxa" w:w="110"/>
+            </w:tcMar>
+          </w:tcPr>
+          <w:p>
+            <w:r>
+              <w:rPr>
+                <w:b w:val="false"/>
+                <w:bCs w:val="false"/>
+                <w:sz w:val="19"/>
+                <w:szCs w:val="19"/>
+              </w:rPr>
+              <w:t xml:space="preserve">B</w:t>
+            </w:r>
+          </w:p>
+        </w:tc>
+        <w:tc>
+          <w:tcPr>
+            <w:tcW w:type="dxa" w:w="3010"/>
+            <w:tcBorders>
+              <w:top w:val="single" w:color="D9DCE6" w:sz="4"/>
+              <w:left w:val="single" w:color="D9DCE6" w:sz="4"/>
+              <w:bottom w:val="single" w:color="D9DCE6" w:sz="4"/>
+              <w:right w:val="single" w:color="D9DCE6" w:sz="4"/>
+            </w:tcBorders>
+            <w:tcMar>
+              <w:top w:type="dxa" w:w="70"/>
+              <w:left w:type="dxa" w:w="110"/>
+              <w:bottom w:type="dxa" w:w="70"/>
+              <w:right w:type="dxa" w:w="110"/>
+            </w:tcMar>
+          </w:tcPr>
+          <w:p>
+            <w:r>
+              <w:rPr>
+                <w:b w:val="false"/>
+                <w:bCs w:val="false"/>
+                <w:sz w:val="19"/>
+                <w:szCs w:val="19"/>
+              </w:rPr>
+              <w:t xml:space="preserve">SECaaS Essential</w:t>
+            </w:r>
+          </w:p>
+        </w:tc>
+      </w:tr>
+      <w:tr>
+        <w:tc>
+          <w:tcPr>
+            <w:tcW w:type="dxa" w:w="2900"/>
+            <w:tcBorders>
+              <w:top w:val="single" w:color="D9DCE6" w:sz="4"/>
+              <w:left w:val="single" w:color="D9DCE6" w:sz="4"/>
+              <w:bottom w:val="single" w:color="D9DCE6" w:sz="4"/>
+              <w:right w:val="single" w:color="D9DCE6" w:sz="4"/>
+            </w:tcBorders>
+            <w:tcMar>
+              <w:top w:type="dxa" w:w="70"/>
+              <w:left w:type="dxa" w:w="110"/>
+              <w:bottom w:type="dxa" w:w="70"/>
+              <w:right w:type="dxa" w:w="110"/>
+            </w:tcMar>
+          </w:tcPr>
+          <w:p>
+            <w:r>
+              <w:rPr>
+                <w:b/>
+                <w:bCs/>
+                <w:sz w:val="19"/>
+                <w:szCs w:val="19"/>
+              </w:rPr>
               <w:t xml:space="preserve">alternativa a la VPN tradicional</w:t>
             </w:r>
           </w:p>
@@ -9737,6 +10135,1000 @@
                 <w:szCs w:val="19"/>
               </w:rPr>
               <w:t xml:space="preserve">FAQ de usuarios remotos</w:t>
+            </w:r>
+          </w:p>
+        </w:tc>
+      </w:tr>
+      <w:tr>
+        <w:tc>
+          <w:tcPr>
+            <w:tcW w:type="dxa" w:w="2900"/>
+            <w:tcBorders>
+              <w:top w:val="single" w:color="D9DCE6" w:sz="4"/>
+              <w:left w:val="single" w:color="D9DCE6" w:sz="4"/>
+              <w:bottom w:val="single" w:color="D9DCE6" w:sz="4"/>
+              <w:right w:val="single" w:color="D9DCE6" w:sz="4"/>
+            </w:tcBorders>
+            <w:tcMar>
+              <w:top w:type="dxa" w:w="70"/>
+              <w:left w:type="dxa" w:w="110"/>
+              <w:bottom w:type="dxa" w:w="70"/>
+              <w:right w:type="dxa" w:w="110"/>
+            </w:tcMar>
+          </w:tcPr>
+          <w:p>
+            <w:r>
+              <w:rPr>
+                <w:b/>
+                <w:bCs/>
+                <w:sz w:val="19"/>
+                <w:szCs w:val="19"/>
+              </w:rPr>
+              <w:t xml:space="preserve">control de acceso a la red (NAC)</w:t>
+            </w:r>
+          </w:p>
+        </w:tc>
+        <w:tc>
+          <w:tcPr>
+            <w:tcW w:type="dxa" w:w="1250"/>
+            <w:tcBorders>
+              <w:top w:val="single" w:color="D9DCE6" w:sz="4"/>
+              <w:left w:val="single" w:color="D9DCE6" w:sz="4"/>
+              <w:bottom w:val="single" w:color="D9DCE6" w:sz="4"/>
+              <w:right w:val="single" w:color="D9DCE6" w:sz="4"/>
+            </w:tcBorders>
+            <w:tcMar>
+              <w:top w:type="dxa" w:w="70"/>
+              <w:left w:type="dxa" w:w="110"/>
+              <w:bottom w:type="dxa" w:w="70"/>
+              <w:right w:type="dxa" w:w="110"/>
+            </w:tcMar>
+          </w:tcPr>
+          <w:p>
+            <w:r>
+              <w:rPr>
+                <w:b w:val="false"/>
+                <w:bCs w:val="false"/>
+                <w:sz w:val="19"/>
+                <w:szCs w:val="19"/>
+              </w:rPr>
+              <w:t xml:space="preserve">Principal</w:t>
+            </w:r>
+          </w:p>
+        </w:tc>
+        <w:tc>
+          <w:tcPr>
+            <w:tcW w:type="dxa" w:w="1300"/>
+            <w:tcBorders>
+              <w:top w:val="single" w:color="D9DCE6" w:sz="4"/>
+              <w:left w:val="single" w:color="D9DCE6" w:sz="4"/>
+              <w:bottom w:val="single" w:color="D9DCE6" w:sz="4"/>
+              <w:right w:val="single" w:color="D9DCE6" w:sz="4"/>
+            </w:tcBorders>
+            <w:tcMar>
+              <w:top w:type="dxa" w:w="70"/>
+              <w:left w:type="dxa" w:w="110"/>
+              <w:bottom w:type="dxa" w:w="70"/>
+              <w:right w:type="dxa" w:w="110"/>
+            </w:tcMar>
+          </w:tcPr>
+          <w:p>
+            <w:r>
+              <w:rPr>
+                <w:b w:val="false"/>
+                <w:bCs w:val="false"/>
+                <w:sz w:val="19"/>
+                <w:szCs w:val="19"/>
+              </w:rPr>
+              <w:t xml:space="preserve">Comercial</w:t>
+            </w:r>
+          </w:p>
+        </w:tc>
+        <w:tc>
+          <w:tcPr>
+            <w:tcW w:type="dxa" w:w="900"/>
+            <w:tcBorders>
+              <w:top w:val="single" w:color="D9DCE6" w:sz="4"/>
+              <w:left w:val="single" w:color="D9DCE6" w:sz="4"/>
+              <w:bottom w:val="single" w:color="D9DCE6" w:sz="4"/>
+              <w:right w:val="single" w:color="D9DCE6" w:sz="4"/>
+            </w:tcBorders>
+            <w:tcMar>
+              <w:top w:type="dxa" w:w="70"/>
+              <w:left w:type="dxa" w:w="110"/>
+              <w:bottom w:type="dxa" w:w="70"/>
+              <w:right w:type="dxa" w:w="110"/>
+            </w:tcMar>
+          </w:tcPr>
+          <w:p>
+            <w:r>
+              <w:rPr>
+                <w:b w:val="false"/>
+                <w:bCs w:val="false"/>
+                <w:sz w:val="19"/>
+                <w:szCs w:val="19"/>
+              </w:rPr>
+              <w:t xml:space="preserve">A</w:t>
+            </w:r>
+          </w:p>
+        </w:tc>
+        <w:tc>
+          <w:tcPr>
+            <w:tcW w:type="dxa" w:w="3010"/>
+            <w:tcBorders>
+              <w:top w:val="single" w:color="D9DCE6" w:sz="4"/>
+              <w:left w:val="single" w:color="D9DCE6" w:sz="4"/>
+              <w:bottom w:val="single" w:color="D9DCE6" w:sz="4"/>
+              <w:right w:val="single" w:color="D9DCE6" w:sz="4"/>
+            </w:tcBorders>
+            <w:tcMar>
+              <w:top w:type="dxa" w:w="70"/>
+              <w:left w:type="dxa" w:w="110"/>
+              <w:bottom w:type="dxa" w:w="70"/>
+              <w:right w:type="dxa" w:w="110"/>
+            </w:tcMar>
+          </w:tcPr>
+          <w:p>
+            <w:r>
+              <w:rPr>
+                <w:b w:val="false"/>
+                <w:bCs w:val="false"/>
+                <w:sz w:val="19"/>
+                <w:szCs w:val="19"/>
+              </w:rPr>
+              <w:t xml:space="preserve">Cisco ISE</w:t>
+            </w:r>
+          </w:p>
+        </w:tc>
+      </w:tr>
+      <w:tr>
+        <w:tc>
+          <w:tcPr>
+            <w:tcW w:type="dxa" w:w="2900"/>
+            <w:tcBorders>
+              <w:top w:val="single" w:color="D9DCE6" w:sz="4"/>
+              <w:left w:val="single" w:color="D9DCE6" w:sz="4"/>
+              <w:bottom w:val="single" w:color="D9DCE6" w:sz="4"/>
+              <w:right w:val="single" w:color="D9DCE6" w:sz="4"/>
+            </w:tcBorders>
+            <w:tcMar>
+              <w:top w:type="dxa" w:w="70"/>
+              <w:left w:type="dxa" w:w="110"/>
+              <w:bottom w:type="dxa" w:w="70"/>
+              <w:right w:type="dxa" w:w="110"/>
+            </w:tcMar>
+          </w:tcPr>
+          <w:p>
+            <w:r>
+              <w:rPr>
+                <w:b/>
+                <w:bCs/>
+                <w:sz w:val="19"/>
+                <w:szCs w:val="19"/>
+              </w:rPr>
+              <w:t xml:space="preserve">firewall perimetral</w:t>
+            </w:r>
+          </w:p>
+        </w:tc>
+        <w:tc>
+          <w:tcPr>
+            <w:tcW w:type="dxa" w:w="1250"/>
+            <w:tcBorders>
+              <w:top w:val="single" w:color="D9DCE6" w:sz="4"/>
+              <w:left w:val="single" w:color="D9DCE6" w:sz="4"/>
+              <w:bottom w:val="single" w:color="D9DCE6" w:sz="4"/>
+              <w:right w:val="single" w:color="D9DCE6" w:sz="4"/>
+            </w:tcBorders>
+            <w:tcMar>
+              <w:top w:type="dxa" w:w="70"/>
+              <w:left w:type="dxa" w:w="110"/>
+              <w:bottom w:type="dxa" w:w="70"/>
+              <w:right w:type="dxa" w:w="110"/>
+            </w:tcMar>
+          </w:tcPr>
+          <w:p>
+            <w:r>
+              <w:rPr>
+                <w:b w:val="false"/>
+                <w:bCs w:val="false"/>
+                <w:sz w:val="19"/>
+                <w:szCs w:val="19"/>
+              </w:rPr>
+              <w:t xml:space="preserve">Principal</w:t>
+            </w:r>
+          </w:p>
+        </w:tc>
+        <w:tc>
+          <w:tcPr>
+            <w:tcW w:type="dxa" w:w="1300"/>
+            <w:tcBorders>
+              <w:top w:val="single" w:color="D9DCE6" w:sz="4"/>
+              <w:left w:val="single" w:color="D9DCE6" w:sz="4"/>
+              <w:bottom w:val="single" w:color="D9DCE6" w:sz="4"/>
+              <w:right w:val="single" w:color="D9DCE6" w:sz="4"/>
+            </w:tcBorders>
+            <w:tcMar>
+              <w:top w:type="dxa" w:w="70"/>
+              <w:left w:type="dxa" w:w="110"/>
+              <w:bottom w:type="dxa" w:w="70"/>
+              <w:right w:type="dxa" w:w="110"/>
+            </w:tcMar>
+          </w:tcPr>
+          <w:p>
+            <w:r>
+              <w:rPr>
+                <w:b w:val="false"/>
+                <w:bCs w:val="false"/>
+                <w:sz w:val="19"/>
+                <w:szCs w:val="19"/>
+              </w:rPr>
+              <w:t xml:space="preserve">Comercial</w:t>
+            </w:r>
+          </w:p>
+        </w:tc>
+        <w:tc>
+          <w:tcPr>
+            <w:tcW w:type="dxa" w:w="900"/>
+            <w:tcBorders>
+              <w:top w:val="single" w:color="D9DCE6" w:sz="4"/>
+              <w:left w:val="single" w:color="D9DCE6" w:sz="4"/>
+              <w:bottom w:val="single" w:color="D9DCE6" w:sz="4"/>
+              <w:right w:val="single" w:color="D9DCE6" w:sz="4"/>
+            </w:tcBorders>
+            <w:tcMar>
+              <w:top w:type="dxa" w:w="70"/>
+              <w:left w:type="dxa" w:w="110"/>
+              <w:bottom w:type="dxa" w:w="70"/>
+              <w:right w:type="dxa" w:w="110"/>
+            </w:tcMar>
+          </w:tcPr>
+          <w:p>
+            <w:r>
+              <w:rPr>
+                <w:b w:val="false"/>
+                <w:bCs w:val="false"/>
+                <w:sz w:val="19"/>
+                <w:szCs w:val="19"/>
+              </w:rPr>
+              <w:t xml:space="preserve">A</w:t>
+            </w:r>
+          </w:p>
+        </w:tc>
+        <w:tc>
+          <w:tcPr>
+            <w:tcW w:type="dxa" w:w="3010"/>
+            <w:tcBorders>
+              <w:top w:val="single" w:color="D9DCE6" w:sz="4"/>
+              <w:left w:val="single" w:color="D9DCE6" w:sz="4"/>
+              <w:bottom w:val="single" w:color="D9DCE6" w:sz="4"/>
+              <w:right w:val="single" w:color="D9DCE6" w:sz="4"/>
+            </w:tcBorders>
+            <w:tcMar>
+              <w:top w:type="dxa" w:w="70"/>
+              <w:left w:type="dxa" w:w="110"/>
+              <w:bottom w:type="dxa" w:w="70"/>
+              <w:right w:type="dxa" w:w="110"/>
+            </w:tcMar>
+          </w:tcPr>
+          <w:p>
+            <w:r>
+              <w:rPr>
+                <w:b w:val="false"/>
+                <w:bCs w:val="false"/>
+                <w:sz w:val="19"/>
+                <w:szCs w:val="19"/>
+              </w:rPr>
+              <w:t xml:space="preserve">Intro y Cisco Secure Firewall</w:t>
+            </w:r>
+          </w:p>
+        </w:tc>
+      </w:tr>
+      <w:tr>
+        <w:tc>
+          <w:tcPr>
+            <w:tcW w:type="dxa" w:w="2900"/>
+            <w:tcBorders>
+              <w:top w:val="single" w:color="D9DCE6" w:sz="4"/>
+              <w:left w:val="single" w:color="D9DCE6" w:sz="4"/>
+              <w:bottom w:val="single" w:color="D9DCE6" w:sz="4"/>
+              <w:right w:val="single" w:color="D9DCE6" w:sz="4"/>
+            </w:tcBorders>
+            <w:tcMar>
+              <w:top w:type="dxa" w:w="70"/>
+              <w:left w:type="dxa" w:w="110"/>
+              <w:bottom w:type="dxa" w:w="70"/>
+              <w:right w:type="dxa" w:w="110"/>
+            </w:tcMar>
+          </w:tcPr>
+          <w:p>
+            <w:r>
+              <w:rPr>
+                <w:b/>
+                <w:bCs/>
+                <w:sz w:val="19"/>
+                <w:szCs w:val="19"/>
+              </w:rPr>
+              <w:t xml:space="preserve">Cisco ISE</w:t>
+            </w:r>
+          </w:p>
+        </w:tc>
+        <w:tc>
+          <w:tcPr>
+            <w:tcW w:type="dxa" w:w="1250"/>
+            <w:tcBorders>
+              <w:top w:val="single" w:color="D9DCE6" w:sz="4"/>
+              <w:left w:val="single" w:color="D9DCE6" w:sz="4"/>
+              <w:bottom w:val="single" w:color="D9DCE6" w:sz="4"/>
+              <w:right w:val="single" w:color="D9DCE6" w:sz="4"/>
+            </w:tcBorders>
+            <w:tcMar>
+              <w:top w:type="dxa" w:w="70"/>
+              <w:left w:type="dxa" w:w="110"/>
+              <w:bottom w:type="dxa" w:w="70"/>
+              <w:right w:type="dxa" w:w="110"/>
+            </w:tcMar>
+          </w:tcPr>
+          <w:p>
+            <w:r>
+              <w:rPr>
+                <w:b w:val="false"/>
+                <w:bCs w:val="false"/>
+                <w:sz w:val="19"/>
+                <w:szCs w:val="19"/>
+              </w:rPr>
+              <w:t xml:space="preserve">Producto</w:t>
+            </w:r>
+          </w:p>
+        </w:tc>
+        <w:tc>
+          <w:tcPr>
+            <w:tcW w:type="dxa" w:w="1300"/>
+            <w:tcBorders>
+              <w:top w:val="single" w:color="D9DCE6" w:sz="4"/>
+              <w:left w:val="single" w:color="D9DCE6" w:sz="4"/>
+              <w:bottom w:val="single" w:color="D9DCE6" w:sz="4"/>
+              <w:right w:val="single" w:color="D9DCE6" w:sz="4"/>
+            </w:tcBorders>
+            <w:tcMar>
+              <w:top w:type="dxa" w:w="70"/>
+              <w:left w:type="dxa" w:w="110"/>
+              <w:bottom w:type="dxa" w:w="70"/>
+              <w:right w:type="dxa" w:w="110"/>
+            </w:tcMar>
+          </w:tcPr>
+          <w:p>
+            <w:r>
+              <w:rPr>
+                <w:b w:val="false"/>
+                <w:bCs w:val="false"/>
+                <w:sz w:val="19"/>
+                <w:szCs w:val="19"/>
+              </w:rPr>
+              <w:t xml:space="preserve">Comercial</w:t>
+            </w:r>
+          </w:p>
+        </w:tc>
+        <w:tc>
+          <w:tcPr>
+            <w:tcW w:type="dxa" w:w="900"/>
+            <w:tcBorders>
+              <w:top w:val="single" w:color="D9DCE6" w:sz="4"/>
+              <w:left w:val="single" w:color="D9DCE6" w:sz="4"/>
+              <w:bottom w:val="single" w:color="D9DCE6" w:sz="4"/>
+              <w:right w:val="single" w:color="D9DCE6" w:sz="4"/>
+            </w:tcBorders>
+            <w:tcMar>
+              <w:top w:type="dxa" w:w="70"/>
+              <w:left w:type="dxa" w:w="110"/>
+              <w:bottom w:type="dxa" w:w="70"/>
+              <w:right w:type="dxa" w:w="110"/>
+            </w:tcMar>
+          </w:tcPr>
+          <w:p>
+            <w:r>
+              <w:rPr>
+                <w:b w:val="false"/>
+                <w:bCs w:val="false"/>
+                <w:sz w:val="19"/>
+                <w:szCs w:val="19"/>
+              </w:rPr>
+              <w:t xml:space="preserve">A</w:t>
+            </w:r>
+          </w:p>
+        </w:tc>
+        <w:tc>
+          <w:tcPr>
+            <w:tcW w:type="dxa" w:w="3010"/>
+            <w:tcBorders>
+              <w:top w:val="single" w:color="D9DCE6" w:sz="4"/>
+              <w:left w:val="single" w:color="D9DCE6" w:sz="4"/>
+              <w:bottom w:val="single" w:color="D9DCE6" w:sz="4"/>
+              <w:right w:val="single" w:color="D9DCE6" w:sz="4"/>
+            </w:tcBorders>
+            <w:tcMar>
+              <w:top w:type="dxa" w:w="70"/>
+              <w:left w:type="dxa" w:w="110"/>
+              <w:bottom w:type="dxa" w:w="70"/>
+              <w:right w:type="dxa" w:w="110"/>
+            </w:tcMar>
+          </w:tcPr>
+          <w:p>
+            <w:r>
+              <w:rPr>
+                <w:b w:val="false"/>
+                <w:bCs w:val="false"/>
+                <w:sz w:val="19"/>
+                <w:szCs w:val="19"/>
+              </w:rPr>
+              <w:t xml:space="preserve">Cisco ISE</w:t>
+            </w:r>
+          </w:p>
+        </w:tc>
+      </w:tr>
+      <w:tr>
+        <w:tc>
+          <w:tcPr>
+            <w:tcW w:type="dxa" w:w="2900"/>
+            <w:tcBorders>
+              <w:top w:val="single" w:color="D9DCE6" w:sz="4"/>
+              <w:left w:val="single" w:color="D9DCE6" w:sz="4"/>
+              <w:bottom w:val="single" w:color="D9DCE6" w:sz="4"/>
+              <w:right w:val="single" w:color="D9DCE6" w:sz="4"/>
+            </w:tcBorders>
+            <w:tcMar>
+              <w:top w:type="dxa" w:w="70"/>
+              <w:left w:type="dxa" w:w="110"/>
+              <w:bottom w:type="dxa" w:w="70"/>
+              <w:right w:type="dxa" w:w="110"/>
+            </w:tcMar>
+          </w:tcPr>
+          <w:p>
+            <w:r>
+              <w:rPr>
+                <w:b/>
+                <w:bCs/>
+                <w:sz w:val="19"/>
+                <w:szCs w:val="19"/>
+              </w:rPr>
+              <w:t xml:space="preserve">Cisco Secure Firewall</w:t>
+            </w:r>
+          </w:p>
+        </w:tc>
+        <w:tc>
+          <w:tcPr>
+            <w:tcW w:type="dxa" w:w="1250"/>
+            <w:tcBorders>
+              <w:top w:val="single" w:color="D9DCE6" w:sz="4"/>
+              <w:left w:val="single" w:color="D9DCE6" w:sz="4"/>
+              <w:bottom w:val="single" w:color="D9DCE6" w:sz="4"/>
+              <w:right w:val="single" w:color="D9DCE6" w:sz="4"/>
+            </w:tcBorders>
+            <w:tcMar>
+              <w:top w:type="dxa" w:w="70"/>
+              <w:left w:type="dxa" w:w="110"/>
+              <w:bottom w:type="dxa" w:w="70"/>
+              <w:right w:type="dxa" w:w="110"/>
+            </w:tcMar>
+          </w:tcPr>
+          <w:p>
+            <w:r>
+              <w:rPr>
+                <w:b w:val="false"/>
+                <w:bCs w:val="false"/>
+                <w:sz w:val="19"/>
+                <w:szCs w:val="19"/>
+              </w:rPr>
+              <w:t xml:space="preserve">Producto</w:t>
+            </w:r>
+          </w:p>
+        </w:tc>
+        <w:tc>
+          <w:tcPr>
+            <w:tcW w:type="dxa" w:w="1300"/>
+            <w:tcBorders>
+              <w:top w:val="single" w:color="D9DCE6" w:sz="4"/>
+              <w:left w:val="single" w:color="D9DCE6" w:sz="4"/>
+              <w:bottom w:val="single" w:color="D9DCE6" w:sz="4"/>
+              <w:right w:val="single" w:color="D9DCE6" w:sz="4"/>
+            </w:tcBorders>
+            <w:tcMar>
+              <w:top w:type="dxa" w:w="70"/>
+              <w:left w:type="dxa" w:w="110"/>
+              <w:bottom w:type="dxa" w:w="70"/>
+              <w:right w:type="dxa" w:w="110"/>
+            </w:tcMar>
+          </w:tcPr>
+          <w:p>
+            <w:r>
+              <w:rPr>
+                <w:b w:val="false"/>
+                <w:bCs w:val="false"/>
+                <w:sz w:val="19"/>
+                <w:szCs w:val="19"/>
+              </w:rPr>
+              <w:t xml:space="preserve">Comercial</w:t>
+            </w:r>
+          </w:p>
+        </w:tc>
+        <w:tc>
+          <w:tcPr>
+            <w:tcW w:type="dxa" w:w="900"/>
+            <w:tcBorders>
+              <w:top w:val="single" w:color="D9DCE6" w:sz="4"/>
+              <w:left w:val="single" w:color="D9DCE6" w:sz="4"/>
+              <w:bottom w:val="single" w:color="D9DCE6" w:sz="4"/>
+              <w:right w:val="single" w:color="D9DCE6" w:sz="4"/>
+            </w:tcBorders>
+            <w:tcMar>
+              <w:top w:type="dxa" w:w="70"/>
+              <w:left w:type="dxa" w:w="110"/>
+              <w:bottom w:type="dxa" w:w="70"/>
+              <w:right w:type="dxa" w:w="110"/>
+            </w:tcMar>
+          </w:tcPr>
+          <w:p>
+            <w:r>
+              <w:rPr>
+                <w:b w:val="false"/>
+                <w:bCs w:val="false"/>
+                <w:sz w:val="19"/>
+                <w:szCs w:val="19"/>
+              </w:rPr>
+              <w:t xml:space="preserve">A</w:t>
+            </w:r>
+          </w:p>
+        </w:tc>
+        <w:tc>
+          <w:tcPr>
+            <w:tcW w:type="dxa" w:w="3010"/>
+            <w:tcBorders>
+              <w:top w:val="single" w:color="D9DCE6" w:sz="4"/>
+              <w:left w:val="single" w:color="D9DCE6" w:sz="4"/>
+              <w:bottom w:val="single" w:color="D9DCE6" w:sz="4"/>
+              <w:right w:val="single" w:color="D9DCE6" w:sz="4"/>
+            </w:tcBorders>
+            <w:tcMar>
+              <w:top w:type="dxa" w:w="70"/>
+              <w:left w:type="dxa" w:w="110"/>
+              <w:bottom w:type="dxa" w:w="70"/>
+              <w:right w:type="dxa" w:w="110"/>
+            </w:tcMar>
+          </w:tcPr>
+          <w:p>
+            <w:r>
+              <w:rPr>
+                <w:b w:val="false"/>
+                <w:bCs w:val="false"/>
+                <w:sz w:val="19"/>
+                <w:szCs w:val="19"/>
+              </w:rPr>
+              <w:t xml:space="preserve">Cisco Secure Firewall</w:t>
+            </w:r>
+          </w:p>
+        </w:tc>
+      </w:tr>
+      <w:tr>
+        <w:tc>
+          <w:tcPr>
+            <w:tcW w:type="dxa" w:w="2900"/>
+            <w:tcBorders>
+              <w:top w:val="single" w:color="D9DCE6" w:sz="4"/>
+              <w:left w:val="single" w:color="D9DCE6" w:sz="4"/>
+              <w:bottom w:val="single" w:color="D9DCE6" w:sz="4"/>
+              <w:right w:val="single" w:color="D9DCE6" w:sz="4"/>
+            </w:tcBorders>
+            <w:tcMar>
+              <w:top w:type="dxa" w:w="70"/>
+              <w:left w:type="dxa" w:w="110"/>
+              <w:bottom w:type="dxa" w:w="70"/>
+              <w:right w:type="dxa" w:w="110"/>
+            </w:tcMar>
+          </w:tcPr>
+          <w:p>
+            <w:r>
+              <w:rPr>
+                <w:b/>
+                <w:bCs/>
+                <w:sz w:val="19"/>
+                <w:szCs w:val="19"/>
+              </w:rPr>
+              <w:t xml:space="preserve">segmentación de la red</w:t>
+            </w:r>
+          </w:p>
+        </w:tc>
+        <w:tc>
+          <w:tcPr>
+            <w:tcW w:type="dxa" w:w="1250"/>
+            <w:tcBorders>
+              <w:top w:val="single" w:color="D9DCE6" w:sz="4"/>
+              <w:left w:val="single" w:color="D9DCE6" w:sz="4"/>
+              <w:bottom w:val="single" w:color="D9DCE6" w:sz="4"/>
+              <w:right w:val="single" w:color="D9DCE6" w:sz="4"/>
+            </w:tcBorders>
+            <w:tcMar>
+              <w:top w:type="dxa" w:w="70"/>
+              <w:left w:type="dxa" w:w="110"/>
+              <w:bottom w:type="dxa" w:w="70"/>
+              <w:right w:type="dxa" w:w="110"/>
+            </w:tcMar>
+          </w:tcPr>
+          <w:p>
+            <w:r>
+              <w:rPr>
+                <w:b w:val="false"/>
+                <w:bCs w:val="false"/>
+                <w:sz w:val="19"/>
+                <w:szCs w:val="19"/>
+              </w:rPr>
+              <w:t xml:space="preserve">Long tail</w:t>
+            </w:r>
+          </w:p>
+        </w:tc>
+        <w:tc>
+          <w:tcPr>
+            <w:tcW w:type="dxa" w:w="1300"/>
+            <w:tcBorders>
+              <w:top w:val="single" w:color="D9DCE6" w:sz="4"/>
+              <w:left w:val="single" w:color="D9DCE6" w:sz="4"/>
+              <w:bottom w:val="single" w:color="D9DCE6" w:sz="4"/>
+              <w:right w:val="single" w:color="D9DCE6" w:sz="4"/>
+            </w:tcBorders>
+            <w:tcMar>
+              <w:top w:type="dxa" w:w="70"/>
+              <w:left w:type="dxa" w:w="110"/>
+              <w:bottom w:type="dxa" w:w="70"/>
+              <w:right w:type="dxa" w:w="110"/>
+            </w:tcMar>
+          </w:tcPr>
+          <w:p>
+            <w:r>
+              <w:rPr>
+                <w:b w:val="false"/>
+                <w:bCs w:val="false"/>
+                <w:sz w:val="19"/>
+                <w:szCs w:val="19"/>
+              </w:rPr>
+              <w:t xml:space="preserve">Informativa</w:t>
+            </w:r>
+          </w:p>
+        </w:tc>
+        <w:tc>
+          <w:tcPr>
+            <w:tcW w:type="dxa" w:w="900"/>
+            <w:tcBorders>
+              <w:top w:val="single" w:color="D9DCE6" w:sz="4"/>
+              <w:left w:val="single" w:color="D9DCE6" w:sz="4"/>
+              <w:bottom w:val="single" w:color="D9DCE6" w:sz="4"/>
+              <w:right w:val="single" w:color="D9DCE6" w:sz="4"/>
+            </w:tcBorders>
+            <w:tcMar>
+              <w:top w:type="dxa" w:w="70"/>
+              <w:left w:type="dxa" w:w="110"/>
+              <w:bottom w:type="dxa" w:w="70"/>
+              <w:right w:type="dxa" w:w="110"/>
+            </w:tcMar>
+          </w:tcPr>
+          <w:p>
+            <w:r>
+              <w:rPr>
+                <w:b w:val="false"/>
+                <w:bCs w:val="false"/>
+                <w:sz w:val="19"/>
+                <w:szCs w:val="19"/>
+              </w:rPr>
+              <w:t xml:space="preserve">B</w:t>
+            </w:r>
+          </w:p>
+        </w:tc>
+        <w:tc>
+          <w:tcPr>
+            <w:tcW w:type="dxa" w:w="3010"/>
+            <w:tcBorders>
+              <w:top w:val="single" w:color="D9DCE6" w:sz="4"/>
+              <w:left w:val="single" w:color="D9DCE6" w:sz="4"/>
+              <w:bottom w:val="single" w:color="D9DCE6" w:sz="4"/>
+              <w:right w:val="single" w:color="D9DCE6" w:sz="4"/>
+            </w:tcBorders>
+            <w:tcMar>
+              <w:top w:type="dxa" w:w="70"/>
+              <w:left w:type="dxa" w:w="110"/>
+              <w:bottom w:type="dxa" w:w="70"/>
+              <w:right w:type="dxa" w:w="110"/>
+            </w:tcMar>
+          </w:tcPr>
+          <w:p>
+            <w:r>
+              <w:rPr>
+                <w:b w:val="false"/>
+                <w:bCs w:val="false"/>
+                <w:sz w:val="19"/>
+                <w:szCs w:val="19"/>
+              </w:rPr>
+              <w:t xml:space="preserve">Cisco ISE</w:t>
+            </w:r>
+          </w:p>
+        </w:tc>
+      </w:tr>
+      <w:tr>
+        <w:tc>
+          <w:tcPr>
+            <w:tcW w:type="dxa" w:w="2900"/>
+            <w:tcBorders>
+              <w:top w:val="single" w:color="D9DCE6" w:sz="4"/>
+              <w:left w:val="single" w:color="D9DCE6" w:sz="4"/>
+              <w:bottom w:val="single" w:color="D9DCE6" w:sz="4"/>
+              <w:right w:val="single" w:color="D9DCE6" w:sz="4"/>
+            </w:tcBorders>
+            <w:tcMar>
+              <w:top w:type="dxa" w:w="70"/>
+              <w:left w:type="dxa" w:w="110"/>
+              <w:bottom w:type="dxa" w:w="70"/>
+              <w:right w:type="dxa" w:w="110"/>
+            </w:tcMar>
+          </w:tcPr>
+          <w:p>
+            <w:r>
+              <w:rPr>
+                <w:b/>
+                <w:bCs/>
+                <w:sz w:val="19"/>
+                <w:szCs w:val="19"/>
+              </w:rPr>
+              <w:t xml:space="preserve">integración con Intune</w:t>
+            </w:r>
+          </w:p>
+        </w:tc>
+        <w:tc>
+          <w:tcPr>
+            <w:tcW w:type="dxa" w:w="1250"/>
+            <w:tcBorders>
+              <w:top w:val="single" w:color="D9DCE6" w:sz="4"/>
+              <w:left w:val="single" w:color="D9DCE6" w:sz="4"/>
+              <w:bottom w:val="single" w:color="D9DCE6" w:sz="4"/>
+              <w:right w:val="single" w:color="D9DCE6" w:sz="4"/>
+            </w:tcBorders>
+            <w:tcMar>
+              <w:top w:type="dxa" w:w="70"/>
+              <w:left w:type="dxa" w:w="110"/>
+              <w:bottom w:type="dxa" w:w="70"/>
+              <w:right w:type="dxa" w:w="110"/>
+            </w:tcMar>
+          </w:tcPr>
+          <w:p>
+            <w:r>
+              <w:rPr>
+                <w:b w:val="false"/>
+                <w:bCs w:val="false"/>
+                <w:sz w:val="19"/>
+                <w:szCs w:val="19"/>
+              </w:rPr>
+              <w:t xml:space="preserve">Long tail</w:t>
+            </w:r>
+          </w:p>
+        </w:tc>
+        <w:tc>
+          <w:tcPr>
+            <w:tcW w:type="dxa" w:w="1300"/>
+            <w:tcBorders>
+              <w:top w:val="single" w:color="D9DCE6" w:sz="4"/>
+              <w:left w:val="single" w:color="D9DCE6" w:sz="4"/>
+              <w:bottom w:val="single" w:color="D9DCE6" w:sz="4"/>
+              <w:right w:val="single" w:color="D9DCE6" w:sz="4"/>
+            </w:tcBorders>
+            <w:tcMar>
+              <w:top w:type="dxa" w:w="70"/>
+              <w:left w:type="dxa" w:w="110"/>
+              <w:bottom w:type="dxa" w:w="70"/>
+              <w:right w:type="dxa" w:w="110"/>
+            </w:tcMar>
+          </w:tcPr>
+          <w:p>
+            <w:r>
+              <w:rPr>
+                <w:b w:val="false"/>
+                <w:bCs w:val="false"/>
+                <w:sz w:val="19"/>
+                <w:szCs w:val="19"/>
+              </w:rPr>
+              <w:t xml:space="preserve">Informativa</w:t>
+            </w:r>
+          </w:p>
+        </w:tc>
+        <w:tc>
+          <w:tcPr>
+            <w:tcW w:type="dxa" w:w="900"/>
+            <w:tcBorders>
+              <w:top w:val="single" w:color="D9DCE6" w:sz="4"/>
+              <w:left w:val="single" w:color="D9DCE6" w:sz="4"/>
+              <w:bottom w:val="single" w:color="D9DCE6" w:sz="4"/>
+              <w:right w:val="single" w:color="D9DCE6" w:sz="4"/>
+            </w:tcBorders>
+            <w:tcMar>
+              <w:top w:type="dxa" w:w="70"/>
+              <w:left w:type="dxa" w:w="110"/>
+              <w:bottom w:type="dxa" w:w="70"/>
+              <w:right w:type="dxa" w:w="110"/>
+            </w:tcMar>
+          </w:tcPr>
+          <w:p>
+            <w:r>
+              <w:rPr>
+                <w:b w:val="false"/>
+                <w:bCs w:val="false"/>
+                <w:sz w:val="19"/>
+                <w:szCs w:val="19"/>
+              </w:rPr>
+              <w:t xml:space="preserve">B</w:t>
+            </w:r>
+          </w:p>
+        </w:tc>
+        <w:tc>
+          <w:tcPr>
+            <w:tcW w:type="dxa" w:w="3010"/>
+            <w:tcBorders>
+              <w:top w:val="single" w:color="D9DCE6" w:sz="4"/>
+              <w:left w:val="single" w:color="D9DCE6" w:sz="4"/>
+              <w:bottom w:val="single" w:color="D9DCE6" w:sz="4"/>
+              <w:right w:val="single" w:color="D9DCE6" w:sz="4"/>
+            </w:tcBorders>
+            <w:tcMar>
+              <w:top w:type="dxa" w:w="70"/>
+              <w:left w:type="dxa" w:w="110"/>
+              <w:bottom w:type="dxa" w:w="70"/>
+              <w:right w:type="dxa" w:w="110"/>
+            </w:tcMar>
+          </w:tcPr>
+          <w:p>
+            <w:r>
+              <w:rPr>
+                <w:b w:val="false"/>
+                <w:bCs w:val="false"/>
+                <w:sz w:val="19"/>
+                <w:szCs w:val="19"/>
+              </w:rPr>
+              <w:t xml:space="preserve">Cisco ISE</w:t>
+            </w:r>
+          </w:p>
+        </w:tc>
+      </w:tr>
+      <w:tr>
+        <w:tc>
+          <w:tcPr>
+            <w:tcW w:type="dxa" w:w="2900"/>
+            <w:tcBorders>
+              <w:top w:val="single" w:color="D9DCE6" w:sz="4"/>
+              <w:left w:val="single" w:color="D9DCE6" w:sz="4"/>
+              <w:bottom w:val="single" w:color="D9DCE6" w:sz="4"/>
+              <w:right w:val="single" w:color="D9DCE6" w:sz="4"/>
+            </w:tcBorders>
+            <w:tcMar>
+              <w:top w:type="dxa" w:w="70"/>
+              <w:left w:type="dxa" w:w="110"/>
+              <w:bottom w:type="dxa" w:w="70"/>
+              <w:right w:type="dxa" w:w="110"/>
+            </w:tcMar>
+          </w:tcPr>
+          <w:p>
+            <w:r>
+              <w:rPr>
+                <w:b/>
+                <w:bCs/>
+                <w:sz w:val="19"/>
+                <w:szCs w:val="19"/>
+              </w:rPr>
+              <w:t xml:space="preserve">Microsoft Sentinel</w:t>
+            </w:r>
+          </w:p>
+        </w:tc>
+        <w:tc>
+          <w:tcPr>
+            <w:tcW w:type="dxa" w:w="1250"/>
+            <w:tcBorders>
+              <w:top w:val="single" w:color="D9DCE6" w:sz="4"/>
+              <w:left w:val="single" w:color="D9DCE6" w:sz="4"/>
+              <w:bottom w:val="single" w:color="D9DCE6" w:sz="4"/>
+              <w:right w:val="single" w:color="D9DCE6" w:sz="4"/>
+            </w:tcBorders>
+            <w:tcMar>
+              <w:top w:type="dxa" w:w="70"/>
+              <w:left w:type="dxa" w:w="110"/>
+              <w:bottom w:type="dxa" w:w="70"/>
+              <w:right w:type="dxa" w:w="110"/>
+            </w:tcMar>
+          </w:tcPr>
+          <w:p>
+            <w:r>
+              <w:rPr>
+                <w:b w:val="false"/>
+                <w:bCs w:val="false"/>
+                <w:sz w:val="19"/>
+                <w:szCs w:val="19"/>
+              </w:rPr>
+              <w:t xml:space="preserve">Long tail</w:t>
+            </w:r>
+          </w:p>
+        </w:tc>
+        <w:tc>
+          <w:tcPr>
+            <w:tcW w:type="dxa" w:w="1300"/>
+            <w:tcBorders>
+              <w:top w:val="single" w:color="D9DCE6" w:sz="4"/>
+              <w:left w:val="single" w:color="D9DCE6" w:sz="4"/>
+              <w:bottom w:val="single" w:color="D9DCE6" w:sz="4"/>
+              <w:right w:val="single" w:color="D9DCE6" w:sz="4"/>
+            </w:tcBorders>
+            <w:tcMar>
+              <w:top w:type="dxa" w:w="70"/>
+              <w:left w:type="dxa" w:w="110"/>
+              <w:bottom w:type="dxa" w:w="70"/>
+              <w:right w:type="dxa" w:w="110"/>
+            </w:tcMar>
+          </w:tcPr>
+          <w:p>
+            <w:r>
+              <w:rPr>
+                <w:b w:val="false"/>
+                <w:bCs w:val="false"/>
+                <w:sz w:val="19"/>
+                <w:szCs w:val="19"/>
+              </w:rPr>
+              <w:t xml:space="preserve">Informativa</w:t>
+            </w:r>
+          </w:p>
+        </w:tc>
+        <w:tc>
+          <w:tcPr>
+            <w:tcW w:type="dxa" w:w="900"/>
+            <w:tcBorders>
+              <w:top w:val="single" w:color="D9DCE6" w:sz="4"/>
+              <w:left w:val="single" w:color="D9DCE6" w:sz="4"/>
+              <w:bottom w:val="single" w:color="D9DCE6" w:sz="4"/>
+              <w:right w:val="single" w:color="D9DCE6" w:sz="4"/>
+            </w:tcBorders>
+            <w:tcMar>
+              <w:top w:type="dxa" w:w="70"/>
+              <w:left w:type="dxa" w:w="110"/>
+              <w:bottom w:type="dxa" w:w="70"/>
+              <w:right w:type="dxa" w:w="110"/>
+            </w:tcMar>
+          </w:tcPr>
+          <w:p>
+            <w:r>
+              <w:rPr>
+                <w:b w:val="false"/>
+                <w:bCs w:val="false"/>
+                <w:sz w:val="19"/>
+                <w:szCs w:val="19"/>
+              </w:rPr>
+              <w:t xml:space="preserve">B</w:t>
+            </w:r>
+          </w:p>
+        </w:tc>
+        <w:tc>
+          <w:tcPr>
+            <w:tcW w:type="dxa" w:w="3010"/>
+            <w:tcBorders>
+              <w:top w:val="single" w:color="D9DCE6" w:sz="4"/>
+              <w:left w:val="single" w:color="D9DCE6" w:sz="4"/>
+              <w:bottom w:val="single" w:color="D9DCE6" w:sz="4"/>
+              <w:right w:val="single" w:color="D9DCE6" w:sz="4"/>
+            </w:tcBorders>
+            <w:tcMar>
+              <w:top w:type="dxa" w:w="70"/>
+              <w:left w:type="dxa" w:w="110"/>
+              <w:bottom w:type="dxa" w:w="70"/>
+              <w:right w:type="dxa" w:w="110"/>
+            </w:tcMar>
+          </w:tcPr>
+          <w:p>
+            <w:r>
+              <w:rPr>
+                <w:b w:val="false"/>
+                <w:bCs w:val="false"/>
+                <w:sz w:val="19"/>
+                <w:szCs w:val="19"/>
+              </w:rPr>
+              <w:t xml:space="preserve">Cisco Secure Firewall</w:t>
             </w:r>
           </w:p>
         </w:tc>
@@ -9752,1214 +11144,7 @@
         <w:pStyle w:val="Heading2"/>
       </w:pPr>
       <w:r>
-        <w:t xml:space="preserve">3. Red local y perímetro (Seguridad)</w:t>
-      </w:r>
-    </w:p>
-    <w:p>
-      <w:pPr>
-        <w:spacing w:after="120"/>
-      </w:pPr>
-      <w:r>
-        <w:rPr>
-          <w:b/>
-          <w:bCs/>
-        </w:rPr>
-        <w:t xml:space="preserve">Página: </w:t>
-      </w:r>
-      <w:r>
-        <w:t xml:space="preserve">soluciones.html#proteccion-red</w:t>
-      </w:r>
-      <w:r>
-        <w:rPr>
-          <w:b/>
-          <w:bCs/>
-        </w:rPr>
-        <w:t xml:space="preserve">   ·   Objetivo: </w:t>
-      </w:r>
-      <w:r>
-        <w:t xml:space="preserve">Captar la demanda de control de acceso a la red local (Cisco ISE) y de firewall perimetral, ofrecidos por separado.</w:t>
-      </w:r>
-    </w:p>
-    <w:tbl>
-      <w:tblPr>
-        <w:tblW w:type="dxa" w:w="9360"/>
-        <w:tblBorders>
-          <w:top w:val="single" w:color="auto" w:sz="4"/>
-          <w:left w:val="single" w:color="auto" w:sz="4"/>
-          <w:bottom w:val="single" w:color="auto" w:sz="4"/>
-          <w:right w:val="single" w:color="auto" w:sz="4"/>
-          <w:insideH w:val="single" w:color="auto" w:sz="4"/>
-          <w:insideV w:val="single" w:color="auto" w:sz="4"/>
-        </w:tblBorders>
-      </w:tblPr>
-      <w:tblGrid>
-        <w:gridCol w:w="2900"/>
-        <w:gridCol w:w="1250"/>
-        <w:gridCol w:w="1300"/>
-        <w:gridCol w:w="900"/>
-        <w:gridCol w:w="3010"/>
-      </w:tblGrid>
-      <w:tr>
-        <w:trPr>
-          <w:tblHeader/>
-        </w:trPr>
-        <w:tc>
-          <w:tcPr>
-            <w:tcW w:type="dxa" w:w="2900"/>
-            <w:tcBorders>
-              <w:top w:val="single" w:color="D9DCE6" w:sz="4"/>
-              <w:left w:val="single" w:color="D9DCE6" w:sz="4"/>
-              <w:bottom w:val="single" w:color="D9DCE6" w:sz="4"/>
-              <w:right w:val="single" w:color="D9DCE6" w:sz="4"/>
-            </w:tcBorders>
-            <w:shd w:fill="000F76" w:color="auto" w:val="clear"/>
-            <w:tcMar>
-              <w:top w:type="dxa" w:w="70"/>
-              <w:left w:type="dxa" w:w="110"/>
-              <w:bottom w:type="dxa" w:w="70"/>
-              <w:right w:type="dxa" w:w="110"/>
-            </w:tcMar>
-          </w:tcPr>
-          <w:p>
-            <w:r>
-              <w:rPr>
-                <w:b/>
-                <w:bCs/>
-                <w:color w:val="FFFFFF"/>
-                <w:sz w:val="19"/>
-                <w:szCs w:val="19"/>
-              </w:rPr>
-              <w:t xml:space="preserve">Palabra clave</w:t>
-            </w:r>
-          </w:p>
-        </w:tc>
-        <w:tc>
-          <w:tcPr>
-            <w:tcW w:type="dxa" w:w="1250"/>
-            <w:tcBorders>
-              <w:top w:val="single" w:color="D9DCE6" w:sz="4"/>
-              <w:left w:val="single" w:color="D9DCE6" w:sz="4"/>
-              <w:bottom w:val="single" w:color="D9DCE6" w:sz="4"/>
-              <w:right w:val="single" w:color="D9DCE6" w:sz="4"/>
-            </w:tcBorders>
-            <w:shd w:fill="000F76" w:color="auto" w:val="clear"/>
-            <w:tcMar>
-              <w:top w:type="dxa" w:w="70"/>
-              <w:left w:type="dxa" w:w="110"/>
-              <w:bottom w:type="dxa" w:w="70"/>
-              <w:right w:type="dxa" w:w="110"/>
-            </w:tcMar>
-          </w:tcPr>
-          <w:p>
-            <w:r>
-              <w:rPr>
-                <w:b/>
-                <w:bCs/>
-                <w:color w:val="FFFFFF"/>
-                <w:sz w:val="19"/>
-                <w:szCs w:val="19"/>
-              </w:rPr>
-              <w:t xml:space="preserve">Tipo</w:t>
-            </w:r>
-          </w:p>
-        </w:tc>
-        <w:tc>
-          <w:tcPr>
-            <w:tcW w:type="dxa" w:w="1300"/>
-            <w:tcBorders>
-              <w:top w:val="single" w:color="D9DCE6" w:sz="4"/>
-              <w:left w:val="single" w:color="D9DCE6" w:sz="4"/>
-              <w:bottom w:val="single" w:color="D9DCE6" w:sz="4"/>
-              <w:right w:val="single" w:color="D9DCE6" w:sz="4"/>
-            </w:tcBorders>
-            <w:shd w:fill="000F76" w:color="auto" w:val="clear"/>
-            <w:tcMar>
-              <w:top w:type="dxa" w:w="70"/>
-              <w:left w:type="dxa" w:w="110"/>
-              <w:bottom w:type="dxa" w:w="70"/>
-              <w:right w:type="dxa" w:w="110"/>
-            </w:tcMar>
-          </w:tcPr>
-          <w:p>
-            <w:r>
-              <w:rPr>
-                <w:b/>
-                <w:bCs/>
-                <w:color w:val="FFFFFF"/>
-                <w:sz w:val="19"/>
-                <w:szCs w:val="19"/>
-              </w:rPr>
-              <w:t xml:space="preserve">Intención</w:t>
-            </w:r>
-          </w:p>
-        </w:tc>
-        <w:tc>
-          <w:tcPr>
-            <w:tcW w:type="dxa" w:w="900"/>
-            <w:tcBorders>
-              <w:top w:val="single" w:color="D9DCE6" w:sz="4"/>
-              <w:left w:val="single" w:color="D9DCE6" w:sz="4"/>
-              <w:bottom w:val="single" w:color="D9DCE6" w:sz="4"/>
-              <w:right w:val="single" w:color="D9DCE6" w:sz="4"/>
-            </w:tcBorders>
-            <w:shd w:fill="000F76" w:color="auto" w:val="clear"/>
-            <w:tcMar>
-              <w:top w:type="dxa" w:w="70"/>
-              <w:left w:type="dxa" w:w="110"/>
-              <w:bottom w:type="dxa" w:w="70"/>
-              <w:right w:type="dxa" w:w="110"/>
-            </w:tcMar>
-          </w:tcPr>
-          <w:p>
-            <w:r>
-              <w:rPr>
-                <w:b/>
-                <w:bCs/>
-                <w:color w:val="FFFFFF"/>
-                <w:sz w:val="19"/>
-                <w:szCs w:val="19"/>
-              </w:rPr>
-              <w:t xml:space="preserve">Prioridad</w:t>
-            </w:r>
-          </w:p>
-        </w:tc>
-        <w:tc>
-          <w:tcPr>
-            <w:tcW w:type="dxa" w:w="3010"/>
-            <w:tcBorders>
-              <w:top w:val="single" w:color="D9DCE6" w:sz="4"/>
-              <w:left w:val="single" w:color="D9DCE6" w:sz="4"/>
-              <w:bottom w:val="single" w:color="D9DCE6" w:sz="4"/>
-              <w:right w:val="single" w:color="D9DCE6" w:sz="4"/>
-            </w:tcBorders>
-            <w:shd w:fill="000F76" w:color="auto" w:val="clear"/>
-            <w:tcMar>
-              <w:top w:type="dxa" w:w="70"/>
-              <w:left w:type="dxa" w:w="110"/>
-              <w:bottom w:type="dxa" w:w="70"/>
-              <w:right w:type="dxa" w:w="110"/>
-            </w:tcMar>
-          </w:tcPr>
-          <w:p>
-            <w:r>
-              <w:rPr>
-                <w:b/>
-                <w:bCs/>
-                <w:color w:val="FFFFFF"/>
-                <w:sz w:val="19"/>
-                <w:szCs w:val="19"/>
-              </w:rPr>
-              <w:t xml:space="preserve">Dónde está en el sitio</w:t>
-            </w:r>
-          </w:p>
-        </w:tc>
-      </w:tr>
-      <w:tr>
-        <w:tc>
-          <w:tcPr>
-            <w:tcW w:type="dxa" w:w="2900"/>
-            <w:tcBorders>
-              <w:top w:val="single" w:color="D9DCE6" w:sz="4"/>
-              <w:left w:val="single" w:color="D9DCE6" w:sz="4"/>
-              <w:bottom w:val="single" w:color="D9DCE6" w:sz="4"/>
-              <w:right w:val="single" w:color="D9DCE6" w:sz="4"/>
-            </w:tcBorders>
-            <w:tcMar>
-              <w:top w:type="dxa" w:w="70"/>
-              <w:left w:type="dxa" w:w="110"/>
-              <w:bottom w:type="dxa" w:w="70"/>
-              <w:right w:type="dxa" w:w="110"/>
-            </w:tcMar>
-          </w:tcPr>
-          <w:p>
-            <w:r>
-              <w:rPr>
-                <w:b/>
-                <w:bCs/>
-                <w:sz w:val="19"/>
-                <w:szCs w:val="19"/>
-              </w:rPr>
-              <w:t xml:space="preserve">control de acceso a la red (NAC)</w:t>
-            </w:r>
-          </w:p>
-        </w:tc>
-        <w:tc>
-          <w:tcPr>
-            <w:tcW w:type="dxa" w:w="1250"/>
-            <w:tcBorders>
-              <w:top w:val="single" w:color="D9DCE6" w:sz="4"/>
-              <w:left w:val="single" w:color="D9DCE6" w:sz="4"/>
-              <w:bottom w:val="single" w:color="D9DCE6" w:sz="4"/>
-              <w:right w:val="single" w:color="D9DCE6" w:sz="4"/>
-            </w:tcBorders>
-            <w:tcMar>
-              <w:top w:type="dxa" w:w="70"/>
-              <w:left w:type="dxa" w:w="110"/>
-              <w:bottom w:type="dxa" w:w="70"/>
-              <w:right w:type="dxa" w:w="110"/>
-            </w:tcMar>
-          </w:tcPr>
-          <w:p>
-            <w:r>
-              <w:rPr>
-                <w:b w:val="false"/>
-                <w:bCs w:val="false"/>
-                <w:sz w:val="19"/>
-                <w:szCs w:val="19"/>
-              </w:rPr>
-              <w:t xml:space="preserve">Principal</w:t>
-            </w:r>
-          </w:p>
-        </w:tc>
-        <w:tc>
-          <w:tcPr>
-            <w:tcW w:type="dxa" w:w="1300"/>
-            <w:tcBorders>
-              <w:top w:val="single" w:color="D9DCE6" w:sz="4"/>
-              <w:left w:val="single" w:color="D9DCE6" w:sz="4"/>
-              <w:bottom w:val="single" w:color="D9DCE6" w:sz="4"/>
-              <w:right w:val="single" w:color="D9DCE6" w:sz="4"/>
-            </w:tcBorders>
-            <w:tcMar>
-              <w:top w:type="dxa" w:w="70"/>
-              <w:left w:type="dxa" w:w="110"/>
-              <w:bottom w:type="dxa" w:w="70"/>
-              <w:right w:type="dxa" w:w="110"/>
-            </w:tcMar>
-          </w:tcPr>
-          <w:p>
-            <w:r>
-              <w:rPr>
-                <w:b w:val="false"/>
-                <w:bCs w:val="false"/>
-                <w:sz w:val="19"/>
-                <w:szCs w:val="19"/>
-              </w:rPr>
-              <w:t xml:space="preserve">Comercial</w:t>
-            </w:r>
-          </w:p>
-        </w:tc>
-        <w:tc>
-          <w:tcPr>
-            <w:tcW w:type="dxa" w:w="900"/>
-            <w:tcBorders>
-              <w:top w:val="single" w:color="D9DCE6" w:sz="4"/>
-              <w:left w:val="single" w:color="D9DCE6" w:sz="4"/>
-              <w:bottom w:val="single" w:color="D9DCE6" w:sz="4"/>
-              <w:right w:val="single" w:color="D9DCE6" w:sz="4"/>
-            </w:tcBorders>
-            <w:tcMar>
-              <w:top w:type="dxa" w:w="70"/>
-              <w:left w:type="dxa" w:w="110"/>
-              <w:bottom w:type="dxa" w:w="70"/>
-              <w:right w:type="dxa" w:w="110"/>
-            </w:tcMar>
-          </w:tcPr>
-          <w:p>
-            <w:r>
-              <w:rPr>
-                <w:b w:val="false"/>
-                <w:bCs w:val="false"/>
-                <w:sz w:val="19"/>
-                <w:szCs w:val="19"/>
-              </w:rPr>
-              <w:t xml:space="preserve">A</w:t>
-            </w:r>
-          </w:p>
-        </w:tc>
-        <w:tc>
-          <w:tcPr>
-            <w:tcW w:type="dxa" w:w="3010"/>
-            <w:tcBorders>
-              <w:top w:val="single" w:color="D9DCE6" w:sz="4"/>
-              <w:left w:val="single" w:color="D9DCE6" w:sz="4"/>
-              <w:bottom w:val="single" w:color="D9DCE6" w:sz="4"/>
-              <w:right w:val="single" w:color="D9DCE6" w:sz="4"/>
-            </w:tcBorders>
-            <w:tcMar>
-              <w:top w:type="dxa" w:w="70"/>
-              <w:left w:type="dxa" w:w="110"/>
-              <w:bottom w:type="dxa" w:w="70"/>
-              <w:right w:type="dxa" w:w="110"/>
-            </w:tcMar>
-          </w:tcPr>
-          <w:p>
-            <w:r>
-              <w:rPr>
-                <w:b w:val="false"/>
-                <w:bCs w:val="false"/>
-                <w:sz w:val="19"/>
-                <w:szCs w:val="19"/>
-              </w:rPr>
-              <w:t xml:space="preserve">H2 del área y Cisco ISE</w:t>
-            </w:r>
-          </w:p>
-        </w:tc>
-      </w:tr>
-      <w:tr>
-        <w:tc>
-          <w:tcPr>
-            <w:tcW w:type="dxa" w:w="2900"/>
-            <w:tcBorders>
-              <w:top w:val="single" w:color="D9DCE6" w:sz="4"/>
-              <w:left w:val="single" w:color="D9DCE6" w:sz="4"/>
-              <w:bottom w:val="single" w:color="D9DCE6" w:sz="4"/>
-              <w:right w:val="single" w:color="D9DCE6" w:sz="4"/>
-            </w:tcBorders>
-            <w:tcMar>
-              <w:top w:type="dxa" w:w="70"/>
-              <w:left w:type="dxa" w:w="110"/>
-              <w:bottom w:type="dxa" w:w="70"/>
-              <w:right w:type="dxa" w:w="110"/>
-            </w:tcMar>
-          </w:tcPr>
-          <w:p>
-            <w:r>
-              <w:rPr>
-                <w:b/>
-                <w:bCs/>
-                <w:sz w:val="19"/>
-                <w:szCs w:val="19"/>
-              </w:rPr>
-              <w:t xml:space="preserve">firewall perimetral</w:t>
-            </w:r>
-          </w:p>
-        </w:tc>
-        <w:tc>
-          <w:tcPr>
-            <w:tcW w:type="dxa" w:w="1250"/>
-            <w:tcBorders>
-              <w:top w:val="single" w:color="D9DCE6" w:sz="4"/>
-              <w:left w:val="single" w:color="D9DCE6" w:sz="4"/>
-              <w:bottom w:val="single" w:color="D9DCE6" w:sz="4"/>
-              <w:right w:val="single" w:color="D9DCE6" w:sz="4"/>
-            </w:tcBorders>
-            <w:tcMar>
-              <w:top w:type="dxa" w:w="70"/>
-              <w:left w:type="dxa" w:w="110"/>
-              <w:bottom w:type="dxa" w:w="70"/>
-              <w:right w:type="dxa" w:w="110"/>
-            </w:tcMar>
-          </w:tcPr>
-          <w:p>
-            <w:r>
-              <w:rPr>
-                <w:b w:val="false"/>
-                <w:bCs w:val="false"/>
-                <w:sz w:val="19"/>
-                <w:szCs w:val="19"/>
-              </w:rPr>
-              <w:t xml:space="preserve">Principal</w:t>
-            </w:r>
-          </w:p>
-        </w:tc>
-        <w:tc>
-          <w:tcPr>
-            <w:tcW w:type="dxa" w:w="1300"/>
-            <w:tcBorders>
-              <w:top w:val="single" w:color="D9DCE6" w:sz="4"/>
-              <w:left w:val="single" w:color="D9DCE6" w:sz="4"/>
-              <w:bottom w:val="single" w:color="D9DCE6" w:sz="4"/>
-              <w:right w:val="single" w:color="D9DCE6" w:sz="4"/>
-            </w:tcBorders>
-            <w:tcMar>
-              <w:top w:type="dxa" w:w="70"/>
-              <w:left w:type="dxa" w:w="110"/>
-              <w:bottom w:type="dxa" w:w="70"/>
-              <w:right w:type="dxa" w:w="110"/>
-            </w:tcMar>
-          </w:tcPr>
-          <w:p>
-            <w:r>
-              <w:rPr>
-                <w:b w:val="false"/>
-                <w:bCs w:val="false"/>
-                <w:sz w:val="19"/>
-                <w:szCs w:val="19"/>
-              </w:rPr>
-              <w:t xml:space="preserve">Comercial</w:t>
-            </w:r>
-          </w:p>
-        </w:tc>
-        <w:tc>
-          <w:tcPr>
-            <w:tcW w:type="dxa" w:w="900"/>
-            <w:tcBorders>
-              <w:top w:val="single" w:color="D9DCE6" w:sz="4"/>
-              <w:left w:val="single" w:color="D9DCE6" w:sz="4"/>
-              <w:bottom w:val="single" w:color="D9DCE6" w:sz="4"/>
-              <w:right w:val="single" w:color="D9DCE6" w:sz="4"/>
-            </w:tcBorders>
-            <w:tcMar>
-              <w:top w:type="dxa" w:w="70"/>
-              <w:left w:type="dxa" w:w="110"/>
-              <w:bottom w:type="dxa" w:w="70"/>
-              <w:right w:type="dxa" w:w="110"/>
-            </w:tcMar>
-          </w:tcPr>
-          <w:p>
-            <w:r>
-              <w:rPr>
-                <w:b w:val="false"/>
-                <w:bCs w:val="false"/>
-                <w:sz w:val="19"/>
-                <w:szCs w:val="19"/>
-              </w:rPr>
-              <w:t xml:space="preserve">A</w:t>
-            </w:r>
-          </w:p>
-        </w:tc>
-        <w:tc>
-          <w:tcPr>
-            <w:tcW w:type="dxa" w:w="3010"/>
-            <w:tcBorders>
-              <w:top w:val="single" w:color="D9DCE6" w:sz="4"/>
-              <w:left w:val="single" w:color="D9DCE6" w:sz="4"/>
-              <w:bottom w:val="single" w:color="D9DCE6" w:sz="4"/>
-              <w:right w:val="single" w:color="D9DCE6" w:sz="4"/>
-            </w:tcBorders>
-            <w:tcMar>
-              <w:top w:type="dxa" w:w="70"/>
-              <w:left w:type="dxa" w:w="110"/>
-              <w:bottom w:type="dxa" w:w="70"/>
-              <w:right w:type="dxa" w:w="110"/>
-            </w:tcMar>
-          </w:tcPr>
-          <w:p>
-            <w:r>
-              <w:rPr>
-                <w:b w:val="false"/>
-                <w:bCs w:val="false"/>
-                <w:sz w:val="19"/>
-                <w:szCs w:val="19"/>
-              </w:rPr>
-              <w:t xml:space="preserve">H2 del área y Cisco Secure Firewall</w:t>
-            </w:r>
-          </w:p>
-        </w:tc>
-      </w:tr>
-      <w:tr>
-        <w:tc>
-          <w:tcPr>
-            <w:tcW w:type="dxa" w:w="2900"/>
-            <w:tcBorders>
-              <w:top w:val="single" w:color="D9DCE6" w:sz="4"/>
-              <w:left w:val="single" w:color="D9DCE6" w:sz="4"/>
-              <w:bottom w:val="single" w:color="D9DCE6" w:sz="4"/>
-              <w:right w:val="single" w:color="D9DCE6" w:sz="4"/>
-            </w:tcBorders>
-            <w:tcMar>
-              <w:top w:type="dxa" w:w="70"/>
-              <w:left w:type="dxa" w:w="110"/>
-              <w:bottom w:type="dxa" w:w="70"/>
-              <w:right w:type="dxa" w:w="110"/>
-            </w:tcMar>
-          </w:tcPr>
-          <w:p>
-            <w:r>
-              <w:rPr>
-                <w:b/>
-                <w:bCs/>
-                <w:sz w:val="19"/>
-                <w:szCs w:val="19"/>
-              </w:rPr>
-              <w:t xml:space="preserve">Cisco ISE</w:t>
-            </w:r>
-          </w:p>
-        </w:tc>
-        <w:tc>
-          <w:tcPr>
-            <w:tcW w:type="dxa" w:w="1250"/>
-            <w:tcBorders>
-              <w:top w:val="single" w:color="D9DCE6" w:sz="4"/>
-              <w:left w:val="single" w:color="D9DCE6" w:sz="4"/>
-              <w:bottom w:val="single" w:color="D9DCE6" w:sz="4"/>
-              <w:right w:val="single" w:color="D9DCE6" w:sz="4"/>
-            </w:tcBorders>
-            <w:tcMar>
-              <w:top w:type="dxa" w:w="70"/>
-              <w:left w:type="dxa" w:w="110"/>
-              <w:bottom w:type="dxa" w:w="70"/>
-              <w:right w:type="dxa" w:w="110"/>
-            </w:tcMar>
-          </w:tcPr>
-          <w:p>
-            <w:r>
-              <w:rPr>
-                <w:b w:val="false"/>
-                <w:bCs w:val="false"/>
-                <w:sz w:val="19"/>
-                <w:szCs w:val="19"/>
-              </w:rPr>
-              <w:t xml:space="preserve">Producto</w:t>
-            </w:r>
-          </w:p>
-        </w:tc>
-        <w:tc>
-          <w:tcPr>
-            <w:tcW w:type="dxa" w:w="1300"/>
-            <w:tcBorders>
-              <w:top w:val="single" w:color="D9DCE6" w:sz="4"/>
-              <w:left w:val="single" w:color="D9DCE6" w:sz="4"/>
-              <w:bottom w:val="single" w:color="D9DCE6" w:sz="4"/>
-              <w:right w:val="single" w:color="D9DCE6" w:sz="4"/>
-            </w:tcBorders>
-            <w:tcMar>
-              <w:top w:type="dxa" w:w="70"/>
-              <w:left w:type="dxa" w:w="110"/>
-              <w:bottom w:type="dxa" w:w="70"/>
-              <w:right w:type="dxa" w:w="110"/>
-            </w:tcMar>
-          </w:tcPr>
-          <w:p>
-            <w:r>
-              <w:rPr>
-                <w:b w:val="false"/>
-                <w:bCs w:val="false"/>
-                <w:sz w:val="19"/>
-                <w:szCs w:val="19"/>
-              </w:rPr>
-              <w:t xml:space="preserve">Comercial</w:t>
-            </w:r>
-          </w:p>
-        </w:tc>
-        <w:tc>
-          <w:tcPr>
-            <w:tcW w:type="dxa" w:w="900"/>
-            <w:tcBorders>
-              <w:top w:val="single" w:color="D9DCE6" w:sz="4"/>
-              <w:left w:val="single" w:color="D9DCE6" w:sz="4"/>
-              <w:bottom w:val="single" w:color="D9DCE6" w:sz="4"/>
-              <w:right w:val="single" w:color="D9DCE6" w:sz="4"/>
-            </w:tcBorders>
-            <w:tcMar>
-              <w:top w:type="dxa" w:w="70"/>
-              <w:left w:type="dxa" w:w="110"/>
-              <w:bottom w:type="dxa" w:w="70"/>
-              <w:right w:type="dxa" w:w="110"/>
-            </w:tcMar>
-          </w:tcPr>
-          <w:p>
-            <w:r>
-              <w:rPr>
-                <w:b w:val="false"/>
-                <w:bCs w:val="false"/>
-                <w:sz w:val="19"/>
-                <w:szCs w:val="19"/>
-              </w:rPr>
-              <w:t xml:space="preserve">A</w:t>
-            </w:r>
-          </w:p>
-        </w:tc>
-        <w:tc>
-          <w:tcPr>
-            <w:tcW w:type="dxa" w:w="3010"/>
-            <w:tcBorders>
-              <w:top w:val="single" w:color="D9DCE6" w:sz="4"/>
-              <w:left w:val="single" w:color="D9DCE6" w:sz="4"/>
-              <w:bottom w:val="single" w:color="D9DCE6" w:sz="4"/>
-              <w:right w:val="single" w:color="D9DCE6" w:sz="4"/>
-            </w:tcBorders>
-            <w:tcMar>
-              <w:top w:type="dxa" w:w="70"/>
-              <w:left w:type="dxa" w:w="110"/>
-              <w:bottom w:type="dxa" w:w="70"/>
-              <w:right w:type="dxa" w:w="110"/>
-            </w:tcMar>
-          </w:tcPr>
-          <w:p>
-            <w:r>
-              <w:rPr>
-                <w:b w:val="false"/>
-                <w:bCs w:val="false"/>
-                <w:sz w:val="19"/>
-                <w:szCs w:val="19"/>
-              </w:rPr>
-              <w:t xml:space="preserve">Cisco ISE</w:t>
-            </w:r>
-          </w:p>
-        </w:tc>
-      </w:tr>
-      <w:tr>
-        <w:tc>
-          <w:tcPr>
-            <w:tcW w:type="dxa" w:w="2900"/>
-            <w:tcBorders>
-              <w:top w:val="single" w:color="D9DCE6" w:sz="4"/>
-              <w:left w:val="single" w:color="D9DCE6" w:sz="4"/>
-              <w:bottom w:val="single" w:color="D9DCE6" w:sz="4"/>
-              <w:right w:val="single" w:color="D9DCE6" w:sz="4"/>
-            </w:tcBorders>
-            <w:tcMar>
-              <w:top w:type="dxa" w:w="70"/>
-              <w:left w:type="dxa" w:w="110"/>
-              <w:bottom w:type="dxa" w:w="70"/>
-              <w:right w:type="dxa" w:w="110"/>
-            </w:tcMar>
-          </w:tcPr>
-          <w:p>
-            <w:r>
-              <w:rPr>
-                <w:b/>
-                <w:bCs/>
-                <w:sz w:val="19"/>
-                <w:szCs w:val="19"/>
-              </w:rPr>
-              <w:t xml:space="preserve">Cisco Secure Firewall</w:t>
-            </w:r>
-          </w:p>
-        </w:tc>
-        <w:tc>
-          <w:tcPr>
-            <w:tcW w:type="dxa" w:w="1250"/>
-            <w:tcBorders>
-              <w:top w:val="single" w:color="D9DCE6" w:sz="4"/>
-              <w:left w:val="single" w:color="D9DCE6" w:sz="4"/>
-              <w:bottom w:val="single" w:color="D9DCE6" w:sz="4"/>
-              <w:right w:val="single" w:color="D9DCE6" w:sz="4"/>
-            </w:tcBorders>
-            <w:tcMar>
-              <w:top w:type="dxa" w:w="70"/>
-              <w:left w:type="dxa" w:w="110"/>
-              <w:bottom w:type="dxa" w:w="70"/>
-              <w:right w:type="dxa" w:w="110"/>
-            </w:tcMar>
-          </w:tcPr>
-          <w:p>
-            <w:r>
-              <w:rPr>
-                <w:b w:val="false"/>
-                <w:bCs w:val="false"/>
-                <w:sz w:val="19"/>
-                <w:szCs w:val="19"/>
-              </w:rPr>
-              <w:t xml:space="preserve">Producto</w:t>
-            </w:r>
-          </w:p>
-        </w:tc>
-        <w:tc>
-          <w:tcPr>
-            <w:tcW w:type="dxa" w:w="1300"/>
-            <w:tcBorders>
-              <w:top w:val="single" w:color="D9DCE6" w:sz="4"/>
-              <w:left w:val="single" w:color="D9DCE6" w:sz="4"/>
-              <w:bottom w:val="single" w:color="D9DCE6" w:sz="4"/>
-              <w:right w:val="single" w:color="D9DCE6" w:sz="4"/>
-            </w:tcBorders>
-            <w:tcMar>
-              <w:top w:type="dxa" w:w="70"/>
-              <w:left w:type="dxa" w:w="110"/>
-              <w:bottom w:type="dxa" w:w="70"/>
-              <w:right w:type="dxa" w:w="110"/>
-            </w:tcMar>
-          </w:tcPr>
-          <w:p>
-            <w:r>
-              <w:rPr>
-                <w:b w:val="false"/>
-                <w:bCs w:val="false"/>
-                <w:sz w:val="19"/>
-                <w:szCs w:val="19"/>
-              </w:rPr>
-              <w:t xml:space="preserve">Comercial</w:t>
-            </w:r>
-          </w:p>
-        </w:tc>
-        <w:tc>
-          <w:tcPr>
-            <w:tcW w:type="dxa" w:w="900"/>
-            <w:tcBorders>
-              <w:top w:val="single" w:color="D9DCE6" w:sz="4"/>
-              <w:left w:val="single" w:color="D9DCE6" w:sz="4"/>
-              <w:bottom w:val="single" w:color="D9DCE6" w:sz="4"/>
-              <w:right w:val="single" w:color="D9DCE6" w:sz="4"/>
-            </w:tcBorders>
-            <w:tcMar>
-              <w:top w:type="dxa" w:w="70"/>
-              <w:left w:type="dxa" w:w="110"/>
-              <w:bottom w:type="dxa" w:w="70"/>
-              <w:right w:type="dxa" w:w="110"/>
-            </w:tcMar>
-          </w:tcPr>
-          <w:p>
-            <w:r>
-              <w:rPr>
-                <w:b w:val="false"/>
-                <w:bCs w:val="false"/>
-                <w:sz w:val="19"/>
-                <w:szCs w:val="19"/>
-              </w:rPr>
-              <w:t xml:space="preserve">A</w:t>
-            </w:r>
-          </w:p>
-        </w:tc>
-        <w:tc>
-          <w:tcPr>
-            <w:tcW w:type="dxa" w:w="3010"/>
-            <w:tcBorders>
-              <w:top w:val="single" w:color="D9DCE6" w:sz="4"/>
-              <w:left w:val="single" w:color="D9DCE6" w:sz="4"/>
-              <w:bottom w:val="single" w:color="D9DCE6" w:sz="4"/>
-              <w:right w:val="single" w:color="D9DCE6" w:sz="4"/>
-            </w:tcBorders>
-            <w:tcMar>
-              <w:top w:type="dxa" w:w="70"/>
-              <w:left w:type="dxa" w:w="110"/>
-              <w:bottom w:type="dxa" w:w="70"/>
-              <w:right w:type="dxa" w:w="110"/>
-            </w:tcMar>
-          </w:tcPr>
-          <w:p>
-            <w:r>
-              <w:rPr>
-                <w:b w:val="false"/>
-                <w:bCs w:val="false"/>
-                <w:sz w:val="19"/>
-                <w:szCs w:val="19"/>
-              </w:rPr>
-              <w:t xml:space="preserve">Cisco Secure Firewall</w:t>
-            </w:r>
-          </w:p>
-        </w:tc>
-      </w:tr>
-      <w:tr>
-        <w:tc>
-          <w:tcPr>
-            <w:tcW w:type="dxa" w:w="2900"/>
-            <w:tcBorders>
-              <w:top w:val="single" w:color="D9DCE6" w:sz="4"/>
-              <w:left w:val="single" w:color="D9DCE6" w:sz="4"/>
-              <w:bottom w:val="single" w:color="D9DCE6" w:sz="4"/>
-              <w:right w:val="single" w:color="D9DCE6" w:sz="4"/>
-            </w:tcBorders>
-            <w:tcMar>
-              <w:top w:type="dxa" w:w="70"/>
-              <w:left w:type="dxa" w:w="110"/>
-              <w:bottom w:type="dxa" w:w="70"/>
-              <w:right w:type="dxa" w:w="110"/>
-            </w:tcMar>
-          </w:tcPr>
-          <w:p>
-            <w:r>
-              <w:rPr>
-                <w:b/>
-                <w:bCs/>
-                <w:sz w:val="19"/>
-                <w:szCs w:val="19"/>
-              </w:rPr>
-              <w:t xml:space="preserve">segmentación de la red</w:t>
-            </w:r>
-          </w:p>
-        </w:tc>
-        <w:tc>
-          <w:tcPr>
-            <w:tcW w:type="dxa" w:w="1250"/>
-            <w:tcBorders>
-              <w:top w:val="single" w:color="D9DCE6" w:sz="4"/>
-              <w:left w:val="single" w:color="D9DCE6" w:sz="4"/>
-              <w:bottom w:val="single" w:color="D9DCE6" w:sz="4"/>
-              <w:right w:val="single" w:color="D9DCE6" w:sz="4"/>
-            </w:tcBorders>
-            <w:tcMar>
-              <w:top w:type="dxa" w:w="70"/>
-              <w:left w:type="dxa" w:w="110"/>
-              <w:bottom w:type="dxa" w:w="70"/>
-              <w:right w:type="dxa" w:w="110"/>
-            </w:tcMar>
-          </w:tcPr>
-          <w:p>
-            <w:r>
-              <w:rPr>
-                <w:b w:val="false"/>
-                <w:bCs w:val="false"/>
-                <w:sz w:val="19"/>
-                <w:szCs w:val="19"/>
-              </w:rPr>
-              <w:t xml:space="preserve">Long tail</w:t>
-            </w:r>
-          </w:p>
-        </w:tc>
-        <w:tc>
-          <w:tcPr>
-            <w:tcW w:type="dxa" w:w="1300"/>
-            <w:tcBorders>
-              <w:top w:val="single" w:color="D9DCE6" w:sz="4"/>
-              <w:left w:val="single" w:color="D9DCE6" w:sz="4"/>
-              <w:bottom w:val="single" w:color="D9DCE6" w:sz="4"/>
-              <w:right w:val="single" w:color="D9DCE6" w:sz="4"/>
-            </w:tcBorders>
-            <w:tcMar>
-              <w:top w:type="dxa" w:w="70"/>
-              <w:left w:type="dxa" w:w="110"/>
-              <w:bottom w:type="dxa" w:w="70"/>
-              <w:right w:type="dxa" w:w="110"/>
-            </w:tcMar>
-          </w:tcPr>
-          <w:p>
-            <w:r>
-              <w:rPr>
-                <w:b w:val="false"/>
-                <w:bCs w:val="false"/>
-                <w:sz w:val="19"/>
-                <w:szCs w:val="19"/>
-              </w:rPr>
-              <w:t xml:space="preserve">Informativa</w:t>
-            </w:r>
-          </w:p>
-        </w:tc>
-        <w:tc>
-          <w:tcPr>
-            <w:tcW w:type="dxa" w:w="900"/>
-            <w:tcBorders>
-              <w:top w:val="single" w:color="D9DCE6" w:sz="4"/>
-              <w:left w:val="single" w:color="D9DCE6" w:sz="4"/>
-              <w:bottom w:val="single" w:color="D9DCE6" w:sz="4"/>
-              <w:right w:val="single" w:color="D9DCE6" w:sz="4"/>
-            </w:tcBorders>
-            <w:tcMar>
-              <w:top w:type="dxa" w:w="70"/>
-              <w:left w:type="dxa" w:w="110"/>
-              <w:bottom w:type="dxa" w:w="70"/>
-              <w:right w:type="dxa" w:w="110"/>
-            </w:tcMar>
-          </w:tcPr>
-          <w:p>
-            <w:r>
-              <w:rPr>
-                <w:b w:val="false"/>
-                <w:bCs w:val="false"/>
-                <w:sz w:val="19"/>
-                <w:szCs w:val="19"/>
-              </w:rPr>
-              <w:t xml:space="preserve">B</w:t>
-            </w:r>
-          </w:p>
-        </w:tc>
-        <w:tc>
-          <w:tcPr>
-            <w:tcW w:type="dxa" w:w="3010"/>
-            <w:tcBorders>
-              <w:top w:val="single" w:color="D9DCE6" w:sz="4"/>
-              <w:left w:val="single" w:color="D9DCE6" w:sz="4"/>
-              <w:bottom w:val="single" w:color="D9DCE6" w:sz="4"/>
-              <w:right w:val="single" w:color="D9DCE6" w:sz="4"/>
-            </w:tcBorders>
-            <w:tcMar>
-              <w:top w:type="dxa" w:w="70"/>
-              <w:left w:type="dxa" w:w="110"/>
-              <w:bottom w:type="dxa" w:w="70"/>
-              <w:right w:type="dxa" w:w="110"/>
-            </w:tcMar>
-          </w:tcPr>
-          <w:p>
-            <w:r>
-              <w:rPr>
-                <w:b w:val="false"/>
-                <w:bCs w:val="false"/>
-                <w:sz w:val="19"/>
-                <w:szCs w:val="19"/>
-              </w:rPr>
-              <w:t xml:space="preserve">Intro del área y Cisco ISE</w:t>
-            </w:r>
-          </w:p>
-        </w:tc>
-      </w:tr>
-      <w:tr>
-        <w:tc>
-          <w:tcPr>
-            <w:tcW w:type="dxa" w:w="2900"/>
-            <w:tcBorders>
-              <w:top w:val="single" w:color="D9DCE6" w:sz="4"/>
-              <w:left w:val="single" w:color="D9DCE6" w:sz="4"/>
-              <w:bottom w:val="single" w:color="D9DCE6" w:sz="4"/>
-              <w:right w:val="single" w:color="D9DCE6" w:sz="4"/>
-            </w:tcBorders>
-            <w:tcMar>
-              <w:top w:type="dxa" w:w="70"/>
-              <w:left w:type="dxa" w:w="110"/>
-              <w:bottom w:type="dxa" w:w="70"/>
-              <w:right w:type="dxa" w:w="110"/>
-            </w:tcMar>
-          </w:tcPr>
-          <w:p>
-            <w:r>
-              <w:rPr>
-                <w:b/>
-                <w:bCs/>
-                <w:sz w:val="19"/>
-                <w:szCs w:val="19"/>
-              </w:rPr>
-              <w:t xml:space="preserve">integración con Intune</w:t>
-            </w:r>
-          </w:p>
-        </w:tc>
-        <w:tc>
-          <w:tcPr>
-            <w:tcW w:type="dxa" w:w="1250"/>
-            <w:tcBorders>
-              <w:top w:val="single" w:color="D9DCE6" w:sz="4"/>
-              <w:left w:val="single" w:color="D9DCE6" w:sz="4"/>
-              <w:bottom w:val="single" w:color="D9DCE6" w:sz="4"/>
-              <w:right w:val="single" w:color="D9DCE6" w:sz="4"/>
-            </w:tcBorders>
-            <w:tcMar>
-              <w:top w:type="dxa" w:w="70"/>
-              <w:left w:type="dxa" w:w="110"/>
-              <w:bottom w:type="dxa" w:w="70"/>
-              <w:right w:type="dxa" w:w="110"/>
-            </w:tcMar>
-          </w:tcPr>
-          <w:p>
-            <w:r>
-              <w:rPr>
-                <w:b w:val="false"/>
-                <w:bCs w:val="false"/>
-                <w:sz w:val="19"/>
-                <w:szCs w:val="19"/>
-              </w:rPr>
-              <w:t xml:space="preserve">Long tail</w:t>
-            </w:r>
-          </w:p>
-        </w:tc>
-        <w:tc>
-          <w:tcPr>
-            <w:tcW w:type="dxa" w:w="1300"/>
-            <w:tcBorders>
-              <w:top w:val="single" w:color="D9DCE6" w:sz="4"/>
-              <w:left w:val="single" w:color="D9DCE6" w:sz="4"/>
-              <w:bottom w:val="single" w:color="D9DCE6" w:sz="4"/>
-              <w:right w:val="single" w:color="D9DCE6" w:sz="4"/>
-            </w:tcBorders>
-            <w:tcMar>
-              <w:top w:type="dxa" w:w="70"/>
-              <w:left w:type="dxa" w:w="110"/>
-              <w:bottom w:type="dxa" w:w="70"/>
-              <w:right w:type="dxa" w:w="110"/>
-            </w:tcMar>
-          </w:tcPr>
-          <w:p>
-            <w:r>
-              <w:rPr>
-                <w:b w:val="false"/>
-                <w:bCs w:val="false"/>
-                <w:sz w:val="19"/>
-                <w:szCs w:val="19"/>
-              </w:rPr>
-              <w:t xml:space="preserve">Informativa</w:t>
-            </w:r>
-          </w:p>
-        </w:tc>
-        <w:tc>
-          <w:tcPr>
-            <w:tcW w:type="dxa" w:w="900"/>
-            <w:tcBorders>
-              <w:top w:val="single" w:color="D9DCE6" w:sz="4"/>
-              <w:left w:val="single" w:color="D9DCE6" w:sz="4"/>
-              <w:bottom w:val="single" w:color="D9DCE6" w:sz="4"/>
-              <w:right w:val="single" w:color="D9DCE6" w:sz="4"/>
-            </w:tcBorders>
-            <w:tcMar>
-              <w:top w:type="dxa" w:w="70"/>
-              <w:left w:type="dxa" w:w="110"/>
-              <w:bottom w:type="dxa" w:w="70"/>
-              <w:right w:type="dxa" w:w="110"/>
-            </w:tcMar>
-          </w:tcPr>
-          <w:p>
-            <w:r>
-              <w:rPr>
-                <w:b w:val="false"/>
-                <w:bCs w:val="false"/>
-                <w:sz w:val="19"/>
-                <w:szCs w:val="19"/>
-              </w:rPr>
-              <w:t xml:space="preserve">B</w:t>
-            </w:r>
-          </w:p>
-        </w:tc>
-        <w:tc>
-          <w:tcPr>
-            <w:tcW w:type="dxa" w:w="3010"/>
-            <w:tcBorders>
-              <w:top w:val="single" w:color="D9DCE6" w:sz="4"/>
-              <w:left w:val="single" w:color="D9DCE6" w:sz="4"/>
-              <w:bottom w:val="single" w:color="D9DCE6" w:sz="4"/>
-              <w:right w:val="single" w:color="D9DCE6" w:sz="4"/>
-            </w:tcBorders>
-            <w:tcMar>
-              <w:top w:type="dxa" w:w="70"/>
-              <w:left w:type="dxa" w:w="110"/>
-              <w:bottom w:type="dxa" w:w="70"/>
-              <w:right w:type="dxa" w:w="110"/>
-            </w:tcMar>
-          </w:tcPr>
-          <w:p>
-            <w:r>
-              <w:rPr>
-                <w:b w:val="false"/>
-                <w:bCs w:val="false"/>
-                <w:sz w:val="19"/>
-                <w:szCs w:val="19"/>
-              </w:rPr>
-              <w:t xml:space="preserve">Cisco ISE</w:t>
-            </w:r>
-          </w:p>
-        </w:tc>
-      </w:tr>
-      <w:tr>
-        <w:tc>
-          <w:tcPr>
-            <w:tcW w:type="dxa" w:w="2900"/>
-            <w:tcBorders>
-              <w:top w:val="single" w:color="D9DCE6" w:sz="4"/>
-              <w:left w:val="single" w:color="D9DCE6" w:sz="4"/>
-              <w:bottom w:val="single" w:color="D9DCE6" w:sz="4"/>
-              <w:right w:val="single" w:color="D9DCE6" w:sz="4"/>
-            </w:tcBorders>
-            <w:tcMar>
-              <w:top w:type="dxa" w:w="70"/>
-              <w:left w:type="dxa" w:w="110"/>
-              <w:bottom w:type="dxa" w:w="70"/>
-              <w:right w:type="dxa" w:w="110"/>
-            </w:tcMar>
-          </w:tcPr>
-          <w:p>
-            <w:r>
-              <w:rPr>
-                <w:b/>
-                <w:bCs/>
-                <w:sz w:val="19"/>
-                <w:szCs w:val="19"/>
-              </w:rPr>
-              <w:t xml:space="preserve">Microsoft Sentinel</w:t>
-            </w:r>
-          </w:p>
-        </w:tc>
-        <w:tc>
-          <w:tcPr>
-            <w:tcW w:type="dxa" w:w="1250"/>
-            <w:tcBorders>
-              <w:top w:val="single" w:color="D9DCE6" w:sz="4"/>
-              <w:left w:val="single" w:color="D9DCE6" w:sz="4"/>
-              <w:bottom w:val="single" w:color="D9DCE6" w:sz="4"/>
-              <w:right w:val="single" w:color="D9DCE6" w:sz="4"/>
-            </w:tcBorders>
-            <w:tcMar>
-              <w:top w:type="dxa" w:w="70"/>
-              <w:left w:type="dxa" w:w="110"/>
-              <w:bottom w:type="dxa" w:w="70"/>
-              <w:right w:type="dxa" w:w="110"/>
-            </w:tcMar>
-          </w:tcPr>
-          <w:p>
-            <w:r>
-              <w:rPr>
-                <w:b w:val="false"/>
-                <w:bCs w:val="false"/>
-                <w:sz w:val="19"/>
-                <w:szCs w:val="19"/>
-              </w:rPr>
-              <w:t xml:space="preserve">Long tail</w:t>
-            </w:r>
-          </w:p>
-        </w:tc>
-        <w:tc>
-          <w:tcPr>
-            <w:tcW w:type="dxa" w:w="1300"/>
-            <w:tcBorders>
-              <w:top w:val="single" w:color="D9DCE6" w:sz="4"/>
-              <w:left w:val="single" w:color="D9DCE6" w:sz="4"/>
-              <w:bottom w:val="single" w:color="D9DCE6" w:sz="4"/>
-              <w:right w:val="single" w:color="D9DCE6" w:sz="4"/>
-            </w:tcBorders>
-            <w:tcMar>
-              <w:top w:type="dxa" w:w="70"/>
-              <w:left w:type="dxa" w:w="110"/>
-              <w:bottom w:type="dxa" w:w="70"/>
-              <w:right w:type="dxa" w:w="110"/>
-            </w:tcMar>
-          </w:tcPr>
-          <w:p>
-            <w:r>
-              <w:rPr>
-                <w:b w:val="false"/>
-                <w:bCs w:val="false"/>
-                <w:sz w:val="19"/>
-                <w:szCs w:val="19"/>
-              </w:rPr>
-              <w:t xml:space="preserve">Informativa</w:t>
-            </w:r>
-          </w:p>
-        </w:tc>
-        <w:tc>
-          <w:tcPr>
-            <w:tcW w:type="dxa" w:w="900"/>
-            <w:tcBorders>
-              <w:top w:val="single" w:color="D9DCE6" w:sz="4"/>
-              <w:left w:val="single" w:color="D9DCE6" w:sz="4"/>
-              <w:bottom w:val="single" w:color="D9DCE6" w:sz="4"/>
-              <w:right w:val="single" w:color="D9DCE6" w:sz="4"/>
-            </w:tcBorders>
-            <w:tcMar>
-              <w:top w:type="dxa" w:w="70"/>
-              <w:left w:type="dxa" w:w="110"/>
-              <w:bottom w:type="dxa" w:w="70"/>
-              <w:right w:type="dxa" w:w="110"/>
-            </w:tcMar>
-          </w:tcPr>
-          <w:p>
-            <w:r>
-              <w:rPr>
-                <w:b w:val="false"/>
-                <w:bCs w:val="false"/>
-                <w:sz w:val="19"/>
-                <w:szCs w:val="19"/>
-              </w:rPr>
-              <w:t xml:space="preserve">B</w:t>
-            </w:r>
-          </w:p>
-        </w:tc>
-        <w:tc>
-          <w:tcPr>
-            <w:tcW w:type="dxa" w:w="3010"/>
-            <w:tcBorders>
-              <w:top w:val="single" w:color="D9DCE6" w:sz="4"/>
-              <w:left w:val="single" w:color="D9DCE6" w:sz="4"/>
-              <w:bottom w:val="single" w:color="D9DCE6" w:sz="4"/>
-              <w:right w:val="single" w:color="D9DCE6" w:sz="4"/>
-            </w:tcBorders>
-            <w:tcMar>
-              <w:top w:type="dxa" w:w="70"/>
-              <w:left w:type="dxa" w:w="110"/>
-              <w:bottom w:type="dxa" w:w="70"/>
-              <w:right w:type="dxa" w:w="110"/>
-            </w:tcMar>
-          </w:tcPr>
-          <w:p>
-            <w:r>
-              <w:rPr>
-                <w:b w:val="false"/>
-                <w:bCs w:val="false"/>
-                <w:sz w:val="19"/>
-                <w:szCs w:val="19"/>
-              </w:rPr>
-              <w:t xml:space="preserve">Cisco Secure Firewall</w:t>
-            </w:r>
-          </w:p>
-        </w:tc>
-      </w:tr>
-    </w:tbl>
-    <w:p>
-      <w:pPr>
-        <w:spacing w:after="60"/>
-      </w:pPr>
-    </w:p>
-    <w:p>
-      <w:pPr>
-        <w:pStyle w:val="Heading2"/>
-      </w:pPr>
-      <w:r>
-        <w:t xml:space="preserve">4. Colaboración</w:t>
+        <w:t xml:space="preserve">3. Colaboración</w:t>
       </w:r>
     </w:p>
     <w:p>
@@ -12166,7 +12351,7 @@
         <w:pStyle w:val="Heading2"/>
       </w:pPr>
       <w:r>
-        <w:t xml:space="preserve">5. Inteligencia Artificial (IA)</w:t>
+        <w:t xml:space="preserve">4. Datacenter (Infraestructura)</w:t>
       </w:r>
     </w:p>
     <w:p>
@@ -12181,7 +12366,7 @@
         <w:t xml:space="preserve">Página: </w:t>
       </w:r>
       <w:r>
-        <w:t xml:space="preserve">soluciones.html#inteligencia-artificial</w:t>
+        <w:t xml:space="preserve">soluciones.html#datacenter</w:t>
       </w:r>
       <w:r>
         <w:rPr>
@@ -12191,7 +12376,7 @@
         <w:t xml:space="preserve">   ·   Objetivo: </w:t>
       </w:r>
       <w:r>
-        <w:t xml:space="preserve">Posicionarnos temprano en seguridad para IA, un tema con poca competencia en español.</w:t>
+        <w:t xml:space="preserve">Captar la demanda de renovación y modernización de centros de datos para la nube híbrida.</w:t>
       </w:r>
     </w:p>
     <w:tbl>
@@ -12393,7 +12578,7 @@
                 <w:sz w:val="19"/>
                 <w:szCs w:val="19"/>
               </w:rPr>
-              <w:t xml:space="preserve">seguridad para inteligencia artificial</w:t>
+              <w:t xml:space="preserve">modernización de datacenter</w:t>
             </w:r>
           </w:p>
         </w:tc>
@@ -12535,7 +12720,7 @@
                 <w:sz w:val="19"/>
                 <w:szCs w:val="19"/>
               </w:rPr>
-              <w:t xml:space="preserve">Cisco AI Defense</w:t>
+              <w:t xml:space="preserve">renovación de datacenter</w:t>
             </w:r>
           </w:p>
         </w:tc>
@@ -12563,7 +12748,7 @@
                 <w:sz w:val="19"/>
                 <w:szCs w:val="19"/>
               </w:rPr>
-              <w:t xml:space="preserve">Producto</w:t>
+              <w:t xml:space="preserve">Principal</w:t>
             </w:r>
           </w:p>
         </w:tc>
@@ -12647,7 +12832,7 @@
                 <w:sz w:val="19"/>
                 <w:szCs w:val="19"/>
               </w:rPr>
-              <w:t xml:space="preserve">Cisco AI Defense</w:t>
+              <w:t xml:space="preserve">Datacenter Cisco</w:t>
             </w:r>
           </w:p>
         </w:tc>
@@ -12677,7 +12862,7 @@
                 <w:sz w:val="19"/>
                 <w:szCs w:val="19"/>
               </w:rPr>
-              <w:t xml:space="preserve">adopción responsable de IA</w:t>
+              <w:t xml:space="preserve">centro de datos híbrido</w:t>
             </w:r>
           </w:p>
         </w:tc>
@@ -12733,7 +12918,7 @@
                 <w:sz w:val="19"/>
                 <w:szCs w:val="19"/>
               </w:rPr>
-              <w:t xml:space="preserve">Informativa</w:t>
+              <w:t xml:space="preserve">Comercial</w:t>
             </w:r>
           </w:p>
         </w:tc>
@@ -12789,7 +12974,7 @@
                 <w:sz w:val="19"/>
                 <w:szCs w:val="19"/>
               </w:rPr>
-              <w:t xml:space="preserve">Intro del área</w:t>
+              <w:t xml:space="preserve">Datacenter Cisco</w:t>
             </w:r>
           </w:p>
         </w:tc>
@@ -12819,7 +13004,7 @@
                 <w:sz w:val="19"/>
                 <w:szCs w:val="19"/>
               </w:rPr>
-              <w:t xml:space="preserve">inventario de activos de IA</w:t>
+              <w:t xml:space="preserve">nube híbrida</w:t>
             </w:r>
           </w:p>
         </w:tc>
@@ -12847,7 +13032,7 @@
                 <w:sz w:val="19"/>
                 <w:szCs w:val="19"/>
               </w:rPr>
-              <w:t xml:space="preserve">Long tail</w:t>
+              <w:t xml:space="preserve">Secundaria</w:t>
             </w:r>
           </w:p>
         </w:tc>
@@ -12931,7 +13116,7 @@
                 <w:sz w:val="19"/>
                 <w:szCs w:val="19"/>
               </w:rPr>
-              <w:t xml:space="preserve">Intro y Cisco AI Defense</w:t>
+              <w:t xml:space="preserve">H2 del área</w:t>
             </w:r>
           </w:p>
         </w:tc>
@@ -12961,7 +13146,7 @@
                 <w:sz w:val="19"/>
                 <w:szCs w:val="19"/>
               </w:rPr>
-              <w:t xml:space="preserve">validación de modelos</w:t>
+              <w:t xml:space="preserve">servidores Cisco UCS</w:t>
             </w:r>
           </w:p>
         </w:tc>
@@ -12989,7 +13174,7 @@
                 <w:sz w:val="19"/>
                 <w:szCs w:val="19"/>
               </w:rPr>
-              <w:t xml:space="preserve">Long tail</w:t>
+              <w:t xml:space="preserve">Producto</w:t>
             </w:r>
           </w:p>
         </w:tc>
@@ -13017,7 +13202,7 @@
                 <w:sz w:val="19"/>
                 <w:szCs w:val="19"/>
               </w:rPr>
-              <w:t xml:space="preserve">Informativa</w:t>
+              <w:t xml:space="preserve">Comercial</w:t>
             </w:r>
           </w:p>
         </w:tc>
@@ -13073,7 +13258,7 @@
                 <w:sz w:val="19"/>
                 <w:szCs w:val="19"/>
               </w:rPr>
-              <w:t xml:space="preserve">Intro y Cisco AI Defense</w:t>
+              <w:t xml:space="preserve">Datacenter Cisco</w:t>
             </w:r>
           </w:p>
         </w:tc>
@@ -13103,7 +13288,7 @@
                 <w:sz w:val="19"/>
                 <w:szCs w:val="19"/>
               </w:rPr>
-              <w:t xml:space="preserve">Azure AI Foundry</w:t>
+              <w:t xml:space="preserve">Cisco Nexus</w:t>
             </w:r>
           </w:p>
         </w:tc>
@@ -13131,7 +13316,7 @@
                 <w:sz w:val="19"/>
                 <w:szCs w:val="19"/>
               </w:rPr>
-              <w:t xml:space="preserve">Long tail</w:t>
+              <w:t xml:space="preserve">Producto</w:t>
             </w:r>
           </w:p>
         </w:tc>
@@ -13159,7 +13344,7 @@
                 <w:sz w:val="19"/>
                 <w:szCs w:val="19"/>
               </w:rPr>
-              <w:t xml:space="preserve">Informativa</w:t>
+              <w:t xml:space="preserve">Comercial</w:t>
             </w:r>
           </w:p>
         </w:tc>
@@ -13187,7 +13372,7 @@
                 <w:sz w:val="19"/>
                 <w:szCs w:val="19"/>
               </w:rPr>
-              <w:t xml:space="preserve">B</w:t>
+              <w:t xml:space="preserve">C</w:t>
             </w:r>
           </w:p>
         </w:tc>
@@ -13215,149 +13400,7 @@
                 <w:sz w:val="19"/>
                 <w:szCs w:val="19"/>
               </w:rPr>
-              <w:t xml:space="preserve">Cisco AI Defense</w:t>
-            </w:r>
-          </w:p>
-        </w:tc>
-      </w:tr>
-      <w:tr>
-        <w:tc>
-          <w:tcPr>
-            <w:tcW w:type="dxa" w:w="2900"/>
-            <w:tcBorders>
-              <w:top w:val="single" w:color="D9DCE6" w:sz="4"/>
-              <w:left w:val="single" w:color="D9DCE6" w:sz="4"/>
-              <w:bottom w:val="single" w:color="D9DCE6" w:sz="4"/>
-              <w:right w:val="single" w:color="D9DCE6" w:sz="4"/>
-            </w:tcBorders>
-            <w:tcMar>
-              <w:top w:type="dxa" w:w="70"/>
-              <w:left w:type="dxa" w:w="110"/>
-              <w:bottom w:type="dxa" w:w="70"/>
-              <w:right w:type="dxa" w:w="110"/>
-            </w:tcMar>
-          </w:tcPr>
-          <w:p>
-            <w:r>
-              <w:rPr>
-                <w:b/>
-                <w:bCs/>
-                <w:sz w:val="19"/>
-                <w:szCs w:val="19"/>
-              </w:rPr>
-              <w:t xml:space="preserve">Copilot Studio</w:t>
-            </w:r>
-          </w:p>
-        </w:tc>
-        <w:tc>
-          <w:tcPr>
-            <w:tcW w:type="dxa" w:w="1250"/>
-            <w:tcBorders>
-              <w:top w:val="single" w:color="D9DCE6" w:sz="4"/>
-              <w:left w:val="single" w:color="D9DCE6" w:sz="4"/>
-              <w:bottom w:val="single" w:color="D9DCE6" w:sz="4"/>
-              <w:right w:val="single" w:color="D9DCE6" w:sz="4"/>
-            </w:tcBorders>
-            <w:tcMar>
-              <w:top w:type="dxa" w:w="70"/>
-              <w:left w:type="dxa" w:w="110"/>
-              <w:bottom w:type="dxa" w:w="70"/>
-              <w:right w:type="dxa" w:w="110"/>
-            </w:tcMar>
-          </w:tcPr>
-          <w:p>
-            <w:r>
-              <w:rPr>
-                <w:b w:val="false"/>
-                <w:bCs w:val="false"/>
-                <w:sz w:val="19"/>
-                <w:szCs w:val="19"/>
-              </w:rPr>
-              <w:t xml:space="preserve">Long tail</w:t>
-            </w:r>
-          </w:p>
-        </w:tc>
-        <w:tc>
-          <w:tcPr>
-            <w:tcW w:type="dxa" w:w="1300"/>
-            <w:tcBorders>
-              <w:top w:val="single" w:color="D9DCE6" w:sz="4"/>
-              <w:left w:val="single" w:color="D9DCE6" w:sz="4"/>
-              <w:bottom w:val="single" w:color="D9DCE6" w:sz="4"/>
-              <w:right w:val="single" w:color="D9DCE6" w:sz="4"/>
-            </w:tcBorders>
-            <w:tcMar>
-              <w:top w:type="dxa" w:w="70"/>
-              <w:left w:type="dxa" w:w="110"/>
-              <w:bottom w:type="dxa" w:w="70"/>
-              <w:right w:type="dxa" w:w="110"/>
-            </w:tcMar>
-          </w:tcPr>
-          <w:p>
-            <w:r>
-              <w:rPr>
-                <w:b w:val="false"/>
-                <w:bCs w:val="false"/>
-                <w:sz w:val="19"/>
-                <w:szCs w:val="19"/>
-              </w:rPr>
-              <w:t xml:space="preserve">Informativa</w:t>
-            </w:r>
-          </w:p>
-        </w:tc>
-        <w:tc>
-          <w:tcPr>
-            <w:tcW w:type="dxa" w:w="900"/>
-            <w:tcBorders>
-              <w:top w:val="single" w:color="D9DCE6" w:sz="4"/>
-              <w:left w:val="single" w:color="D9DCE6" w:sz="4"/>
-              <w:bottom w:val="single" w:color="D9DCE6" w:sz="4"/>
-              <w:right w:val="single" w:color="D9DCE6" w:sz="4"/>
-            </w:tcBorders>
-            <w:tcMar>
-              <w:top w:type="dxa" w:w="70"/>
-              <w:left w:type="dxa" w:w="110"/>
-              <w:bottom w:type="dxa" w:w="70"/>
-              <w:right w:type="dxa" w:w="110"/>
-            </w:tcMar>
-          </w:tcPr>
-          <w:p>
-            <w:r>
-              <w:rPr>
-                <w:b w:val="false"/>
-                <w:bCs w:val="false"/>
-                <w:sz w:val="19"/>
-                <w:szCs w:val="19"/>
-              </w:rPr>
-              <w:t xml:space="preserve">C</w:t>
-            </w:r>
-          </w:p>
-        </w:tc>
-        <w:tc>
-          <w:tcPr>
-            <w:tcW w:type="dxa" w:w="3010"/>
-            <w:tcBorders>
-              <w:top w:val="single" w:color="D9DCE6" w:sz="4"/>
-              <w:left w:val="single" w:color="D9DCE6" w:sz="4"/>
-              <w:bottom w:val="single" w:color="D9DCE6" w:sz="4"/>
-              <w:right w:val="single" w:color="D9DCE6" w:sz="4"/>
-            </w:tcBorders>
-            <w:tcMar>
-              <w:top w:type="dxa" w:w="70"/>
-              <w:left w:type="dxa" w:w="110"/>
-              <w:bottom w:type="dxa" w:w="70"/>
-              <w:right w:type="dxa" w:w="110"/>
-            </w:tcMar>
-          </w:tcPr>
-          <w:p>
-            <w:r>
-              <w:rPr>
-                <w:b w:val="false"/>
-                <w:bCs w:val="false"/>
-                <w:sz w:val="19"/>
-                <w:szCs w:val="19"/>
-              </w:rPr>
-              <w:t xml:space="preserve">Cisco AI Defense</w:t>
+              <w:t xml:space="preserve">Datacenter Cisco</w:t>
             </w:r>
           </w:p>
         </w:tc>
@@ -17181,7 +17224,7 @@
                 <w:sz w:val="19"/>
                 <w:szCs w:val="19"/>
               </w:rPr>
-              <w:t xml:space="preserve">IA</w:t>
+              <w:t xml:space="preserve">Datacenter</w:t>
             </w:r>
           </w:p>
         </w:tc>
@@ -17209,18 +17252,18 @@
                 <w:sz w:val="19"/>
                 <w:szCs w:val="19"/>
               </w:rPr>
-              <w:t xml:space="preserve">Seguridad para IA generativa en la empresa</w:t>
-            </w:r>
-          </w:p>
-          <w:p>
-            <w:r>
-              <w:rPr>
-                <w:b w:val="false"/>
-                <w:bCs w:val="false"/>
-                <w:sz w:val="19"/>
-                <w:szCs w:val="19"/>
-              </w:rPr>
-              <w:t xml:space="preserve">Cómo hacer un inventario de activos de IA</w:t>
+              <w:t xml:space="preserve">Cuándo renovar los servidores y el switching de su centro de datos</w:t>
+            </w:r>
+          </w:p>
+          <w:p>
+            <w:r>
+              <w:rPr>
+                <w:b w:val="false"/>
+                <w:bCs w:val="false"/>
+                <w:sz w:val="19"/>
+                <w:szCs w:val="19"/>
+              </w:rPr>
+              <w:t xml:space="preserve">Datacenter híbrido: cómo conectar su centro de datos con Azure, AWS y Google Cloud</w:t>
             </w:r>
           </w:p>
         </w:tc>
@@ -17248,7 +17291,7 @@
                 <w:sz w:val="19"/>
                 <w:szCs w:val="19"/>
               </w:rPr>
-              <w:t xml:space="preserve">seguridad para inteligencia artificial · inventario de activos de IA</w:t>
+              <w:t xml:space="preserve">modernización de datacenter · renovación de datacenter · centro de datos híbrido</w:t>
             </w:r>
           </w:p>
         </w:tc>
@@ -18441,7 +18484,7 @@
         <w:spacing w:after="60"/>
       </w:pPr>
       <w:r>
-        <w:t xml:space="preserve">Decidir si Cisco AI Defense sigue publicado mientras está en validación.</w:t>
+        <w:t xml:space="preserve">Validar con el equipo técnico los componentes de Datacenter (Cisco UCS, Cisco Nexus) y su ficha en el Modelo de Servicios.</w:t>
       </w:r>
     </w:p>
     <w:p>
@@ -18454,7 +18497,20 @@
         <w:spacing w:after="60"/>
       </w:pPr>
       <w:r>
-        <w:t xml:space="preserve">Decidir si se agrega Datacenter al acelerador y una oferta de renovación de datacenter.</w:t>
+        <w:t xml:space="preserve">Retomar Cisco AI Defense cuando se definan los métodos de despliegue y los SKU.</w:t>
+      </w:r>
+    </w:p>
+    <w:p>
+      <w:pPr>
+        <w:pStyle w:val="ListParagraph"/>
+        <w:numPr>
+          <w:ilvl w:val="0"/>
+          <w:numId w:val="4"/>
+        </w:numPr>
+        <w:spacing w:after="60"/>
+      </w:pPr>
+      <w:r>
+        <w:t xml:space="preserve">Definir el alcance y el precio del servicio de inventario de obsolescencia.</w:t>
       </w:r>
     </w:p>
     <w:sectPr>

</xml_diff>